<commit_message>
Ajustes do retorno da Unilever: 60 dias, inativacao, Nao autorizado, doc v1.1
- Alerta de vencimento agora com 60 dias de antecedencia
- Colaboradores: filtro de vinculo, selo Inativo e inativar/reativar
- Liberador: rotulo 'Nao autorizado' no lugar de campo em branco
- Escopo v1.1 (responsivo mobile/tablet/desktop, fluxo ASO, auditoria)

Co-Authored-By: Claude Opus 4.8 <noreply@anthropic.com>
</commit_message>
<xml_diff>
--- a/Escopo_Passaporte_de_Seguranca_Unilever.docx
+++ b/Escopo_Passaporte_de_Seguranca_Unilever.docx
@@ -141,7 +141,7 @@
           <w:sz w:val="20"/>
           <w:szCs w:val="20"/>
         </w:rPr>
-        <w:t xml:space="preserve">Versão 1.0  ·  27 de agosto de 2026</w:t>
+        <w:t xml:space="preserve">Versão 1.1  ·  28 de agosto de 2026</w:t>
       </w:r>
     </w:p>
     <w:p>
@@ -168,7 +168,7 @@
     </w:p>
     <w:tbl>
       <w:tblPr>
-        <w:tblW w:type="dxa" w:w="9020"/>
+        <w:tblW w:type="dxa" w:w="8220"/>
         <w:tblBorders>
           <w:top w:val="single" w:color="E6E9F2" w:sz="2"/>
           <w:left w:val="single" w:color="E6E9F2" w:sz="2"/>
@@ -179,10 +179,10 @@
         </w:tblBorders>
       </w:tblPr>
       <w:tblGrid>
-        <w:gridCol w:w="1200"/>
-        <w:gridCol w:w="1500"/>
-        <w:gridCol w:w="1800"/>
-        <w:gridCol w:w="4520"/>
+        <w:gridCol w:w="1000"/>
+        <w:gridCol w:w="1350"/>
+        <w:gridCol w:w="1600"/>
+        <w:gridCol w:w="4270"/>
       </w:tblGrid>
       <w:tr>
         <w:trPr>
@@ -190,7 +190,7 @@
         </w:trPr>
         <w:tc>
           <w:tcPr>
-            <w:tcW w:type="dxa" w:w="1200"/>
+            <w:tcW w:type="dxa" w:w="1000"/>
             <w:shd w:fill="1F36C7" w:color="auto" w:val="clear"/>
             <w:tcMar>
               <w:top w:type="dxa" w:w="60"/>
@@ -215,7 +215,7 @@
         </w:tc>
         <w:tc>
           <w:tcPr>
-            <w:tcW w:type="dxa" w:w="1500"/>
+            <w:tcW w:type="dxa" w:w="1350"/>
             <w:shd w:fill="1F36C7" w:color="auto" w:val="clear"/>
             <w:tcMar>
               <w:top w:type="dxa" w:w="60"/>
@@ -240,7 +240,7 @@
         </w:tc>
         <w:tc>
           <w:tcPr>
-            <w:tcW w:type="dxa" w:w="1800"/>
+            <w:tcW w:type="dxa" w:w="1600"/>
             <w:shd w:fill="1F36C7" w:color="auto" w:val="clear"/>
             <w:tcMar>
               <w:top w:type="dxa" w:w="60"/>
@@ -265,7 +265,7 @@
         </w:tc>
         <w:tc>
           <w:tcPr>
-            <w:tcW w:type="dxa" w:w="4520"/>
+            <w:tcW w:type="dxa" w:w="4270"/>
             <w:shd w:fill="1F36C7" w:color="auto" w:val="clear"/>
             <w:tcMar>
               <w:top w:type="dxa" w:w="60"/>
@@ -292,7 +292,7 @@
       <w:tr>
         <w:tc>
           <w:tcPr>
-            <w:tcW w:type="dxa" w:w="1200"/>
+            <w:tcW w:type="dxa" w:w="1000"/>
             <w:shd w:fill="FFFFFF" w:color="auto" w:val="clear"/>
             <w:tcMar>
               <w:top w:type="dxa" w:w="50"/>
@@ -318,7 +318,7 @@
         </w:tc>
         <w:tc>
           <w:tcPr>
-            <w:tcW w:type="dxa" w:w="1500"/>
+            <w:tcW w:type="dxa" w:w="1350"/>
             <w:shd w:fill="FFFFFF" w:color="auto" w:val="clear"/>
             <w:tcMar>
               <w:top w:type="dxa" w:w="50"/>
@@ -346,7 +346,7 @@
         </w:tc>
         <w:tc>
           <w:tcPr>
-            <w:tcW w:type="dxa" w:w="1800"/>
+            <w:tcW w:type="dxa" w:w="1600"/>
             <w:shd w:fill="FFFFFF" w:color="auto" w:val="clear"/>
             <w:tcMar>
               <w:top w:type="dxa" w:w="50"/>
@@ -374,7 +374,7 @@
         </w:tc>
         <w:tc>
           <w:tcPr>
-            <w:tcW w:type="dxa" w:w="4520"/>
+            <w:tcW w:type="dxa" w:w="4270"/>
             <w:shd w:fill="FFFFFF" w:color="auto" w:val="clear"/>
             <w:tcMar>
               <w:top w:type="dxa" w:w="50"/>
@@ -397,6 +397,118 @@
                 <w:szCs w:val="18"/>
               </w:rPr>
               <w:t xml:space="preserve">Versão inicial do escopo funcional, baseada na reunião de alinhamento e nos modelos físicos das carteirinhas.</w:t>
+            </w:r>
+          </w:p>
+        </w:tc>
+      </w:tr>
+      <w:tr>
+        <w:tc>
+          <w:tcPr>
+            <w:tcW w:type="dxa" w:w="1000"/>
+            <w:shd w:fill="F4F6FB" w:color="auto" w:val="clear"/>
+            <w:tcMar>
+              <w:top w:type="dxa" w:w="50"/>
+              <w:left w:type="dxa" w:w="90"/>
+              <w:bottom w:type="dxa" w:w="50"/>
+              <w:right w:type="dxa" w:w="90"/>
+            </w:tcMar>
+          </w:tcPr>
+          <w:p>
+            <w:pPr>
+              <w:spacing w:after="0" w:line="250"/>
+            </w:pPr>
+            <w:r>
+              <w:rPr>
+                <w:rFonts w:ascii="Calibri" w:cs="Calibri" w:eastAsia="Calibri" w:hAnsi="Calibri"/>
+                <w:color w:val="23272F"/>
+                <w:sz w:val="18"/>
+                <w:szCs w:val="18"/>
+              </w:rPr>
+              <w:t xml:space="preserve">1.1</w:t>
+            </w:r>
+          </w:p>
+        </w:tc>
+        <w:tc>
+          <w:tcPr>
+            <w:tcW w:type="dxa" w:w="1350"/>
+            <w:shd w:fill="F4F6FB" w:color="auto" w:val="clear"/>
+            <w:tcMar>
+              <w:top w:type="dxa" w:w="50"/>
+              <w:left w:type="dxa" w:w="90"/>
+              <w:bottom w:type="dxa" w:w="50"/>
+              <w:right w:type="dxa" w:w="90"/>
+            </w:tcMar>
+          </w:tcPr>
+          <w:p>
+            <w:pPr>
+              <w:spacing w:after="0" w:line="250"/>
+            </w:pPr>
+            <w:r>
+              <w:rPr>
+                <w:rFonts w:ascii="Calibri" w:cs="Calibri" w:eastAsia="Calibri" w:hAnsi="Calibri"/>
+                <w:b w:val="false"/>
+                <w:bCs w:val="false"/>
+                <w:color w:val="23272F"/>
+                <w:sz w:val="18"/>
+                <w:szCs w:val="18"/>
+              </w:rPr>
+              <w:t xml:space="preserve">28/08/2026</w:t>
+            </w:r>
+          </w:p>
+        </w:tc>
+        <w:tc>
+          <w:tcPr>
+            <w:tcW w:type="dxa" w:w="1600"/>
+            <w:shd w:fill="F4F6FB" w:color="auto" w:val="clear"/>
+            <w:tcMar>
+              <w:top w:type="dxa" w:w="50"/>
+              <w:left w:type="dxa" w:w="90"/>
+              <w:bottom w:type="dxa" w:w="50"/>
+              <w:right w:type="dxa" w:w="90"/>
+            </w:tcMar>
+          </w:tcPr>
+          <w:p>
+            <w:pPr>
+              <w:spacing w:after="0" w:line="250"/>
+            </w:pPr>
+            <w:r>
+              <w:rPr>
+                <w:rFonts w:ascii="Calibri" w:cs="Calibri" w:eastAsia="Calibri" w:hAnsi="Calibri"/>
+                <w:b w:val="false"/>
+                <w:bCs w:val="false"/>
+                <w:color w:val="23272F"/>
+                <w:sz w:val="18"/>
+                <w:szCs w:val="18"/>
+              </w:rPr>
+              <w:t xml:space="preserve">DriveData</w:t>
+            </w:r>
+          </w:p>
+        </w:tc>
+        <w:tc>
+          <w:tcPr>
+            <w:tcW w:type="dxa" w:w="4270"/>
+            <w:shd w:fill="F4F6FB" w:color="auto" w:val="clear"/>
+            <w:tcMar>
+              <w:top w:type="dxa" w:w="50"/>
+              <w:left w:type="dxa" w:w="90"/>
+              <w:bottom w:type="dxa" w:w="50"/>
+              <w:right w:type="dxa" w:w="90"/>
+            </w:tcMar>
+          </w:tcPr>
+          <w:p>
+            <w:pPr>
+              <w:spacing w:after="0" w:line="250"/>
+            </w:pPr>
+            <w:r>
+              <w:rPr>
+                <w:rFonts w:ascii="Calibri" w:cs="Calibri" w:eastAsia="Calibri" w:hAnsi="Calibri"/>
+                <w:b w:val="false"/>
+                <w:bCs w:val="false"/>
+                <w:color w:val="23272F"/>
+                <w:sz w:val="18"/>
+                <w:szCs w:val="18"/>
+              </w:rPr>
+              <w:t xml:space="preserve">Ajustes após retorno da Unilever: visualização em celular, tablet e computador; alerta de vencimento em 60 dias; inativação de colaboradores; rótulo "Não autorizado"; fluxo de emissão e de ASO.</w:t>
             </w:r>
           </w:p>
         </w:tc>
@@ -829,6 +941,31 @@
           <w:szCs w:val="21"/>
         </w:rPr>
         <w:t xml:space="preserve">O mesmo documento digital que a equipe emite é o que o colaborador visualiza pelo QR. A carteirinha traz um selo de autenticação e um código de verificação, o que impede o uso de documento adulterado ou vencido.</w:t>
+      </w:r>
+    </w:p>
+    <w:p>
+      <w:pPr>
+        <w:spacing w:after="120" w:line="276"/>
+      </w:pPr>
+      <w:r>
+        <w:rPr>
+          <w:rFonts w:ascii="Calibri" w:cs="Calibri" w:eastAsia="Calibri" w:hAnsi="Calibri"/>
+          <w:b/>
+          <w:bCs/>
+          <w:color w:val="23272F"/>
+          <w:sz w:val="21"/>
+          <w:szCs w:val="21"/>
+        </w:rPr>
+        <w:t xml:space="preserve">Responsividade: </w:t>
+      </w:r>
+      <w:r>
+        <w:rPr>
+          <w:rFonts w:ascii="Calibri" w:cs="Calibri" w:eastAsia="Calibri" w:hAnsi="Calibri"/>
+          <w:color w:val="23272F"/>
+          <w:sz w:val="21"/>
+          <w:szCs w:val="21"/>
+        </w:rPr>
+        <w:t xml:space="preserve">o sistema se adapta a celular, tablet e computador. A consulta do colaborador é otimizada para celular, e a gestão funciona bem em telas maiores, que tendem a ser o uso mais comum da equipe.</w:t>
       </w:r>
     </w:p>
     <w:p>
@@ -984,7 +1121,7 @@
                 <w:sz w:val="18"/>
                 <w:szCs w:val="18"/>
               </w:rPr>
-              <w:t xml:space="preserve">Administrador / Coordenação de Treinamentos</w:t>
+              <w:t xml:space="preserve">Coordenação de Treinamentos</w:t>
             </w:r>
           </w:p>
         </w:tc>
@@ -1040,7 +1177,7 @@
                 <w:sz w:val="18"/>
                 <w:szCs w:val="18"/>
               </w:rPr>
-              <w:t xml:space="preserve">Gerencia treinamentos, colaboradores, regras de validade e integrações. Visão completa de conformidade.</w:t>
+              <w:t xml:space="preserve">Emite e valida carteirinhas. Gerencia treinamentos, colaboradores, regras de validade e integrações. Visão completa de conformidade.</w:t>
             </w:r>
           </w:p>
         </w:tc>
@@ -1208,7 +1345,7 @@
                 <w:sz w:val="18"/>
                 <w:szCs w:val="18"/>
               </w:rPr>
-              <w:t xml:space="preserve">Gerencia a validade do ASO e o visto de saúde.</w:t>
+              <w:t xml:space="preserve">Gerencia a validade do ASO.</w:t>
             </w:r>
           </w:p>
         </w:tc>
@@ -1298,6 +1435,128 @@
         </w:tc>
       </w:tr>
     </w:tbl>
+    <w:p>
+      <w:pPr>
+        <w:pStyle w:val="Heading2"/>
+        <w:spacing w:after="100" w:before="220"/>
+      </w:pPr>
+      <w:r>
+        <w:rPr>
+          <w:rFonts w:ascii="Calibri" w:cs="Calibri" w:eastAsia="Calibri" w:hAnsi="Calibri"/>
+          <w:b/>
+          <w:bCs/>
+          <w:color w:val="0E1424"/>
+          <w:sz w:val="24"/>
+          <w:szCs w:val="24"/>
+        </w:rPr>
+        <w:t xml:space="preserve">Fluxo de emissão</w:t>
+      </w:r>
+    </w:p>
+    <w:p>
+      <w:pPr>
+        <w:spacing w:after="120" w:before="0" w:line="276"/>
+      </w:pPr>
+      <w:r>
+        <w:rPr>
+          <w:rFonts w:ascii="Calibri" w:cs="Calibri" w:eastAsia="Calibri" w:hAnsi="Calibri"/>
+          <w:color w:val="23272F"/>
+          <w:sz w:val="21"/>
+          <w:szCs w:val="21"/>
+        </w:rPr>
+        <w:t xml:space="preserve">Tanto a Coordenação de Treinamentos quanto a equipe de SHE emitem e validam carteirinhas. A emissão consome os dados já existentes nas fontes, sem redigitação.</w:t>
+      </w:r>
+    </w:p>
+    <w:p>
+      <w:pPr>
+        <w:pStyle w:val="Heading2"/>
+        <w:spacing w:after="100" w:before="220"/>
+      </w:pPr>
+      <w:r>
+        <w:rPr>
+          <w:rFonts w:ascii="Calibri" w:cs="Calibri" w:eastAsia="Calibri" w:hAnsi="Calibri"/>
+          <w:b/>
+          <w:bCs/>
+          <w:color w:val="0E1424"/>
+          <w:sz w:val="24"/>
+          <w:szCs w:val="24"/>
+        </w:rPr>
+        <w:t xml:space="preserve">Validação do ASO</w:t>
+      </w:r>
+    </w:p>
+    <w:p>
+      <w:pPr>
+        <w:spacing w:after="120" w:before="0" w:line="276"/>
+      </w:pPr>
+      <w:r>
+        <w:rPr>
+          <w:rFonts w:ascii="Calibri" w:cs="Calibri" w:eastAsia="Calibri" w:hAnsi="Calibri"/>
+          <w:color w:val="23272F"/>
+          <w:sz w:val="21"/>
+          <w:szCs w:val="21"/>
+        </w:rPr>
+        <w:t xml:space="preserve">A validade do ASO vem da base de saúde. Não há assinatura manuscrita: o selo digital da carteirinha substitui a assinatura, como já ocorre em outras fábricas da Unilever. Dois cenários possíveis, a alinhar com o time de Saúde:</w:t>
+      </w:r>
+    </w:p>
+    <w:p>
+      <w:pPr>
+        <w:pStyle w:val="ListParagraph"/>
+        <w:numPr>
+          <w:ilvl w:val="0"/>
+          <w:numId w:val="1"/>
+        </w:numPr>
+        <w:spacing w:after="60" w:line="270"/>
+      </w:pPr>
+      <w:r>
+        <w:rPr>
+          <w:rFonts w:ascii="Calibri" w:cs="Calibri" w:eastAsia="Calibri" w:hAnsi="Calibri"/>
+          <w:b/>
+          <w:bCs/>
+          <w:color w:val="23272F"/>
+          <w:sz w:val="21"/>
+          <w:szCs w:val="21"/>
+        </w:rPr>
+        <w:t xml:space="preserve">Integração automática (recomendado): </w:t>
+      </w:r>
+      <w:r>
+        <w:rPr>
+          <w:rFonts w:ascii="Calibri" w:cs="Calibri" w:eastAsia="Calibri" w:hAnsi="Calibri"/>
+          <w:color w:val="23272F"/>
+          <w:sz w:val="21"/>
+          <w:szCs w:val="21"/>
+        </w:rPr>
+        <w:t xml:space="preserve">a validade do ASO é lida direto do sistema de saúde (SOC). Nenhuma ação manual é necessária.</w:t>
+      </w:r>
+    </w:p>
+    <w:p>
+      <w:pPr>
+        <w:pStyle w:val="ListParagraph"/>
+        <w:numPr>
+          <w:ilvl w:val="0"/>
+          <w:numId w:val="1"/>
+        </w:numPr>
+        <w:spacing w:after="60" w:line="270"/>
+      </w:pPr>
+      <w:r>
+        <w:rPr>
+          <w:rFonts w:ascii="Calibri" w:cs="Calibri" w:eastAsia="Calibri" w:hAnsi="Calibri"/>
+          <w:b/>
+          <w:bCs/>
+          <w:color w:val="23272F"/>
+          <w:sz w:val="21"/>
+          <w:szCs w:val="21"/>
+        </w:rPr>
+        <w:t xml:space="preserve">Atualização manual: </w:t>
+      </w:r>
+      <w:r>
+        <w:rPr>
+          <w:rFonts w:ascii="Calibri" w:cs="Calibri" w:eastAsia="Calibri" w:hAnsi="Calibri"/>
+          <w:color w:val="23272F"/>
+          <w:sz w:val="21"/>
+          <w:szCs w:val="21"/>
+        </w:rPr>
+        <w:t xml:space="preserve">enquanto não houver integração, a equipe de Saúde mantém a validade do ASO por um campo próprio no sistema.</w:t>
+      </w:r>
+    </w:p>
     <w:p>
       <w:pPr>
         <w:pStyle w:val="Heading1"/>
@@ -2306,7 +2565,23 @@
           <w:sz w:val="21"/>
           <w:szCs w:val="21"/>
         </w:rPr>
-        <w:t xml:space="preserve">Atividade autorizada exibe a data "Até" e o visto de SHE. Atividade sem habilitação aparece em branco, como no documento físico.</w:t>
+        <w:t xml:space="preserve">Atividade autorizada exibe a data "Até" e o visto de SHE. Atividade sem habilitação exibe o rótulo "Não autorizado", em vez de ficar em branco.</w:t>
+      </w:r>
+    </w:p>
+    <w:p>
+      <w:pPr>
+        <w:spacing w:after="120" w:before="0" w:line="276"/>
+      </w:pPr>
+      <w:r>
+        <w:rPr>
+          <w:rFonts w:ascii="Calibri" w:cs="Calibri" w:eastAsia="Calibri" w:hAnsi="Calibri"/>
+          <w:i/>
+          <w:iCs/>
+          <w:color w:val="5B6478"/>
+          <w:sz w:val="21"/>
+          <w:szCs w:val="21"/>
+        </w:rPr>
+        <w:t xml:space="preserve">A lista de temas acima pode sofrer atualizações pontuais por parte da Unilever, mantendo aproximadamente a mesma quantidade de itens.</w:t>
       </w:r>
     </w:p>
     <w:p>
@@ -2454,7 +2729,7 @@
           <w:sz w:val="21"/>
           <w:szCs w:val="21"/>
         </w:rPr>
-        <w:t xml:space="preserve">Lista de colaboradores com busca por nome ou RE e filtros por área, turno e situação.</w:t>
+        <w:t xml:space="preserve">Lista de colaboradores com busca por nome ou RE e filtros por área, turno, situação e vínculo (ativo ou inativo).</w:t>
       </w:r>
     </w:p>
     <w:p>
@@ -2493,6 +2768,36 @@
           <w:szCs w:val="21"/>
         </w:rPr>
         <w:t xml:space="preserve">Ações de reemissão e envio do link da carteirinha.</w:t>
+      </w:r>
+    </w:p>
+    <w:p>
+      <w:pPr>
+        <w:pStyle w:val="ListParagraph"/>
+        <w:numPr>
+          <w:ilvl w:val="0"/>
+          <w:numId w:val="1"/>
+        </w:numPr>
+        <w:spacing w:after="60" w:line="270"/>
+      </w:pPr>
+      <w:r>
+        <w:rPr>
+          <w:rFonts w:ascii="Calibri" w:cs="Calibri" w:eastAsia="Calibri" w:hAnsi="Calibri"/>
+          <w:b/>
+          <w:bCs/>
+          <w:color w:val="23272F"/>
+          <w:sz w:val="21"/>
+          <w:szCs w:val="21"/>
+        </w:rPr>
+        <w:t xml:space="preserve">Desligamento por inativação: </w:t>
+      </w:r>
+      <w:r>
+        <w:rPr>
+          <w:rFonts w:ascii="Calibri" w:cs="Calibri" w:eastAsia="Calibri" w:hAnsi="Calibri"/>
+          <w:color w:val="23272F"/>
+          <w:sz w:val="21"/>
+          <w:szCs w:val="21"/>
+        </w:rPr>
+        <w:t xml:space="preserve">ao sair, o colaborador é inativado, não excluído. Ele sai das listas ativas e da consulta por RE, mas o histórico é preservado para auditoria. Nada é apagado da base. Um colaborador inativado pode ser reativado.</w:t>
       </w:r>
     </w:p>
     <w:p>
@@ -2774,40 +3079,54 @@
     </w:p>
     <w:p>
       <w:pPr>
-        <w:pStyle w:val="ListParagraph"/>
-        <w:numPr>
-          <w:ilvl w:val="0"/>
-          <w:numId w:val="1"/>
-        </w:numPr>
-        <w:spacing w:after="60" w:line="270"/>
-      </w:pPr>
-      <w:r>
-        <w:rPr>
-          <w:rFonts w:ascii="Calibri" w:cs="Calibri" w:eastAsia="Calibri" w:hAnsi="Calibri"/>
-          <w:color w:val="23272F"/>
-          <w:sz w:val="21"/>
-          <w:szCs w:val="21"/>
-        </w:rPr>
-        <w:t xml:space="preserve">Registro das ações relevantes do sistema (emissão, sincronização, sinalização de vencimento).</w:t>
-      </w:r>
-    </w:p>
-    <w:p>
-      <w:pPr>
-        <w:pStyle w:val="ListParagraph"/>
-        <w:numPr>
-          <w:ilvl w:val="0"/>
-          <w:numId w:val="1"/>
-        </w:numPr>
-        <w:spacing w:after="60" w:line="270"/>
-      </w:pPr>
-      <w:r>
-        <w:rPr>
-          <w:rFonts w:ascii="Calibri" w:cs="Calibri" w:eastAsia="Calibri" w:hAnsi="Calibri"/>
-          <w:color w:val="23272F"/>
-          <w:sz w:val="21"/>
-          <w:szCs w:val="21"/>
-        </w:rPr>
-        <w:t xml:space="preserve">Log com data, usuário, ação e alvo.</w:t>
+        <w:spacing w:after="120" w:before="0" w:line="276"/>
+      </w:pPr>
+      <w:r>
+        <w:rPr>
+          <w:rFonts w:ascii="Calibri" w:cs="Calibri" w:eastAsia="Calibri" w:hAnsi="Calibri"/>
+          <w:color w:val="23272F"/>
+          <w:sz w:val="21"/>
+          <w:szCs w:val="21"/>
+        </w:rPr>
+        <w:t xml:space="preserve">A auditoria é o registro de quem fez o quê e quando no sistema. Serve para garantir conformidade e rastreabilidade: em uma fiscalização ou investigação, é possível comprovar que a carteirinha foi emitida com base em dados válidos e saber quem realizou cada ação.</w:t>
+      </w:r>
+    </w:p>
+    <w:p>
+      <w:pPr>
+        <w:pStyle w:val="ListParagraph"/>
+        <w:numPr>
+          <w:ilvl w:val="0"/>
+          <w:numId w:val="1"/>
+        </w:numPr>
+        <w:spacing w:after="60" w:line="270"/>
+      </w:pPr>
+      <w:r>
+        <w:rPr>
+          <w:rFonts w:ascii="Calibri" w:cs="Calibri" w:eastAsia="Calibri" w:hAnsi="Calibri"/>
+          <w:color w:val="23272F"/>
+          <w:sz w:val="21"/>
+          <w:szCs w:val="21"/>
+        </w:rPr>
+        <w:t xml:space="preserve">Registro das ações relevantes (emissão de carteirinha, alteração de treinamento, sincronização de base, sinalização de vencimento).</w:t>
+      </w:r>
+    </w:p>
+    <w:p>
+      <w:pPr>
+        <w:pStyle w:val="ListParagraph"/>
+        <w:numPr>
+          <w:ilvl w:val="0"/>
+          <w:numId w:val="1"/>
+        </w:numPr>
+        <w:spacing w:after="60" w:line="270"/>
+      </w:pPr>
+      <w:r>
+        <w:rPr>
+          <w:rFonts w:ascii="Calibri" w:cs="Calibri" w:eastAsia="Calibri" w:hAnsi="Calibri"/>
+          <w:color w:val="23272F"/>
+          <w:sz w:val="21"/>
+          <w:szCs w:val="21"/>
+        </w:rPr>
+        <w:t xml:space="preserve">Log com data, usuário, ação e alvo. Não pode ser alterado.</w:t>
       </w:r>
     </w:p>
     <w:p>
@@ -3406,7 +3725,7 @@
           <w:sz w:val="21"/>
           <w:szCs w:val="21"/>
         </w:rPr>
-        <w:t xml:space="preserve">disparado 30 dias antes do vencimento.</w:t>
+        <w:t xml:space="preserve">disparado 60 dias antes do vencimento.</w:t>
       </w:r>
     </w:p>
     <w:p>
@@ -3532,7 +3851,7 @@
           <w:sz w:val="21"/>
           <w:szCs w:val="21"/>
         </w:rPr>
-        <w:t xml:space="preserve">Responsivo, com prioridade para uso em celular.</w:t>
+        <w:t xml:space="preserve">Responsivo em celular, tablet e computador.</w:t>
       </w:r>
     </w:p>
     <w:p>

</xml_diff>

<commit_message>
Escopo v1.2: autenticacao na plataforma (sem SSO) e gestao de usuarios
Co-Authored-By: Claude Opus 4.8 <noreply@anthropic.com>
</commit_message>
<xml_diff>
--- a/Escopo_Passaporte_de_Seguranca_Unilever.docx
+++ b/Escopo_Passaporte_de_Seguranca_Unilever.docx
@@ -141,7 +141,7 @@
           <w:sz w:val="20"/>
           <w:szCs w:val="20"/>
         </w:rPr>
-        <w:t xml:space="preserve">Versão 1.1  ·  28 de agosto de 2026</w:t>
+        <w:t xml:space="preserve">Versão 1.2  ·  28 de agosto de 2026</w:t>
       </w:r>
     </w:p>
     <w:p>
@@ -179,10 +179,10 @@
         </w:tblBorders>
       </w:tblPr>
       <w:tblGrid>
-        <w:gridCol w:w="1000"/>
-        <w:gridCol w:w="1350"/>
-        <w:gridCol w:w="1600"/>
-        <w:gridCol w:w="4270"/>
+        <w:gridCol w:w="900"/>
+        <w:gridCol w:w="1250"/>
+        <w:gridCol w:w="1500"/>
+        <w:gridCol w:w="4570"/>
       </w:tblGrid>
       <w:tr>
         <w:trPr>
@@ -190,7 +190,7 @@
         </w:trPr>
         <w:tc>
           <w:tcPr>
-            <w:tcW w:type="dxa" w:w="1000"/>
+            <w:tcW w:type="dxa" w:w="900"/>
             <w:shd w:fill="1F36C7" w:color="auto" w:val="clear"/>
             <w:tcMar>
               <w:top w:type="dxa" w:w="60"/>
@@ -215,7 +215,7 @@
         </w:tc>
         <w:tc>
           <w:tcPr>
-            <w:tcW w:type="dxa" w:w="1350"/>
+            <w:tcW w:type="dxa" w:w="1250"/>
             <w:shd w:fill="1F36C7" w:color="auto" w:val="clear"/>
             <w:tcMar>
               <w:top w:type="dxa" w:w="60"/>
@@ -240,7 +240,7 @@
         </w:tc>
         <w:tc>
           <w:tcPr>
-            <w:tcW w:type="dxa" w:w="1600"/>
+            <w:tcW w:type="dxa" w:w="1500"/>
             <w:shd w:fill="1F36C7" w:color="auto" w:val="clear"/>
             <w:tcMar>
               <w:top w:type="dxa" w:w="60"/>
@@ -265,7 +265,7 @@
         </w:tc>
         <w:tc>
           <w:tcPr>
-            <w:tcW w:type="dxa" w:w="4270"/>
+            <w:tcW w:type="dxa" w:w="4570"/>
             <w:shd w:fill="1F36C7" w:color="auto" w:val="clear"/>
             <w:tcMar>
               <w:top w:type="dxa" w:w="60"/>
@@ -292,7 +292,7 @@
       <w:tr>
         <w:tc>
           <w:tcPr>
-            <w:tcW w:type="dxa" w:w="1000"/>
+            <w:tcW w:type="dxa" w:w="900"/>
             <w:shd w:fill="FFFFFF" w:color="auto" w:val="clear"/>
             <w:tcMar>
               <w:top w:type="dxa" w:w="50"/>
@@ -318,7 +318,7 @@
         </w:tc>
         <w:tc>
           <w:tcPr>
-            <w:tcW w:type="dxa" w:w="1350"/>
+            <w:tcW w:type="dxa" w:w="1250"/>
             <w:shd w:fill="FFFFFF" w:color="auto" w:val="clear"/>
             <w:tcMar>
               <w:top w:type="dxa" w:w="50"/>
@@ -346,7 +346,7 @@
         </w:tc>
         <w:tc>
           <w:tcPr>
-            <w:tcW w:type="dxa" w:w="1600"/>
+            <w:tcW w:type="dxa" w:w="1500"/>
             <w:shd w:fill="FFFFFF" w:color="auto" w:val="clear"/>
             <w:tcMar>
               <w:top w:type="dxa" w:w="50"/>
@@ -374,7 +374,7 @@
         </w:tc>
         <w:tc>
           <w:tcPr>
-            <w:tcW w:type="dxa" w:w="4270"/>
+            <w:tcW w:type="dxa" w:w="4570"/>
             <w:shd w:fill="FFFFFF" w:color="auto" w:val="clear"/>
             <w:tcMar>
               <w:top w:type="dxa" w:w="50"/>
@@ -404,7 +404,7 @@
       <w:tr>
         <w:tc>
           <w:tcPr>
-            <w:tcW w:type="dxa" w:w="1000"/>
+            <w:tcW w:type="dxa" w:w="900"/>
             <w:shd w:fill="F4F6FB" w:color="auto" w:val="clear"/>
             <w:tcMar>
               <w:top w:type="dxa" w:w="50"/>
@@ -430,7 +430,7 @@
         </w:tc>
         <w:tc>
           <w:tcPr>
-            <w:tcW w:type="dxa" w:w="1350"/>
+            <w:tcW w:type="dxa" w:w="1250"/>
             <w:shd w:fill="F4F6FB" w:color="auto" w:val="clear"/>
             <w:tcMar>
               <w:top w:type="dxa" w:w="50"/>
@@ -458,7 +458,7 @@
         </w:tc>
         <w:tc>
           <w:tcPr>
-            <w:tcW w:type="dxa" w:w="1600"/>
+            <w:tcW w:type="dxa" w:w="1500"/>
             <w:shd w:fill="F4F6FB" w:color="auto" w:val="clear"/>
             <w:tcMar>
               <w:top w:type="dxa" w:w="50"/>
@@ -486,7 +486,7 @@
         </w:tc>
         <w:tc>
           <w:tcPr>
-            <w:tcW w:type="dxa" w:w="4270"/>
+            <w:tcW w:type="dxa" w:w="4570"/>
             <w:shd w:fill="F4F6FB" w:color="auto" w:val="clear"/>
             <w:tcMar>
               <w:top w:type="dxa" w:w="50"/>
@@ -509,6 +509,118 @@
                 <w:szCs w:val="18"/>
               </w:rPr>
               <w:t xml:space="preserve">Ajustes após retorno da Unilever: visualização em celular, tablet e computador; alerta de vencimento em 60 dias; inativação de colaboradores; rótulo "Não autorizado"; fluxo de emissão e de ASO.</w:t>
+            </w:r>
+          </w:p>
+        </w:tc>
+      </w:tr>
+      <w:tr>
+        <w:tc>
+          <w:tcPr>
+            <w:tcW w:type="dxa" w:w="900"/>
+            <w:shd w:fill="FFFFFF" w:color="auto" w:val="clear"/>
+            <w:tcMar>
+              <w:top w:type="dxa" w:w="50"/>
+              <w:left w:type="dxa" w:w="90"/>
+              <w:bottom w:type="dxa" w:w="50"/>
+              <w:right w:type="dxa" w:w="90"/>
+            </w:tcMar>
+          </w:tcPr>
+          <w:p>
+            <w:pPr>
+              <w:spacing w:after="0" w:line="250"/>
+            </w:pPr>
+            <w:r>
+              <w:rPr>
+                <w:rFonts w:ascii="Calibri" w:cs="Calibri" w:eastAsia="Calibri" w:hAnsi="Calibri"/>
+                <w:color w:val="23272F"/>
+                <w:sz w:val="18"/>
+                <w:szCs w:val="18"/>
+              </w:rPr>
+              <w:t xml:space="preserve">1.2</w:t>
+            </w:r>
+          </w:p>
+        </w:tc>
+        <w:tc>
+          <w:tcPr>
+            <w:tcW w:type="dxa" w:w="1250"/>
+            <w:shd w:fill="FFFFFF" w:color="auto" w:val="clear"/>
+            <w:tcMar>
+              <w:top w:type="dxa" w:w="50"/>
+              <w:left w:type="dxa" w:w="90"/>
+              <w:bottom w:type="dxa" w:w="50"/>
+              <w:right w:type="dxa" w:w="90"/>
+            </w:tcMar>
+          </w:tcPr>
+          <w:p>
+            <w:pPr>
+              <w:spacing w:after="0" w:line="250"/>
+            </w:pPr>
+            <w:r>
+              <w:rPr>
+                <w:rFonts w:ascii="Calibri" w:cs="Calibri" w:eastAsia="Calibri" w:hAnsi="Calibri"/>
+                <w:b w:val="false"/>
+                <w:bCs w:val="false"/>
+                <w:color w:val="23272F"/>
+                <w:sz w:val="18"/>
+                <w:szCs w:val="18"/>
+              </w:rPr>
+              <w:t xml:space="preserve">28/08/2026</w:t>
+            </w:r>
+          </w:p>
+        </w:tc>
+        <w:tc>
+          <w:tcPr>
+            <w:tcW w:type="dxa" w:w="1500"/>
+            <w:shd w:fill="FFFFFF" w:color="auto" w:val="clear"/>
+            <w:tcMar>
+              <w:top w:type="dxa" w:w="50"/>
+              <w:left w:type="dxa" w:w="90"/>
+              <w:bottom w:type="dxa" w:w="50"/>
+              <w:right w:type="dxa" w:w="90"/>
+            </w:tcMar>
+          </w:tcPr>
+          <w:p>
+            <w:pPr>
+              <w:spacing w:after="0" w:line="250"/>
+            </w:pPr>
+            <w:r>
+              <w:rPr>
+                <w:rFonts w:ascii="Calibri" w:cs="Calibri" w:eastAsia="Calibri" w:hAnsi="Calibri"/>
+                <w:b w:val="false"/>
+                <w:bCs w:val="false"/>
+                <w:color w:val="23272F"/>
+                <w:sz w:val="18"/>
+                <w:szCs w:val="18"/>
+              </w:rPr>
+              <w:t xml:space="preserve">DriveData</w:t>
+            </w:r>
+          </w:p>
+        </w:tc>
+        <w:tc>
+          <w:tcPr>
+            <w:tcW w:type="dxa" w:w="4570"/>
+            <w:shd w:fill="FFFFFF" w:color="auto" w:val="clear"/>
+            <w:tcMar>
+              <w:top w:type="dxa" w:w="50"/>
+              <w:left w:type="dxa" w:w="90"/>
+              <w:bottom w:type="dxa" w:w="50"/>
+              <w:right w:type="dxa" w:w="90"/>
+            </w:tcMar>
+          </w:tcPr>
+          <w:p>
+            <w:pPr>
+              <w:spacing w:after="0" w:line="250"/>
+            </w:pPr>
+            <w:r>
+              <w:rPr>
+                <w:rFonts w:ascii="Calibri" w:cs="Calibri" w:eastAsia="Calibri" w:hAnsi="Calibri"/>
+                <w:b w:val="false"/>
+                <w:bCs w:val="false"/>
+                <w:color w:val="23272F"/>
+                <w:sz w:val="18"/>
+                <w:szCs w:val="18"/>
+              </w:rPr>
+              <w:t xml:space="preserve">Autenticação da equipe dentro da própria plataforma (e-mail e senha), sem SSO corporativo. Inclui gestão de usuários pelo administrador.</w:t>
             </w:r>
           </w:p>
         </w:tc>
@@ -1121,7 +1233,7 @@
                 <w:sz w:val="18"/>
                 <w:szCs w:val="18"/>
               </w:rPr>
-              <w:t xml:space="preserve">Coordenação de Treinamentos</w:t>
+              <w:t xml:space="preserve">Administrador / Coord. de Treinamentos</w:t>
             </w:r>
           </w:p>
         </w:tc>
@@ -1149,7 +1261,7 @@
                 <w:sz w:val="18"/>
                 <w:szCs w:val="18"/>
               </w:rPr>
-              <w:t xml:space="preserve">Login corporativo</w:t>
+              <w:t xml:space="preserve">Login na plataforma</w:t>
             </w:r>
           </w:p>
         </w:tc>
@@ -1177,7 +1289,7 @@
                 <w:sz w:val="18"/>
                 <w:szCs w:val="18"/>
               </w:rPr>
-              <w:t xml:space="preserve">Emite e valida carteirinhas. Gerencia treinamentos, colaboradores, regras de validade e integrações. Visão completa de conformidade.</w:t>
+              <w:t xml:space="preserve">Gerencia usuários, treinamentos, colaboradores, regras de validade e integrações. Emite e valida carteirinhas.</w:t>
             </w:r>
           </w:p>
         </w:tc>
@@ -1233,7 +1345,7 @@
                 <w:sz w:val="18"/>
                 <w:szCs w:val="18"/>
               </w:rPr>
-              <w:t xml:space="preserve">Login corporativo</w:t>
+              <w:t xml:space="preserve">Login na plataforma</w:t>
             </w:r>
           </w:p>
         </w:tc>
@@ -1317,7 +1429,7 @@
                 <w:sz w:val="18"/>
                 <w:szCs w:val="18"/>
               </w:rPr>
-              <w:t xml:space="preserve">Login corporativo</w:t>
+              <w:t xml:space="preserve">Login na plataforma</w:t>
             </w:r>
           </w:p>
         </w:tc>
@@ -1435,6 +1547,37 @@
         </w:tc>
       </w:tr>
     </w:tbl>
+    <w:p>
+      <w:pPr>
+        <w:pStyle w:val="Heading2"/>
+        <w:spacing w:after="100" w:before="220"/>
+      </w:pPr>
+      <w:r>
+        <w:rPr>
+          <w:rFonts w:ascii="Calibri" w:cs="Calibri" w:eastAsia="Calibri" w:hAnsi="Calibri"/>
+          <w:b/>
+          <w:bCs/>
+          <w:color w:val="0E1424"/>
+          <w:sz w:val="24"/>
+          <w:szCs w:val="24"/>
+        </w:rPr>
+        <w:t xml:space="preserve">Autenticação e usuários</w:t>
+      </w:r>
+    </w:p>
+    <w:p>
+      <w:pPr>
+        <w:spacing w:after="120" w:before="0" w:line="276"/>
+      </w:pPr>
+      <w:r>
+        <w:rPr>
+          <w:rFonts w:ascii="Calibri" w:cs="Calibri" w:eastAsia="Calibri" w:hAnsi="Calibri"/>
+          <w:color w:val="23272F"/>
+          <w:sz w:val="21"/>
+          <w:szCs w:val="21"/>
+        </w:rPr>
+        <w:t xml:space="preserve">Os usuários da equipe são criados e gerenciados dentro da própria plataforma, pelo administrador. O acesso é por e-mail e senha, com redefinição de senha por e-mail. Não há integração com o login corporativo (SSO). O colaborador não faz login: consulta por RE ou QR.</w:t>
+      </w:r>
+    </w:p>
     <w:p>
       <w:pPr>
         <w:pStyle w:val="Heading2"/>
@@ -3158,11 +3301,41 @@
       <w:r>
         <w:rPr>
           <w:rFonts w:ascii="Calibri" w:cs="Calibri" w:eastAsia="Calibri" w:hAnsi="Calibri"/>
-          <w:color w:val="23272F"/>
-          <w:sz w:val="21"/>
-          <w:szCs w:val="21"/>
-        </w:rPr>
-        <w:t xml:space="preserve">Perfis de acesso e usuários.</w:t>
+          <w:b/>
+          <w:bCs/>
+          <w:color w:val="23272F"/>
+          <w:sz w:val="21"/>
+          <w:szCs w:val="21"/>
+        </w:rPr>
+        <w:t xml:space="preserve">Gestão de usuários: </w:t>
+      </w:r>
+      <w:r>
+        <w:rPr>
+          <w:rFonts w:ascii="Calibri" w:cs="Calibri" w:eastAsia="Calibri" w:hAnsi="Calibri"/>
+          <w:color w:val="23272F"/>
+          <w:sz w:val="21"/>
+          <w:szCs w:val="21"/>
+        </w:rPr>
+        <w:t xml:space="preserve">o administrador cria, edita, define o perfil e inativa os usuários da equipe, dentro da própria plataforma.</w:t>
+      </w:r>
+    </w:p>
+    <w:p>
+      <w:pPr>
+        <w:pStyle w:val="ListParagraph"/>
+        <w:numPr>
+          <w:ilvl w:val="0"/>
+          <w:numId w:val="1"/>
+        </w:numPr>
+        <w:spacing w:after="60" w:line="270"/>
+      </w:pPr>
+      <w:r>
+        <w:rPr>
+          <w:rFonts w:ascii="Calibri" w:cs="Calibri" w:eastAsia="Calibri" w:hAnsi="Calibri"/>
+          <w:color w:val="23272F"/>
+          <w:sz w:val="21"/>
+          <w:szCs w:val="21"/>
+        </w:rPr>
+        <w:t xml:space="preserve">Perfis de acesso.</w:t>
       </w:r>
     </w:p>
     <w:p>
@@ -3927,7 +4100,7 @@
           <w:sz w:val="21"/>
           <w:szCs w:val="21"/>
         </w:rPr>
-        <w:t xml:space="preserve">Autenticação da área de gestão por conta corporativa (SSO).</w:t>
+        <w:t xml:space="preserve">Autenticação da equipe por e-mail e senha, com usuários criados e gerenciados dentro da plataforma.</w:t>
       </w:r>
     </w:p>
     <w:p>

</xml_diff>

<commit_message>
Escopo v1.3: controle de acesso ao ASO (dado sensivel)
Co-Authored-By: Claude Opus 4.8 <noreply@anthropic.com>
</commit_message>
<xml_diff>
--- a/Escopo_Passaporte_de_Seguranca_Unilever.docx
+++ b/Escopo_Passaporte_de_Seguranca_Unilever.docx
@@ -141,7 +141,7 @@
           <w:sz w:val="20"/>
           <w:szCs w:val="20"/>
         </w:rPr>
-        <w:t xml:space="preserve">Versão 1.2  ·  28 de agosto de 2026</w:t>
+        <w:t xml:space="preserve">Versão 1.3  ·  28 de agosto de 2026</w:t>
       </w:r>
     </w:p>
     <w:p>
@@ -179,10 +179,10 @@
         </w:tblBorders>
       </w:tblPr>
       <w:tblGrid>
-        <w:gridCol w:w="900"/>
-        <w:gridCol w:w="1250"/>
-        <w:gridCol w:w="1500"/>
-        <w:gridCol w:w="4570"/>
+        <w:gridCol w:w="850"/>
+        <w:gridCol w:w="1150"/>
+        <w:gridCol w:w="1450"/>
+        <w:gridCol w:w="4770"/>
       </w:tblGrid>
       <w:tr>
         <w:trPr>
@@ -190,7 +190,7 @@
         </w:trPr>
         <w:tc>
           <w:tcPr>
-            <w:tcW w:type="dxa" w:w="900"/>
+            <w:tcW w:type="dxa" w:w="850"/>
             <w:shd w:fill="1F36C7" w:color="auto" w:val="clear"/>
             <w:tcMar>
               <w:top w:type="dxa" w:w="60"/>
@@ -215,7 +215,7 @@
         </w:tc>
         <w:tc>
           <w:tcPr>
-            <w:tcW w:type="dxa" w:w="1250"/>
+            <w:tcW w:type="dxa" w:w="1150"/>
             <w:shd w:fill="1F36C7" w:color="auto" w:val="clear"/>
             <w:tcMar>
               <w:top w:type="dxa" w:w="60"/>
@@ -240,7 +240,7 @@
         </w:tc>
         <w:tc>
           <w:tcPr>
-            <w:tcW w:type="dxa" w:w="1500"/>
+            <w:tcW w:type="dxa" w:w="1450"/>
             <w:shd w:fill="1F36C7" w:color="auto" w:val="clear"/>
             <w:tcMar>
               <w:top w:type="dxa" w:w="60"/>
@@ -265,7 +265,7 @@
         </w:tc>
         <w:tc>
           <w:tcPr>
-            <w:tcW w:type="dxa" w:w="4570"/>
+            <w:tcW w:type="dxa" w:w="4770"/>
             <w:shd w:fill="1F36C7" w:color="auto" w:val="clear"/>
             <w:tcMar>
               <w:top w:type="dxa" w:w="60"/>
@@ -292,7 +292,7 @@
       <w:tr>
         <w:tc>
           <w:tcPr>
-            <w:tcW w:type="dxa" w:w="900"/>
+            <w:tcW w:type="dxa" w:w="850"/>
             <w:shd w:fill="FFFFFF" w:color="auto" w:val="clear"/>
             <w:tcMar>
               <w:top w:type="dxa" w:w="50"/>
@@ -318,7 +318,7 @@
         </w:tc>
         <w:tc>
           <w:tcPr>
-            <w:tcW w:type="dxa" w:w="1250"/>
+            <w:tcW w:type="dxa" w:w="1150"/>
             <w:shd w:fill="FFFFFF" w:color="auto" w:val="clear"/>
             <w:tcMar>
               <w:top w:type="dxa" w:w="50"/>
@@ -346,7 +346,7 @@
         </w:tc>
         <w:tc>
           <w:tcPr>
-            <w:tcW w:type="dxa" w:w="1500"/>
+            <w:tcW w:type="dxa" w:w="1450"/>
             <w:shd w:fill="FFFFFF" w:color="auto" w:val="clear"/>
             <w:tcMar>
               <w:top w:type="dxa" w:w="50"/>
@@ -374,7 +374,7 @@
         </w:tc>
         <w:tc>
           <w:tcPr>
-            <w:tcW w:type="dxa" w:w="4570"/>
+            <w:tcW w:type="dxa" w:w="4770"/>
             <w:shd w:fill="FFFFFF" w:color="auto" w:val="clear"/>
             <w:tcMar>
               <w:top w:type="dxa" w:w="50"/>
@@ -404,7 +404,7 @@
       <w:tr>
         <w:tc>
           <w:tcPr>
-            <w:tcW w:type="dxa" w:w="900"/>
+            <w:tcW w:type="dxa" w:w="850"/>
             <w:shd w:fill="F4F6FB" w:color="auto" w:val="clear"/>
             <w:tcMar>
               <w:top w:type="dxa" w:w="50"/>
@@ -430,7 +430,7 @@
         </w:tc>
         <w:tc>
           <w:tcPr>
-            <w:tcW w:type="dxa" w:w="1250"/>
+            <w:tcW w:type="dxa" w:w="1150"/>
             <w:shd w:fill="F4F6FB" w:color="auto" w:val="clear"/>
             <w:tcMar>
               <w:top w:type="dxa" w:w="50"/>
@@ -458,7 +458,7 @@
         </w:tc>
         <w:tc>
           <w:tcPr>
-            <w:tcW w:type="dxa" w:w="1500"/>
+            <w:tcW w:type="dxa" w:w="1450"/>
             <w:shd w:fill="F4F6FB" w:color="auto" w:val="clear"/>
             <w:tcMar>
               <w:top w:type="dxa" w:w="50"/>
@@ -486,7 +486,7 @@
         </w:tc>
         <w:tc>
           <w:tcPr>
-            <w:tcW w:type="dxa" w:w="4570"/>
+            <w:tcW w:type="dxa" w:w="4770"/>
             <w:shd w:fill="F4F6FB" w:color="auto" w:val="clear"/>
             <w:tcMar>
               <w:top w:type="dxa" w:w="50"/>
@@ -516,7 +516,7 @@
       <w:tr>
         <w:tc>
           <w:tcPr>
-            <w:tcW w:type="dxa" w:w="900"/>
+            <w:tcW w:type="dxa" w:w="850"/>
             <w:shd w:fill="FFFFFF" w:color="auto" w:val="clear"/>
             <w:tcMar>
               <w:top w:type="dxa" w:w="50"/>
@@ -542,7 +542,7 @@
         </w:tc>
         <w:tc>
           <w:tcPr>
-            <w:tcW w:type="dxa" w:w="1250"/>
+            <w:tcW w:type="dxa" w:w="1150"/>
             <w:shd w:fill="FFFFFF" w:color="auto" w:val="clear"/>
             <w:tcMar>
               <w:top w:type="dxa" w:w="50"/>
@@ -570,7 +570,7 @@
         </w:tc>
         <w:tc>
           <w:tcPr>
-            <w:tcW w:type="dxa" w:w="1500"/>
+            <w:tcW w:type="dxa" w:w="1450"/>
             <w:shd w:fill="FFFFFF" w:color="auto" w:val="clear"/>
             <w:tcMar>
               <w:top w:type="dxa" w:w="50"/>
@@ -598,7 +598,7 @@
         </w:tc>
         <w:tc>
           <w:tcPr>
-            <w:tcW w:type="dxa" w:w="4570"/>
+            <w:tcW w:type="dxa" w:w="4770"/>
             <w:shd w:fill="FFFFFF" w:color="auto" w:val="clear"/>
             <w:tcMar>
               <w:top w:type="dxa" w:w="50"/>
@@ -621,6 +621,118 @@
                 <w:szCs w:val="18"/>
               </w:rPr>
               <w:t xml:space="preserve">Autenticação da equipe dentro da própria plataforma (e-mail e senha), sem SSO corporativo. Inclui gestão de usuários pelo administrador.</w:t>
+            </w:r>
+          </w:p>
+        </w:tc>
+      </w:tr>
+      <w:tr>
+        <w:tc>
+          <w:tcPr>
+            <w:tcW w:type="dxa" w:w="850"/>
+            <w:shd w:fill="F4F6FB" w:color="auto" w:val="clear"/>
+            <w:tcMar>
+              <w:top w:type="dxa" w:w="50"/>
+              <w:left w:type="dxa" w:w="90"/>
+              <w:bottom w:type="dxa" w:w="50"/>
+              <w:right w:type="dxa" w:w="90"/>
+            </w:tcMar>
+          </w:tcPr>
+          <w:p>
+            <w:pPr>
+              <w:spacing w:after="0" w:line="250"/>
+            </w:pPr>
+            <w:r>
+              <w:rPr>
+                <w:rFonts w:ascii="Calibri" w:cs="Calibri" w:eastAsia="Calibri" w:hAnsi="Calibri"/>
+                <w:color w:val="23272F"/>
+                <w:sz w:val="18"/>
+                <w:szCs w:val="18"/>
+              </w:rPr>
+              <w:t xml:space="preserve">1.3</w:t>
+            </w:r>
+          </w:p>
+        </w:tc>
+        <w:tc>
+          <w:tcPr>
+            <w:tcW w:type="dxa" w:w="1150"/>
+            <w:shd w:fill="F4F6FB" w:color="auto" w:val="clear"/>
+            <w:tcMar>
+              <w:top w:type="dxa" w:w="50"/>
+              <w:left w:type="dxa" w:w="90"/>
+              <w:bottom w:type="dxa" w:w="50"/>
+              <w:right w:type="dxa" w:w="90"/>
+            </w:tcMar>
+          </w:tcPr>
+          <w:p>
+            <w:pPr>
+              <w:spacing w:after="0" w:line="250"/>
+            </w:pPr>
+            <w:r>
+              <w:rPr>
+                <w:rFonts w:ascii="Calibri" w:cs="Calibri" w:eastAsia="Calibri" w:hAnsi="Calibri"/>
+                <w:b w:val="false"/>
+                <w:bCs w:val="false"/>
+                <w:color w:val="23272F"/>
+                <w:sz w:val="18"/>
+                <w:szCs w:val="18"/>
+              </w:rPr>
+              <w:t xml:space="preserve">28/08/2026</w:t>
+            </w:r>
+          </w:p>
+        </w:tc>
+        <w:tc>
+          <w:tcPr>
+            <w:tcW w:type="dxa" w:w="1450"/>
+            <w:shd w:fill="F4F6FB" w:color="auto" w:val="clear"/>
+            <w:tcMar>
+              <w:top w:type="dxa" w:w="50"/>
+              <w:left w:type="dxa" w:w="90"/>
+              <w:bottom w:type="dxa" w:w="50"/>
+              <w:right w:type="dxa" w:w="90"/>
+            </w:tcMar>
+          </w:tcPr>
+          <w:p>
+            <w:pPr>
+              <w:spacing w:after="0" w:line="250"/>
+            </w:pPr>
+            <w:r>
+              <w:rPr>
+                <w:rFonts w:ascii="Calibri" w:cs="Calibri" w:eastAsia="Calibri" w:hAnsi="Calibri"/>
+                <w:b w:val="false"/>
+                <w:bCs w:val="false"/>
+                <w:color w:val="23272F"/>
+                <w:sz w:val="18"/>
+                <w:szCs w:val="18"/>
+              </w:rPr>
+              <w:t xml:space="preserve">DriveData</w:t>
+            </w:r>
+          </w:p>
+        </w:tc>
+        <w:tc>
+          <w:tcPr>
+            <w:tcW w:type="dxa" w:w="4770"/>
+            <w:shd w:fill="F4F6FB" w:color="auto" w:val="clear"/>
+            <w:tcMar>
+              <w:top w:type="dxa" w:w="50"/>
+              <w:left w:type="dxa" w:w="90"/>
+              <w:bottom w:type="dxa" w:w="50"/>
+              <w:right w:type="dxa" w:w="90"/>
+            </w:tcMar>
+          </w:tcPr>
+          <w:p>
+            <w:pPr>
+              <w:spacing w:after="0" w:line="250"/>
+            </w:pPr>
+            <w:r>
+              <w:rPr>
+                <w:rFonts w:ascii="Calibri" w:cs="Calibri" w:eastAsia="Calibri" w:hAnsi="Calibri"/>
+                <w:b w:val="false"/>
+                <w:bCs w:val="false"/>
+                <w:color w:val="23272F"/>
+                <w:sz w:val="18"/>
+                <w:szCs w:val="18"/>
+              </w:rPr>
+              <w:t xml:space="preserve">Controle de acesso ao ASO como dado sensível: inserção apenas pela Saúde; visualização apenas por Administração e Saúde.</w:t>
             </w:r>
           </w:p>
         </w:tc>
@@ -1698,6 +1810,111 @@
           <w:szCs w:val="21"/>
         </w:rPr>
         <w:t xml:space="preserve">enquanto não houver integração, a equipe de Saúde mantém a validade do ASO por um campo próprio no sistema.</w:t>
+      </w:r>
+    </w:p>
+    <w:p>
+      <w:pPr>
+        <w:pStyle w:val="Heading2"/>
+        <w:spacing w:after="100" w:before="220"/>
+      </w:pPr>
+      <w:r>
+        <w:rPr>
+          <w:rFonts w:ascii="Calibri" w:cs="Calibri" w:eastAsia="Calibri" w:hAnsi="Calibri"/>
+          <w:b/>
+          <w:bCs/>
+          <w:color w:val="0E1424"/>
+          <w:sz w:val="24"/>
+          <w:szCs w:val="24"/>
+        </w:rPr>
+        <w:t xml:space="preserve">Controle de acesso ao ASO (dado sensível)</w:t>
+      </w:r>
+    </w:p>
+    <w:p>
+      <w:pPr>
+        <w:spacing w:after="120" w:before="0" w:line="276"/>
+      </w:pPr>
+      <w:r>
+        <w:rPr>
+          <w:rFonts w:ascii="Calibri" w:cs="Calibri" w:eastAsia="Calibri" w:hAnsi="Calibri"/>
+          <w:color w:val="23272F"/>
+          <w:sz w:val="21"/>
+          <w:szCs w:val="21"/>
+        </w:rPr>
+        <w:t xml:space="preserve">Por ser um dado de saúde, o ASO tem acesso restrito, independente dos demais campos:</w:t>
+      </w:r>
+    </w:p>
+    <w:p>
+      <w:pPr>
+        <w:pStyle w:val="ListParagraph"/>
+        <w:numPr>
+          <w:ilvl w:val="0"/>
+          <w:numId w:val="1"/>
+        </w:numPr>
+        <w:spacing w:after="60" w:line="270"/>
+      </w:pPr>
+      <w:r>
+        <w:rPr>
+          <w:rFonts w:ascii="Calibri" w:cs="Calibri" w:eastAsia="Calibri" w:hAnsi="Calibri"/>
+          <w:b/>
+          <w:bCs/>
+          <w:color w:val="23272F"/>
+          <w:sz w:val="21"/>
+          <w:szCs w:val="21"/>
+        </w:rPr>
+        <w:t xml:space="preserve">Inserir e editar o ASO: </w:t>
+      </w:r>
+      <w:r>
+        <w:rPr>
+          <w:rFonts w:ascii="Calibri" w:cs="Calibri" w:eastAsia="Calibri" w:hAnsi="Calibri"/>
+          <w:color w:val="23272F"/>
+          <w:sz w:val="21"/>
+          <w:szCs w:val="21"/>
+        </w:rPr>
+        <w:t xml:space="preserve">apenas o perfil Saúde Ocupacional.</w:t>
+      </w:r>
+    </w:p>
+    <w:p>
+      <w:pPr>
+        <w:pStyle w:val="ListParagraph"/>
+        <w:numPr>
+          <w:ilvl w:val="0"/>
+          <w:numId w:val="1"/>
+        </w:numPr>
+        <w:spacing w:after="60" w:line="270"/>
+      </w:pPr>
+      <w:r>
+        <w:rPr>
+          <w:rFonts w:ascii="Calibri" w:cs="Calibri" w:eastAsia="Calibri" w:hAnsi="Calibri"/>
+          <w:b/>
+          <w:bCs/>
+          <w:color w:val="23272F"/>
+          <w:sz w:val="21"/>
+          <w:szCs w:val="21"/>
+        </w:rPr>
+        <w:t xml:space="preserve">Visualizar o ASO: </w:t>
+      </w:r>
+      <w:r>
+        <w:rPr>
+          <w:rFonts w:ascii="Calibri" w:cs="Calibri" w:eastAsia="Calibri" w:hAnsi="Calibri"/>
+          <w:color w:val="23272F"/>
+          <w:sz w:val="21"/>
+          <w:szCs w:val="21"/>
+        </w:rPr>
+        <w:t xml:space="preserve">apenas os perfis Administração e Saúde Ocupacional.</w:t>
+      </w:r>
+    </w:p>
+    <w:p>
+      <w:pPr>
+        <w:spacing w:after="120" w:before="0" w:line="276"/>
+      </w:pPr>
+      <w:r>
+        <w:rPr>
+          <w:rFonts w:ascii="Calibri" w:cs="Calibri" w:eastAsia="Calibri" w:hAnsi="Calibri"/>
+          <w:color w:val="23272F"/>
+          <w:sz w:val="21"/>
+          <w:szCs w:val="21"/>
+        </w:rPr>
+        <w:t xml:space="preserve">A equipe de SHE e o colaborador não visualizam o ASO. A carteirinha consultada por RE/QR não exibe o dado de ASO.</w:t>
       </w:r>
     </w:p>
     <w:p>

</xml_diff>

<commit_message>
Escopo v1.4: detalhamento (estados/cores, campos, matriz de permissoes, casos de uso, entidades)
Co-Authored-By: Claude Opus 4.8 <noreply@anthropic.com>
</commit_message>
<xml_diff>
--- a/Escopo_Passaporte_de_Seguranca_Unilever.docx
+++ b/Escopo_Passaporte_de_Seguranca_Unilever.docx
@@ -141,7 +141,7 @@
           <w:sz w:val="20"/>
           <w:szCs w:val="20"/>
         </w:rPr>
-        <w:t xml:space="preserve">Versão 1.3  ·  28 de agosto de 2026</w:t>
+        <w:t xml:space="preserve">Versão 1.4  ·  28 de agosto de 2026</w:t>
       </w:r>
     </w:p>
     <w:p>
@@ -180,9 +180,9 @@
       </w:tblPr>
       <w:tblGrid>
         <w:gridCol w:w="850"/>
-        <w:gridCol w:w="1150"/>
-        <w:gridCol w:w="1450"/>
-        <w:gridCol w:w="4770"/>
+        <w:gridCol w:w="1100"/>
+        <w:gridCol w:w="1400"/>
+        <w:gridCol w:w="4870"/>
       </w:tblGrid>
       <w:tr>
         <w:trPr>
@@ -215,7 +215,7 @@
         </w:tc>
         <w:tc>
           <w:tcPr>
-            <w:tcW w:type="dxa" w:w="1150"/>
+            <w:tcW w:type="dxa" w:w="1100"/>
             <w:shd w:fill="1F36C7" w:color="auto" w:val="clear"/>
             <w:tcMar>
               <w:top w:type="dxa" w:w="60"/>
@@ -240,7 +240,7 @@
         </w:tc>
         <w:tc>
           <w:tcPr>
-            <w:tcW w:type="dxa" w:w="1450"/>
+            <w:tcW w:type="dxa" w:w="1400"/>
             <w:shd w:fill="1F36C7" w:color="auto" w:val="clear"/>
             <w:tcMar>
               <w:top w:type="dxa" w:w="60"/>
@@ -265,7 +265,7 @@
         </w:tc>
         <w:tc>
           <w:tcPr>
-            <w:tcW w:type="dxa" w:w="4770"/>
+            <w:tcW w:type="dxa" w:w="4870"/>
             <w:shd w:fill="1F36C7" w:color="auto" w:val="clear"/>
             <w:tcMar>
               <w:top w:type="dxa" w:w="60"/>
@@ -318,7 +318,7 @@
         </w:tc>
         <w:tc>
           <w:tcPr>
-            <w:tcW w:type="dxa" w:w="1150"/>
+            <w:tcW w:type="dxa" w:w="1100"/>
             <w:shd w:fill="FFFFFF" w:color="auto" w:val="clear"/>
             <w:tcMar>
               <w:top w:type="dxa" w:w="50"/>
@@ -346,7 +346,7 @@
         </w:tc>
         <w:tc>
           <w:tcPr>
-            <w:tcW w:type="dxa" w:w="1450"/>
+            <w:tcW w:type="dxa" w:w="1400"/>
             <w:shd w:fill="FFFFFF" w:color="auto" w:val="clear"/>
             <w:tcMar>
               <w:top w:type="dxa" w:w="50"/>
@@ -374,7 +374,7 @@
         </w:tc>
         <w:tc>
           <w:tcPr>
-            <w:tcW w:type="dxa" w:w="4770"/>
+            <w:tcW w:type="dxa" w:w="4870"/>
             <w:shd w:fill="FFFFFF" w:color="auto" w:val="clear"/>
             <w:tcMar>
               <w:top w:type="dxa" w:w="50"/>
@@ -430,7 +430,7 @@
         </w:tc>
         <w:tc>
           <w:tcPr>
-            <w:tcW w:type="dxa" w:w="1150"/>
+            <w:tcW w:type="dxa" w:w="1100"/>
             <w:shd w:fill="F4F6FB" w:color="auto" w:val="clear"/>
             <w:tcMar>
               <w:top w:type="dxa" w:w="50"/>
@@ -458,7 +458,7 @@
         </w:tc>
         <w:tc>
           <w:tcPr>
-            <w:tcW w:type="dxa" w:w="1450"/>
+            <w:tcW w:type="dxa" w:w="1400"/>
             <w:shd w:fill="F4F6FB" w:color="auto" w:val="clear"/>
             <w:tcMar>
               <w:top w:type="dxa" w:w="50"/>
@@ -486,7 +486,7 @@
         </w:tc>
         <w:tc>
           <w:tcPr>
-            <w:tcW w:type="dxa" w:w="4770"/>
+            <w:tcW w:type="dxa" w:w="4870"/>
             <w:shd w:fill="F4F6FB" w:color="auto" w:val="clear"/>
             <w:tcMar>
               <w:top w:type="dxa" w:w="50"/>
@@ -542,7 +542,7 @@
         </w:tc>
         <w:tc>
           <w:tcPr>
-            <w:tcW w:type="dxa" w:w="1150"/>
+            <w:tcW w:type="dxa" w:w="1100"/>
             <w:shd w:fill="FFFFFF" w:color="auto" w:val="clear"/>
             <w:tcMar>
               <w:top w:type="dxa" w:w="50"/>
@@ -570,7 +570,7 @@
         </w:tc>
         <w:tc>
           <w:tcPr>
-            <w:tcW w:type="dxa" w:w="1450"/>
+            <w:tcW w:type="dxa" w:w="1400"/>
             <w:shd w:fill="FFFFFF" w:color="auto" w:val="clear"/>
             <w:tcMar>
               <w:top w:type="dxa" w:w="50"/>
@@ -598,7 +598,7 @@
         </w:tc>
         <w:tc>
           <w:tcPr>
-            <w:tcW w:type="dxa" w:w="4770"/>
+            <w:tcW w:type="dxa" w:w="4870"/>
             <w:shd w:fill="FFFFFF" w:color="auto" w:val="clear"/>
             <w:tcMar>
               <w:top w:type="dxa" w:w="50"/>
@@ -654,7 +654,7 @@
         </w:tc>
         <w:tc>
           <w:tcPr>
-            <w:tcW w:type="dxa" w:w="1150"/>
+            <w:tcW w:type="dxa" w:w="1100"/>
             <w:shd w:fill="F4F6FB" w:color="auto" w:val="clear"/>
             <w:tcMar>
               <w:top w:type="dxa" w:w="50"/>
@@ -682,7 +682,7 @@
         </w:tc>
         <w:tc>
           <w:tcPr>
-            <w:tcW w:type="dxa" w:w="1450"/>
+            <w:tcW w:type="dxa" w:w="1400"/>
             <w:shd w:fill="F4F6FB" w:color="auto" w:val="clear"/>
             <w:tcMar>
               <w:top w:type="dxa" w:w="50"/>
@@ -710,7 +710,7 @@
         </w:tc>
         <w:tc>
           <w:tcPr>
-            <w:tcW w:type="dxa" w:w="4770"/>
+            <w:tcW w:type="dxa" w:w="4870"/>
             <w:shd w:fill="F4F6FB" w:color="auto" w:val="clear"/>
             <w:tcMar>
               <w:top w:type="dxa" w:w="50"/>
@@ -733,6 +733,118 @@
                 <w:szCs w:val="18"/>
               </w:rPr>
               <w:t xml:space="preserve">Controle de acesso ao ASO como dado sensível: inserção apenas pela Saúde; visualização apenas por Administração e Saúde.</w:t>
+            </w:r>
+          </w:p>
+        </w:tc>
+      </w:tr>
+      <w:tr>
+        <w:tc>
+          <w:tcPr>
+            <w:tcW w:type="dxa" w:w="850"/>
+            <w:shd w:fill="FFFFFF" w:color="auto" w:val="clear"/>
+            <w:tcMar>
+              <w:top w:type="dxa" w:w="50"/>
+              <w:left w:type="dxa" w:w="90"/>
+              <w:bottom w:type="dxa" w:w="50"/>
+              <w:right w:type="dxa" w:w="90"/>
+            </w:tcMar>
+          </w:tcPr>
+          <w:p>
+            <w:pPr>
+              <w:spacing w:after="0" w:line="250"/>
+            </w:pPr>
+            <w:r>
+              <w:rPr>
+                <w:rFonts w:ascii="Calibri" w:cs="Calibri" w:eastAsia="Calibri" w:hAnsi="Calibri"/>
+                <w:color w:val="23272F"/>
+                <w:sz w:val="18"/>
+                <w:szCs w:val="18"/>
+              </w:rPr>
+              <w:t xml:space="preserve">1.4</w:t>
+            </w:r>
+          </w:p>
+        </w:tc>
+        <w:tc>
+          <w:tcPr>
+            <w:tcW w:type="dxa" w:w="1100"/>
+            <w:shd w:fill="FFFFFF" w:color="auto" w:val="clear"/>
+            <w:tcMar>
+              <w:top w:type="dxa" w:w="50"/>
+              <w:left w:type="dxa" w:w="90"/>
+              <w:bottom w:type="dxa" w:w="50"/>
+              <w:right w:type="dxa" w:w="90"/>
+            </w:tcMar>
+          </w:tcPr>
+          <w:p>
+            <w:pPr>
+              <w:spacing w:after="0" w:line="250"/>
+            </w:pPr>
+            <w:r>
+              <w:rPr>
+                <w:rFonts w:ascii="Calibri" w:cs="Calibri" w:eastAsia="Calibri" w:hAnsi="Calibri"/>
+                <w:b w:val="false"/>
+                <w:bCs w:val="false"/>
+                <w:color w:val="23272F"/>
+                <w:sz w:val="18"/>
+                <w:szCs w:val="18"/>
+              </w:rPr>
+              <w:t xml:space="preserve">28/08/2026</w:t>
+            </w:r>
+          </w:p>
+        </w:tc>
+        <w:tc>
+          <w:tcPr>
+            <w:tcW w:type="dxa" w:w="1400"/>
+            <w:shd w:fill="FFFFFF" w:color="auto" w:val="clear"/>
+            <w:tcMar>
+              <w:top w:type="dxa" w:w="50"/>
+              <w:left w:type="dxa" w:w="90"/>
+              <w:bottom w:type="dxa" w:w="50"/>
+              <w:right w:type="dxa" w:w="90"/>
+            </w:tcMar>
+          </w:tcPr>
+          <w:p>
+            <w:pPr>
+              <w:spacing w:after="0" w:line="250"/>
+            </w:pPr>
+            <w:r>
+              <w:rPr>
+                <w:rFonts w:ascii="Calibri" w:cs="Calibri" w:eastAsia="Calibri" w:hAnsi="Calibri"/>
+                <w:b w:val="false"/>
+                <w:bCs w:val="false"/>
+                <w:color w:val="23272F"/>
+                <w:sz w:val="18"/>
+                <w:szCs w:val="18"/>
+              </w:rPr>
+              <w:t xml:space="preserve">DriveData</w:t>
+            </w:r>
+          </w:p>
+        </w:tc>
+        <w:tc>
+          <w:tcPr>
+            <w:tcW w:type="dxa" w:w="4870"/>
+            <w:shd w:fill="FFFFFF" w:color="auto" w:val="clear"/>
+            <w:tcMar>
+              <w:top w:type="dxa" w:w="50"/>
+              <w:left w:type="dxa" w:w="90"/>
+              <w:bottom w:type="dxa" w:w="50"/>
+              <w:right w:type="dxa" w:w="90"/>
+            </w:tcMar>
+          </w:tcPr>
+          <w:p>
+            <w:pPr>
+              <w:spacing w:after="0" w:line="250"/>
+            </w:pPr>
+            <w:r>
+              <w:rPr>
+                <w:rFonts w:ascii="Calibri" w:cs="Calibri" w:eastAsia="Calibri" w:hAnsi="Calibri"/>
+                <w:b w:val="false"/>
+                <w:bCs w:val="false"/>
+                <w:color w:val="23272F"/>
+                <w:sz w:val="18"/>
+                <w:szCs w:val="18"/>
+              </w:rPr>
+              <w:t xml:space="preserve">Detalhamento: estados e cores, campos das carteirinhas, matriz de permissões, ações por módulo, casos de uso e entidades do sistema.</w:t>
             </w:r>
           </w:p>
         </w:tc>
@@ -1673,6 +1785,1309 @@
           <w:sz w:val="24"/>
           <w:szCs w:val="24"/>
         </w:rPr>
+        <w:t xml:space="preserve">Matriz de permissões</w:t>
+      </w:r>
+    </w:p>
+    <w:tbl>
+      <w:tblPr>
+        <w:tblW w:type="dxa" w:w="8220"/>
+        <w:tblBorders>
+          <w:top w:val="single" w:color="E6E9F2" w:sz="2"/>
+          <w:left w:val="single" w:color="E6E9F2" w:sz="2"/>
+          <w:bottom w:val="single" w:color="E6E9F2" w:sz="2"/>
+          <w:right w:val="single" w:color="E6E9F2" w:sz="2"/>
+          <w:insideH w:val="single" w:color="E6E9F2" w:sz="2"/>
+          <w:insideV w:val="single" w:color="E6E9F2" w:sz="2"/>
+        </w:tblBorders>
+      </w:tblPr>
+      <w:tblGrid>
+        <w:gridCol w:w="3020"/>
+        <w:gridCol w:w="1300"/>
+        <w:gridCol w:w="1300"/>
+        <w:gridCol w:w="1300"/>
+        <w:gridCol w:w="1300"/>
+      </w:tblGrid>
+      <w:tr>
+        <w:trPr>
+          <w:tblHeader/>
+        </w:trPr>
+        <w:tc>
+          <w:tcPr>
+            <w:tcW w:type="dxa" w:w="3020"/>
+            <w:shd w:fill="1F36C7" w:color="auto" w:val="clear"/>
+            <w:tcMar>
+              <w:top w:type="dxa" w:w="60"/>
+              <w:left w:type="dxa" w:w="90"/>
+              <w:bottom w:type="dxa" w:w="60"/>
+              <w:right w:type="dxa" w:w="90"/>
+            </w:tcMar>
+          </w:tcPr>
+          <w:p>
+            <w:r>
+              <w:rPr>
+                <w:rFonts w:ascii="Calibri" w:cs="Calibri" w:eastAsia="Calibri" w:hAnsi="Calibri"/>
+                <w:b/>
+                <w:bCs/>
+                <w:color w:val="FFFFFF"/>
+                <w:sz w:val="18"/>
+                <w:szCs w:val="18"/>
+              </w:rPr>
+              <w:t xml:space="preserve">Recurso / ação</w:t>
+            </w:r>
+          </w:p>
+        </w:tc>
+        <w:tc>
+          <w:tcPr>
+            <w:tcW w:type="dxa" w:w="1300"/>
+            <w:shd w:fill="1F36C7" w:color="auto" w:val="clear"/>
+            <w:tcMar>
+              <w:top w:type="dxa" w:w="60"/>
+              <w:left w:type="dxa" w:w="90"/>
+              <w:bottom w:type="dxa" w:w="60"/>
+              <w:right w:type="dxa" w:w="90"/>
+            </w:tcMar>
+          </w:tcPr>
+          <w:p>
+            <w:r>
+              <w:rPr>
+                <w:rFonts w:ascii="Calibri" w:cs="Calibri" w:eastAsia="Calibri" w:hAnsi="Calibri"/>
+                <w:b/>
+                <w:bCs/>
+                <w:color w:val="FFFFFF"/>
+                <w:sz w:val="18"/>
+                <w:szCs w:val="18"/>
+              </w:rPr>
+              <w:t xml:space="preserve">Admin</w:t>
+            </w:r>
+          </w:p>
+        </w:tc>
+        <w:tc>
+          <w:tcPr>
+            <w:tcW w:type="dxa" w:w="1300"/>
+            <w:shd w:fill="1F36C7" w:color="auto" w:val="clear"/>
+            <w:tcMar>
+              <w:top w:type="dxa" w:w="60"/>
+              <w:left w:type="dxa" w:w="90"/>
+              <w:bottom w:type="dxa" w:w="60"/>
+              <w:right w:type="dxa" w:w="90"/>
+            </w:tcMar>
+          </w:tcPr>
+          <w:p>
+            <w:r>
+              <w:rPr>
+                <w:rFonts w:ascii="Calibri" w:cs="Calibri" w:eastAsia="Calibri" w:hAnsi="Calibri"/>
+                <w:b/>
+                <w:bCs/>
+                <w:color w:val="FFFFFF"/>
+                <w:sz w:val="18"/>
+                <w:szCs w:val="18"/>
+              </w:rPr>
+              <w:t xml:space="preserve">SHE</w:t>
+            </w:r>
+          </w:p>
+        </w:tc>
+        <w:tc>
+          <w:tcPr>
+            <w:tcW w:type="dxa" w:w="1300"/>
+            <w:shd w:fill="1F36C7" w:color="auto" w:val="clear"/>
+            <w:tcMar>
+              <w:top w:type="dxa" w:w="60"/>
+              <w:left w:type="dxa" w:w="90"/>
+              <w:bottom w:type="dxa" w:w="60"/>
+              <w:right w:type="dxa" w:w="90"/>
+            </w:tcMar>
+          </w:tcPr>
+          <w:p>
+            <w:r>
+              <w:rPr>
+                <w:rFonts w:ascii="Calibri" w:cs="Calibri" w:eastAsia="Calibri" w:hAnsi="Calibri"/>
+                <w:b/>
+                <w:bCs/>
+                <w:color w:val="FFFFFF"/>
+                <w:sz w:val="18"/>
+                <w:szCs w:val="18"/>
+              </w:rPr>
+              <w:t xml:space="preserve">Saúde</w:t>
+            </w:r>
+          </w:p>
+        </w:tc>
+        <w:tc>
+          <w:tcPr>
+            <w:tcW w:type="dxa" w:w="1300"/>
+            <w:shd w:fill="1F36C7" w:color="auto" w:val="clear"/>
+            <w:tcMar>
+              <w:top w:type="dxa" w:w="60"/>
+              <w:left w:type="dxa" w:w="90"/>
+              <w:bottom w:type="dxa" w:w="60"/>
+              <w:right w:type="dxa" w:w="90"/>
+            </w:tcMar>
+          </w:tcPr>
+          <w:p>
+            <w:r>
+              <w:rPr>
+                <w:rFonts w:ascii="Calibri" w:cs="Calibri" w:eastAsia="Calibri" w:hAnsi="Calibri"/>
+                <w:b/>
+                <w:bCs/>
+                <w:color w:val="FFFFFF"/>
+                <w:sz w:val="18"/>
+                <w:szCs w:val="18"/>
+              </w:rPr>
+              <w:t xml:space="preserve">Colab.</w:t>
+            </w:r>
+          </w:p>
+        </w:tc>
+      </w:tr>
+      <w:tr>
+        <w:tc>
+          <w:tcPr>
+            <w:tcW w:type="dxa" w:w="3020"/>
+            <w:shd w:fill="FFFFFF" w:color="auto" w:val="clear"/>
+            <w:tcMar>
+              <w:top w:type="dxa" w:w="50"/>
+              <w:left w:type="dxa" w:w="90"/>
+              <w:bottom w:type="dxa" w:w="50"/>
+              <w:right w:type="dxa" w:w="90"/>
+            </w:tcMar>
+          </w:tcPr>
+          <w:p>
+            <w:pPr>
+              <w:spacing w:after="0" w:line="250"/>
+            </w:pPr>
+            <w:r>
+              <w:rPr>
+                <w:rFonts w:ascii="Calibri" w:cs="Calibri" w:eastAsia="Calibri" w:hAnsi="Calibri"/>
+                <w:color w:val="23272F"/>
+                <w:sz w:val="18"/>
+                <w:szCs w:val="18"/>
+              </w:rPr>
+              <w:t xml:space="preserve">Consultar carteirinha</w:t>
+            </w:r>
+          </w:p>
+        </w:tc>
+        <w:tc>
+          <w:tcPr>
+            <w:tcW w:type="dxa" w:w="1300"/>
+            <w:shd w:fill="FFFFFF" w:color="auto" w:val="clear"/>
+            <w:tcMar>
+              <w:top w:type="dxa" w:w="50"/>
+              <w:left w:type="dxa" w:w="90"/>
+              <w:bottom w:type="dxa" w:w="50"/>
+              <w:right w:type="dxa" w:w="90"/>
+            </w:tcMar>
+          </w:tcPr>
+          <w:p>
+            <w:pPr>
+              <w:spacing w:after="0" w:line="250"/>
+            </w:pPr>
+            <w:r>
+              <w:rPr>
+                <w:rFonts w:ascii="Calibri" w:cs="Calibri" w:eastAsia="Calibri" w:hAnsi="Calibri"/>
+                <w:b w:val="false"/>
+                <w:bCs w:val="false"/>
+                <w:color w:val="23272F"/>
+                <w:sz w:val="18"/>
+                <w:szCs w:val="18"/>
+              </w:rPr>
+              <w:t xml:space="preserve">Sim</w:t>
+            </w:r>
+          </w:p>
+        </w:tc>
+        <w:tc>
+          <w:tcPr>
+            <w:tcW w:type="dxa" w:w="1300"/>
+            <w:shd w:fill="FFFFFF" w:color="auto" w:val="clear"/>
+            <w:tcMar>
+              <w:top w:type="dxa" w:w="50"/>
+              <w:left w:type="dxa" w:w="90"/>
+              <w:bottom w:type="dxa" w:w="50"/>
+              <w:right w:type="dxa" w:w="90"/>
+            </w:tcMar>
+          </w:tcPr>
+          <w:p>
+            <w:pPr>
+              <w:spacing w:after="0" w:line="250"/>
+            </w:pPr>
+            <w:r>
+              <w:rPr>
+                <w:rFonts w:ascii="Calibri" w:cs="Calibri" w:eastAsia="Calibri" w:hAnsi="Calibri"/>
+                <w:b w:val="false"/>
+                <w:bCs w:val="false"/>
+                <w:color w:val="23272F"/>
+                <w:sz w:val="18"/>
+                <w:szCs w:val="18"/>
+              </w:rPr>
+              <w:t xml:space="preserve">Sim</w:t>
+            </w:r>
+          </w:p>
+        </w:tc>
+        <w:tc>
+          <w:tcPr>
+            <w:tcW w:type="dxa" w:w="1300"/>
+            <w:shd w:fill="FFFFFF" w:color="auto" w:val="clear"/>
+            <w:tcMar>
+              <w:top w:type="dxa" w:w="50"/>
+              <w:left w:type="dxa" w:w="90"/>
+              <w:bottom w:type="dxa" w:w="50"/>
+              <w:right w:type="dxa" w:w="90"/>
+            </w:tcMar>
+          </w:tcPr>
+          <w:p>
+            <w:pPr>
+              <w:spacing w:after="0" w:line="250"/>
+            </w:pPr>
+            <w:r>
+              <w:rPr>
+                <w:rFonts w:ascii="Calibri" w:cs="Calibri" w:eastAsia="Calibri" w:hAnsi="Calibri"/>
+                <w:b w:val="false"/>
+                <w:bCs w:val="false"/>
+                <w:color w:val="23272F"/>
+                <w:sz w:val="18"/>
+                <w:szCs w:val="18"/>
+              </w:rPr>
+              <w:t xml:space="preserve">Sim</w:t>
+            </w:r>
+          </w:p>
+        </w:tc>
+        <w:tc>
+          <w:tcPr>
+            <w:tcW w:type="dxa" w:w="1300"/>
+            <w:shd w:fill="FFFFFF" w:color="auto" w:val="clear"/>
+            <w:tcMar>
+              <w:top w:type="dxa" w:w="50"/>
+              <w:left w:type="dxa" w:w="90"/>
+              <w:bottom w:type="dxa" w:w="50"/>
+              <w:right w:type="dxa" w:w="90"/>
+            </w:tcMar>
+          </w:tcPr>
+          <w:p>
+            <w:pPr>
+              <w:spacing w:after="0" w:line="250"/>
+            </w:pPr>
+            <w:r>
+              <w:rPr>
+                <w:rFonts w:ascii="Calibri" w:cs="Calibri" w:eastAsia="Calibri" w:hAnsi="Calibri"/>
+                <w:b w:val="false"/>
+                <w:bCs w:val="false"/>
+                <w:color w:val="23272F"/>
+                <w:sz w:val="18"/>
+                <w:szCs w:val="18"/>
+              </w:rPr>
+              <w:t xml:space="preserve">Própria</w:t>
+            </w:r>
+          </w:p>
+        </w:tc>
+      </w:tr>
+      <w:tr>
+        <w:tc>
+          <w:tcPr>
+            <w:tcW w:type="dxa" w:w="3020"/>
+            <w:shd w:fill="F4F6FB" w:color="auto" w:val="clear"/>
+            <w:tcMar>
+              <w:top w:type="dxa" w:w="50"/>
+              <w:left w:type="dxa" w:w="90"/>
+              <w:bottom w:type="dxa" w:w="50"/>
+              <w:right w:type="dxa" w:w="90"/>
+            </w:tcMar>
+          </w:tcPr>
+          <w:p>
+            <w:pPr>
+              <w:spacing w:after="0" w:line="250"/>
+            </w:pPr>
+            <w:r>
+              <w:rPr>
+                <w:rFonts w:ascii="Calibri" w:cs="Calibri" w:eastAsia="Calibri" w:hAnsi="Calibri"/>
+                <w:color w:val="23272F"/>
+                <w:sz w:val="18"/>
+                <w:szCs w:val="18"/>
+              </w:rPr>
+              <w:t xml:space="preserve">Emitir / validar carteirinha</w:t>
+            </w:r>
+          </w:p>
+        </w:tc>
+        <w:tc>
+          <w:tcPr>
+            <w:tcW w:type="dxa" w:w="1300"/>
+            <w:shd w:fill="F4F6FB" w:color="auto" w:val="clear"/>
+            <w:tcMar>
+              <w:top w:type="dxa" w:w="50"/>
+              <w:left w:type="dxa" w:w="90"/>
+              <w:bottom w:type="dxa" w:w="50"/>
+              <w:right w:type="dxa" w:w="90"/>
+            </w:tcMar>
+          </w:tcPr>
+          <w:p>
+            <w:pPr>
+              <w:spacing w:after="0" w:line="250"/>
+            </w:pPr>
+            <w:r>
+              <w:rPr>
+                <w:rFonts w:ascii="Calibri" w:cs="Calibri" w:eastAsia="Calibri" w:hAnsi="Calibri"/>
+                <w:b w:val="false"/>
+                <w:bCs w:val="false"/>
+                <w:color w:val="23272F"/>
+                <w:sz w:val="18"/>
+                <w:szCs w:val="18"/>
+              </w:rPr>
+              <w:t xml:space="preserve">Sim</w:t>
+            </w:r>
+          </w:p>
+        </w:tc>
+        <w:tc>
+          <w:tcPr>
+            <w:tcW w:type="dxa" w:w="1300"/>
+            <w:shd w:fill="F4F6FB" w:color="auto" w:val="clear"/>
+            <w:tcMar>
+              <w:top w:type="dxa" w:w="50"/>
+              <w:left w:type="dxa" w:w="90"/>
+              <w:bottom w:type="dxa" w:w="50"/>
+              <w:right w:type="dxa" w:w="90"/>
+            </w:tcMar>
+          </w:tcPr>
+          <w:p>
+            <w:pPr>
+              <w:spacing w:after="0" w:line="250"/>
+            </w:pPr>
+            <w:r>
+              <w:rPr>
+                <w:rFonts w:ascii="Calibri" w:cs="Calibri" w:eastAsia="Calibri" w:hAnsi="Calibri"/>
+                <w:b w:val="false"/>
+                <w:bCs w:val="false"/>
+                <w:color w:val="23272F"/>
+                <w:sz w:val="18"/>
+                <w:szCs w:val="18"/>
+              </w:rPr>
+              <w:t xml:space="preserve">Sim</w:t>
+            </w:r>
+          </w:p>
+        </w:tc>
+        <w:tc>
+          <w:tcPr>
+            <w:tcW w:type="dxa" w:w="1300"/>
+            <w:shd w:fill="F4F6FB" w:color="auto" w:val="clear"/>
+            <w:tcMar>
+              <w:top w:type="dxa" w:w="50"/>
+              <w:left w:type="dxa" w:w="90"/>
+              <w:bottom w:type="dxa" w:w="50"/>
+              <w:right w:type="dxa" w:w="90"/>
+            </w:tcMar>
+          </w:tcPr>
+          <w:p>
+            <w:pPr>
+              <w:spacing w:after="0" w:line="250"/>
+            </w:pPr>
+            <w:r>
+              <w:rPr>
+                <w:rFonts w:ascii="Calibri" w:cs="Calibri" w:eastAsia="Calibri" w:hAnsi="Calibri"/>
+                <w:b w:val="false"/>
+                <w:bCs w:val="false"/>
+                <w:color w:val="23272F"/>
+                <w:sz w:val="18"/>
+                <w:szCs w:val="18"/>
+              </w:rPr>
+              <w:t xml:space="preserve">Não</w:t>
+            </w:r>
+          </w:p>
+        </w:tc>
+        <w:tc>
+          <w:tcPr>
+            <w:tcW w:type="dxa" w:w="1300"/>
+            <w:shd w:fill="F4F6FB" w:color="auto" w:val="clear"/>
+            <w:tcMar>
+              <w:top w:type="dxa" w:w="50"/>
+              <w:left w:type="dxa" w:w="90"/>
+              <w:bottom w:type="dxa" w:w="50"/>
+              <w:right w:type="dxa" w:w="90"/>
+            </w:tcMar>
+          </w:tcPr>
+          <w:p>
+            <w:pPr>
+              <w:spacing w:after="0" w:line="250"/>
+            </w:pPr>
+            <w:r>
+              <w:rPr>
+                <w:rFonts w:ascii="Calibri" w:cs="Calibri" w:eastAsia="Calibri" w:hAnsi="Calibri"/>
+                <w:b w:val="false"/>
+                <w:bCs w:val="false"/>
+                <w:color w:val="23272F"/>
+                <w:sz w:val="18"/>
+                <w:szCs w:val="18"/>
+              </w:rPr>
+              <w:t xml:space="preserve">Não</w:t>
+            </w:r>
+          </w:p>
+        </w:tc>
+      </w:tr>
+      <w:tr>
+        <w:tc>
+          <w:tcPr>
+            <w:tcW w:type="dxa" w:w="3020"/>
+            <w:shd w:fill="FFFFFF" w:color="auto" w:val="clear"/>
+            <w:tcMar>
+              <w:top w:type="dxa" w:w="50"/>
+              <w:left w:type="dxa" w:w="90"/>
+              <w:bottom w:type="dxa" w:w="50"/>
+              <w:right w:type="dxa" w:w="90"/>
+            </w:tcMar>
+          </w:tcPr>
+          <w:p>
+            <w:pPr>
+              <w:spacing w:after="0" w:line="250"/>
+            </w:pPr>
+            <w:r>
+              <w:rPr>
+                <w:rFonts w:ascii="Calibri" w:cs="Calibri" w:eastAsia="Calibri" w:hAnsi="Calibri"/>
+                <w:color w:val="23272F"/>
+                <w:sz w:val="18"/>
+                <w:szCs w:val="18"/>
+              </w:rPr>
+              <w:t xml:space="preserve">Visualizar ASO</w:t>
+            </w:r>
+          </w:p>
+        </w:tc>
+        <w:tc>
+          <w:tcPr>
+            <w:tcW w:type="dxa" w:w="1300"/>
+            <w:shd w:fill="FFFFFF" w:color="auto" w:val="clear"/>
+            <w:tcMar>
+              <w:top w:type="dxa" w:w="50"/>
+              <w:left w:type="dxa" w:w="90"/>
+              <w:bottom w:type="dxa" w:w="50"/>
+              <w:right w:type="dxa" w:w="90"/>
+            </w:tcMar>
+          </w:tcPr>
+          <w:p>
+            <w:pPr>
+              <w:spacing w:after="0" w:line="250"/>
+            </w:pPr>
+            <w:r>
+              <w:rPr>
+                <w:rFonts w:ascii="Calibri" w:cs="Calibri" w:eastAsia="Calibri" w:hAnsi="Calibri"/>
+                <w:b w:val="false"/>
+                <w:bCs w:val="false"/>
+                <w:color w:val="23272F"/>
+                <w:sz w:val="18"/>
+                <w:szCs w:val="18"/>
+              </w:rPr>
+              <w:t xml:space="preserve">Sim</w:t>
+            </w:r>
+          </w:p>
+        </w:tc>
+        <w:tc>
+          <w:tcPr>
+            <w:tcW w:type="dxa" w:w="1300"/>
+            <w:shd w:fill="FFFFFF" w:color="auto" w:val="clear"/>
+            <w:tcMar>
+              <w:top w:type="dxa" w:w="50"/>
+              <w:left w:type="dxa" w:w="90"/>
+              <w:bottom w:type="dxa" w:w="50"/>
+              <w:right w:type="dxa" w:w="90"/>
+            </w:tcMar>
+          </w:tcPr>
+          <w:p>
+            <w:pPr>
+              <w:spacing w:after="0" w:line="250"/>
+            </w:pPr>
+            <w:r>
+              <w:rPr>
+                <w:rFonts w:ascii="Calibri" w:cs="Calibri" w:eastAsia="Calibri" w:hAnsi="Calibri"/>
+                <w:b w:val="false"/>
+                <w:bCs w:val="false"/>
+                <w:color w:val="23272F"/>
+                <w:sz w:val="18"/>
+                <w:szCs w:val="18"/>
+              </w:rPr>
+              <w:t xml:space="preserve">Não</w:t>
+            </w:r>
+          </w:p>
+        </w:tc>
+        <w:tc>
+          <w:tcPr>
+            <w:tcW w:type="dxa" w:w="1300"/>
+            <w:shd w:fill="FFFFFF" w:color="auto" w:val="clear"/>
+            <w:tcMar>
+              <w:top w:type="dxa" w:w="50"/>
+              <w:left w:type="dxa" w:w="90"/>
+              <w:bottom w:type="dxa" w:w="50"/>
+              <w:right w:type="dxa" w:w="90"/>
+            </w:tcMar>
+          </w:tcPr>
+          <w:p>
+            <w:pPr>
+              <w:spacing w:after="0" w:line="250"/>
+            </w:pPr>
+            <w:r>
+              <w:rPr>
+                <w:rFonts w:ascii="Calibri" w:cs="Calibri" w:eastAsia="Calibri" w:hAnsi="Calibri"/>
+                <w:b w:val="false"/>
+                <w:bCs w:val="false"/>
+                <w:color w:val="23272F"/>
+                <w:sz w:val="18"/>
+                <w:szCs w:val="18"/>
+              </w:rPr>
+              <w:t xml:space="preserve">Sim</w:t>
+            </w:r>
+          </w:p>
+        </w:tc>
+        <w:tc>
+          <w:tcPr>
+            <w:tcW w:type="dxa" w:w="1300"/>
+            <w:shd w:fill="FFFFFF" w:color="auto" w:val="clear"/>
+            <w:tcMar>
+              <w:top w:type="dxa" w:w="50"/>
+              <w:left w:type="dxa" w:w="90"/>
+              <w:bottom w:type="dxa" w:w="50"/>
+              <w:right w:type="dxa" w:w="90"/>
+            </w:tcMar>
+          </w:tcPr>
+          <w:p>
+            <w:pPr>
+              <w:spacing w:after="0" w:line="250"/>
+            </w:pPr>
+            <w:r>
+              <w:rPr>
+                <w:rFonts w:ascii="Calibri" w:cs="Calibri" w:eastAsia="Calibri" w:hAnsi="Calibri"/>
+                <w:b w:val="false"/>
+                <w:bCs w:val="false"/>
+                <w:color w:val="23272F"/>
+                <w:sz w:val="18"/>
+                <w:szCs w:val="18"/>
+              </w:rPr>
+              <w:t xml:space="preserve">Não</w:t>
+            </w:r>
+          </w:p>
+        </w:tc>
+      </w:tr>
+      <w:tr>
+        <w:tc>
+          <w:tcPr>
+            <w:tcW w:type="dxa" w:w="3020"/>
+            <w:shd w:fill="F4F6FB" w:color="auto" w:val="clear"/>
+            <w:tcMar>
+              <w:top w:type="dxa" w:w="50"/>
+              <w:left w:type="dxa" w:w="90"/>
+              <w:bottom w:type="dxa" w:w="50"/>
+              <w:right w:type="dxa" w:w="90"/>
+            </w:tcMar>
+          </w:tcPr>
+          <w:p>
+            <w:pPr>
+              <w:spacing w:after="0" w:line="250"/>
+            </w:pPr>
+            <w:r>
+              <w:rPr>
+                <w:rFonts w:ascii="Calibri" w:cs="Calibri" w:eastAsia="Calibri" w:hAnsi="Calibri"/>
+                <w:color w:val="23272F"/>
+                <w:sz w:val="18"/>
+                <w:szCs w:val="18"/>
+              </w:rPr>
+              <w:t xml:space="preserve">Inserir / editar ASO</w:t>
+            </w:r>
+          </w:p>
+        </w:tc>
+        <w:tc>
+          <w:tcPr>
+            <w:tcW w:type="dxa" w:w="1300"/>
+            <w:shd w:fill="F4F6FB" w:color="auto" w:val="clear"/>
+            <w:tcMar>
+              <w:top w:type="dxa" w:w="50"/>
+              <w:left w:type="dxa" w:w="90"/>
+              <w:bottom w:type="dxa" w:w="50"/>
+              <w:right w:type="dxa" w:w="90"/>
+            </w:tcMar>
+          </w:tcPr>
+          <w:p>
+            <w:pPr>
+              <w:spacing w:after="0" w:line="250"/>
+            </w:pPr>
+            <w:r>
+              <w:rPr>
+                <w:rFonts w:ascii="Calibri" w:cs="Calibri" w:eastAsia="Calibri" w:hAnsi="Calibri"/>
+                <w:b w:val="false"/>
+                <w:bCs w:val="false"/>
+                <w:color w:val="23272F"/>
+                <w:sz w:val="18"/>
+                <w:szCs w:val="18"/>
+              </w:rPr>
+              <w:t xml:space="preserve">Não</w:t>
+            </w:r>
+          </w:p>
+        </w:tc>
+        <w:tc>
+          <w:tcPr>
+            <w:tcW w:type="dxa" w:w="1300"/>
+            <w:shd w:fill="F4F6FB" w:color="auto" w:val="clear"/>
+            <w:tcMar>
+              <w:top w:type="dxa" w:w="50"/>
+              <w:left w:type="dxa" w:w="90"/>
+              <w:bottom w:type="dxa" w:w="50"/>
+              <w:right w:type="dxa" w:w="90"/>
+            </w:tcMar>
+          </w:tcPr>
+          <w:p>
+            <w:pPr>
+              <w:spacing w:after="0" w:line="250"/>
+            </w:pPr>
+            <w:r>
+              <w:rPr>
+                <w:rFonts w:ascii="Calibri" w:cs="Calibri" w:eastAsia="Calibri" w:hAnsi="Calibri"/>
+                <w:b w:val="false"/>
+                <w:bCs w:val="false"/>
+                <w:color w:val="23272F"/>
+                <w:sz w:val="18"/>
+                <w:szCs w:val="18"/>
+              </w:rPr>
+              <w:t xml:space="preserve">Não</w:t>
+            </w:r>
+          </w:p>
+        </w:tc>
+        <w:tc>
+          <w:tcPr>
+            <w:tcW w:type="dxa" w:w="1300"/>
+            <w:shd w:fill="F4F6FB" w:color="auto" w:val="clear"/>
+            <w:tcMar>
+              <w:top w:type="dxa" w:w="50"/>
+              <w:left w:type="dxa" w:w="90"/>
+              <w:bottom w:type="dxa" w:w="50"/>
+              <w:right w:type="dxa" w:w="90"/>
+            </w:tcMar>
+          </w:tcPr>
+          <w:p>
+            <w:pPr>
+              <w:spacing w:after="0" w:line="250"/>
+            </w:pPr>
+            <w:r>
+              <w:rPr>
+                <w:rFonts w:ascii="Calibri" w:cs="Calibri" w:eastAsia="Calibri" w:hAnsi="Calibri"/>
+                <w:b w:val="false"/>
+                <w:bCs w:val="false"/>
+                <w:color w:val="23272F"/>
+                <w:sz w:val="18"/>
+                <w:szCs w:val="18"/>
+              </w:rPr>
+              <w:t xml:space="preserve">Sim</w:t>
+            </w:r>
+          </w:p>
+        </w:tc>
+        <w:tc>
+          <w:tcPr>
+            <w:tcW w:type="dxa" w:w="1300"/>
+            <w:shd w:fill="F4F6FB" w:color="auto" w:val="clear"/>
+            <w:tcMar>
+              <w:top w:type="dxa" w:w="50"/>
+              <w:left w:type="dxa" w:w="90"/>
+              <w:bottom w:type="dxa" w:w="50"/>
+              <w:right w:type="dxa" w:w="90"/>
+            </w:tcMar>
+          </w:tcPr>
+          <w:p>
+            <w:pPr>
+              <w:spacing w:after="0" w:line="250"/>
+            </w:pPr>
+            <w:r>
+              <w:rPr>
+                <w:rFonts w:ascii="Calibri" w:cs="Calibri" w:eastAsia="Calibri" w:hAnsi="Calibri"/>
+                <w:b w:val="false"/>
+                <w:bCs w:val="false"/>
+                <w:color w:val="23272F"/>
+                <w:sz w:val="18"/>
+                <w:szCs w:val="18"/>
+              </w:rPr>
+              <w:t xml:space="preserve">Não</w:t>
+            </w:r>
+          </w:p>
+        </w:tc>
+      </w:tr>
+      <w:tr>
+        <w:tc>
+          <w:tcPr>
+            <w:tcW w:type="dxa" w:w="3020"/>
+            <w:shd w:fill="FFFFFF" w:color="auto" w:val="clear"/>
+            <w:tcMar>
+              <w:top w:type="dxa" w:w="50"/>
+              <w:left w:type="dxa" w:w="90"/>
+              <w:bottom w:type="dxa" w:w="50"/>
+              <w:right w:type="dxa" w:w="90"/>
+            </w:tcMar>
+          </w:tcPr>
+          <w:p>
+            <w:pPr>
+              <w:spacing w:after="0" w:line="250"/>
+            </w:pPr>
+            <w:r>
+              <w:rPr>
+                <w:rFonts w:ascii="Calibri" w:cs="Calibri" w:eastAsia="Calibri" w:hAnsi="Calibri"/>
+                <w:color w:val="23272F"/>
+                <w:sz w:val="18"/>
+                <w:szCs w:val="18"/>
+              </w:rPr>
+              <w:t xml:space="preserve">Gerir treinamentos</w:t>
+            </w:r>
+          </w:p>
+        </w:tc>
+        <w:tc>
+          <w:tcPr>
+            <w:tcW w:type="dxa" w:w="1300"/>
+            <w:shd w:fill="FFFFFF" w:color="auto" w:val="clear"/>
+            <w:tcMar>
+              <w:top w:type="dxa" w:w="50"/>
+              <w:left w:type="dxa" w:w="90"/>
+              <w:bottom w:type="dxa" w:w="50"/>
+              <w:right w:type="dxa" w:w="90"/>
+            </w:tcMar>
+          </w:tcPr>
+          <w:p>
+            <w:pPr>
+              <w:spacing w:after="0" w:line="250"/>
+            </w:pPr>
+            <w:r>
+              <w:rPr>
+                <w:rFonts w:ascii="Calibri" w:cs="Calibri" w:eastAsia="Calibri" w:hAnsi="Calibri"/>
+                <w:b w:val="false"/>
+                <w:bCs w:val="false"/>
+                <w:color w:val="23272F"/>
+                <w:sz w:val="18"/>
+                <w:szCs w:val="18"/>
+              </w:rPr>
+              <w:t xml:space="preserve">Sim</w:t>
+            </w:r>
+          </w:p>
+        </w:tc>
+        <w:tc>
+          <w:tcPr>
+            <w:tcW w:type="dxa" w:w="1300"/>
+            <w:shd w:fill="FFFFFF" w:color="auto" w:val="clear"/>
+            <w:tcMar>
+              <w:top w:type="dxa" w:w="50"/>
+              <w:left w:type="dxa" w:w="90"/>
+              <w:bottom w:type="dxa" w:w="50"/>
+              <w:right w:type="dxa" w:w="90"/>
+            </w:tcMar>
+          </w:tcPr>
+          <w:p>
+            <w:pPr>
+              <w:spacing w:after="0" w:line="250"/>
+            </w:pPr>
+            <w:r>
+              <w:rPr>
+                <w:rFonts w:ascii="Calibri" w:cs="Calibri" w:eastAsia="Calibri" w:hAnsi="Calibri"/>
+                <w:b w:val="false"/>
+                <w:bCs w:val="false"/>
+                <w:color w:val="23272F"/>
+                <w:sz w:val="18"/>
+                <w:szCs w:val="18"/>
+              </w:rPr>
+              <w:t xml:space="preserve">Não</w:t>
+            </w:r>
+          </w:p>
+        </w:tc>
+        <w:tc>
+          <w:tcPr>
+            <w:tcW w:type="dxa" w:w="1300"/>
+            <w:shd w:fill="FFFFFF" w:color="auto" w:val="clear"/>
+            <w:tcMar>
+              <w:top w:type="dxa" w:w="50"/>
+              <w:left w:type="dxa" w:w="90"/>
+              <w:bottom w:type="dxa" w:w="50"/>
+              <w:right w:type="dxa" w:w="90"/>
+            </w:tcMar>
+          </w:tcPr>
+          <w:p>
+            <w:pPr>
+              <w:spacing w:after="0" w:line="250"/>
+            </w:pPr>
+            <w:r>
+              <w:rPr>
+                <w:rFonts w:ascii="Calibri" w:cs="Calibri" w:eastAsia="Calibri" w:hAnsi="Calibri"/>
+                <w:b w:val="false"/>
+                <w:bCs w:val="false"/>
+                <w:color w:val="23272F"/>
+                <w:sz w:val="18"/>
+                <w:szCs w:val="18"/>
+              </w:rPr>
+              <w:t xml:space="preserve">Não</w:t>
+            </w:r>
+          </w:p>
+        </w:tc>
+        <w:tc>
+          <w:tcPr>
+            <w:tcW w:type="dxa" w:w="1300"/>
+            <w:shd w:fill="FFFFFF" w:color="auto" w:val="clear"/>
+            <w:tcMar>
+              <w:top w:type="dxa" w:w="50"/>
+              <w:left w:type="dxa" w:w="90"/>
+              <w:bottom w:type="dxa" w:w="50"/>
+              <w:right w:type="dxa" w:w="90"/>
+            </w:tcMar>
+          </w:tcPr>
+          <w:p>
+            <w:pPr>
+              <w:spacing w:after="0" w:line="250"/>
+            </w:pPr>
+            <w:r>
+              <w:rPr>
+                <w:rFonts w:ascii="Calibri" w:cs="Calibri" w:eastAsia="Calibri" w:hAnsi="Calibri"/>
+                <w:b w:val="false"/>
+                <w:bCs w:val="false"/>
+                <w:color w:val="23272F"/>
+                <w:sz w:val="18"/>
+                <w:szCs w:val="18"/>
+              </w:rPr>
+              <w:t xml:space="preserve">Não</w:t>
+            </w:r>
+          </w:p>
+        </w:tc>
+      </w:tr>
+      <w:tr>
+        <w:tc>
+          <w:tcPr>
+            <w:tcW w:type="dxa" w:w="3020"/>
+            <w:shd w:fill="F4F6FB" w:color="auto" w:val="clear"/>
+            <w:tcMar>
+              <w:top w:type="dxa" w:w="50"/>
+              <w:left w:type="dxa" w:w="90"/>
+              <w:bottom w:type="dxa" w:w="50"/>
+              <w:right w:type="dxa" w:w="90"/>
+            </w:tcMar>
+          </w:tcPr>
+          <w:p>
+            <w:pPr>
+              <w:spacing w:after="0" w:line="250"/>
+            </w:pPr>
+            <w:r>
+              <w:rPr>
+                <w:rFonts w:ascii="Calibri" w:cs="Calibri" w:eastAsia="Calibri" w:hAnsi="Calibri"/>
+                <w:color w:val="23272F"/>
+                <w:sz w:val="18"/>
+                <w:szCs w:val="18"/>
+              </w:rPr>
+              <w:t xml:space="preserve">Gerir colaboradores</w:t>
+            </w:r>
+          </w:p>
+        </w:tc>
+        <w:tc>
+          <w:tcPr>
+            <w:tcW w:type="dxa" w:w="1300"/>
+            <w:shd w:fill="F4F6FB" w:color="auto" w:val="clear"/>
+            <w:tcMar>
+              <w:top w:type="dxa" w:w="50"/>
+              <w:left w:type="dxa" w:w="90"/>
+              <w:bottom w:type="dxa" w:w="50"/>
+              <w:right w:type="dxa" w:w="90"/>
+            </w:tcMar>
+          </w:tcPr>
+          <w:p>
+            <w:pPr>
+              <w:spacing w:after="0" w:line="250"/>
+            </w:pPr>
+            <w:r>
+              <w:rPr>
+                <w:rFonts w:ascii="Calibri" w:cs="Calibri" w:eastAsia="Calibri" w:hAnsi="Calibri"/>
+                <w:b w:val="false"/>
+                <w:bCs w:val="false"/>
+                <w:color w:val="23272F"/>
+                <w:sz w:val="18"/>
+                <w:szCs w:val="18"/>
+              </w:rPr>
+              <w:t xml:space="preserve">Sim</w:t>
+            </w:r>
+          </w:p>
+        </w:tc>
+        <w:tc>
+          <w:tcPr>
+            <w:tcW w:type="dxa" w:w="1300"/>
+            <w:shd w:fill="F4F6FB" w:color="auto" w:val="clear"/>
+            <w:tcMar>
+              <w:top w:type="dxa" w:w="50"/>
+              <w:left w:type="dxa" w:w="90"/>
+              <w:bottom w:type="dxa" w:w="50"/>
+              <w:right w:type="dxa" w:w="90"/>
+            </w:tcMar>
+          </w:tcPr>
+          <w:p>
+            <w:pPr>
+              <w:spacing w:after="0" w:line="250"/>
+            </w:pPr>
+            <w:r>
+              <w:rPr>
+                <w:rFonts w:ascii="Calibri" w:cs="Calibri" w:eastAsia="Calibri" w:hAnsi="Calibri"/>
+                <w:b w:val="false"/>
+                <w:bCs w:val="false"/>
+                <w:color w:val="23272F"/>
+                <w:sz w:val="18"/>
+                <w:szCs w:val="18"/>
+              </w:rPr>
+              <w:t xml:space="preserve">Sim</w:t>
+            </w:r>
+          </w:p>
+        </w:tc>
+        <w:tc>
+          <w:tcPr>
+            <w:tcW w:type="dxa" w:w="1300"/>
+            <w:shd w:fill="F4F6FB" w:color="auto" w:val="clear"/>
+            <w:tcMar>
+              <w:top w:type="dxa" w:w="50"/>
+              <w:left w:type="dxa" w:w="90"/>
+              <w:bottom w:type="dxa" w:w="50"/>
+              <w:right w:type="dxa" w:w="90"/>
+            </w:tcMar>
+          </w:tcPr>
+          <w:p>
+            <w:pPr>
+              <w:spacing w:after="0" w:line="250"/>
+            </w:pPr>
+            <w:r>
+              <w:rPr>
+                <w:rFonts w:ascii="Calibri" w:cs="Calibri" w:eastAsia="Calibri" w:hAnsi="Calibri"/>
+                <w:b w:val="false"/>
+                <w:bCs w:val="false"/>
+                <w:color w:val="23272F"/>
+                <w:sz w:val="18"/>
+                <w:szCs w:val="18"/>
+              </w:rPr>
+              <w:t xml:space="preserve">Não</w:t>
+            </w:r>
+          </w:p>
+        </w:tc>
+        <w:tc>
+          <w:tcPr>
+            <w:tcW w:type="dxa" w:w="1300"/>
+            <w:shd w:fill="F4F6FB" w:color="auto" w:val="clear"/>
+            <w:tcMar>
+              <w:top w:type="dxa" w:w="50"/>
+              <w:left w:type="dxa" w:w="90"/>
+              <w:bottom w:type="dxa" w:w="50"/>
+              <w:right w:type="dxa" w:w="90"/>
+            </w:tcMar>
+          </w:tcPr>
+          <w:p>
+            <w:pPr>
+              <w:spacing w:after="0" w:line="250"/>
+            </w:pPr>
+            <w:r>
+              <w:rPr>
+                <w:rFonts w:ascii="Calibri" w:cs="Calibri" w:eastAsia="Calibri" w:hAnsi="Calibri"/>
+                <w:b w:val="false"/>
+                <w:bCs w:val="false"/>
+                <w:color w:val="23272F"/>
+                <w:sz w:val="18"/>
+                <w:szCs w:val="18"/>
+              </w:rPr>
+              <w:t xml:space="preserve">Não</w:t>
+            </w:r>
+          </w:p>
+        </w:tc>
+      </w:tr>
+      <w:tr>
+        <w:tc>
+          <w:tcPr>
+            <w:tcW w:type="dxa" w:w="3020"/>
+            <w:shd w:fill="FFFFFF" w:color="auto" w:val="clear"/>
+            <w:tcMar>
+              <w:top w:type="dxa" w:w="50"/>
+              <w:left w:type="dxa" w:w="90"/>
+              <w:bottom w:type="dxa" w:w="50"/>
+              <w:right w:type="dxa" w:w="90"/>
+            </w:tcMar>
+          </w:tcPr>
+          <w:p>
+            <w:pPr>
+              <w:spacing w:after="0" w:line="250"/>
+            </w:pPr>
+            <w:r>
+              <w:rPr>
+                <w:rFonts w:ascii="Calibri" w:cs="Calibri" w:eastAsia="Calibri" w:hAnsi="Calibri"/>
+                <w:color w:val="23272F"/>
+                <w:sz w:val="18"/>
+                <w:szCs w:val="18"/>
+              </w:rPr>
+              <w:t xml:space="preserve">Gerir usuários</w:t>
+            </w:r>
+          </w:p>
+        </w:tc>
+        <w:tc>
+          <w:tcPr>
+            <w:tcW w:type="dxa" w:w="1300"/>
+            <w:shd w:fill="FFFFFF" w:color="auto" w:val="clear"/>
+            <w:tcMar>
+              <w:top w:type="dxa" w:w="50"/>
+              <w:left w:type="dxa" w:w="90"/>
+              <w:bottom w:type="dxa" w:w="50"/>
+              <w:right w:type="dxa" w:w="90"/>
+            </w:tcMar>
+          </w:tcPr>
+          <w:p>
+            <w:pPr>
+              <w:spacing w:after="0" w:line="250"/>
+            </w:pPr>
+            <w:r>
+              <w:rPr>
+                <w:rFonts w:ascii="Calibri" w:cs="Calibri" w:eastAsia="Calibri" w:hAnsi="Calibri"/>
+                <w:b w:val="false"/>
+                <w:bCs w:val="false"/>
+                <w:color w:val="23272F"/>
+                <w:sz w:val="18"/>
+                <w:szCs w:val="18"/>
+              </w:rPr>
+              <w:t xml:space="preserve">Sim</w:t>
+            </w:r>
+          </w:p>
+        </w:tc>
+        <w:tc>
+          <w:tcPr>
+            <w:tcW w:type="dxa" w:w="1300"/>
+            <w:shd w:fill="FFFFFF" w:color="auto" w:val="clear"/>
+            <w:tcMar>
+              <w:top w:type="dxa" w:w="50"/>
+              <w:left w:type="dxa" w:w="90"/>
+              <w:bottom w:type="dxa" w:w="50"/>
+              <w:right w:type="dxa" w:w="90"/>
+            </w:tcMar>
+          </w:tcPr>
+          <w:p>
+            <w:pPr>
+              <w:spacing w:after="0" w:line="250"/>
+            </w:pPr>
+            <w:r>
+              <w:rPr>
+                <w:rFonts w:ascii="Calibri" w:cs="Calibri" w:eastAsia="Calibri" w:hAnsi="Calibri"/>
+                <w:b w:val="false"/>
+                <w:bCs w:val="false"/>
+                <w:color w:val="23272F"/>
+                <w:sz w:val="18"/>
+                <w:szCs w:val="18"/>
+              </w:rPr>
+              <w:t xml:space="preserve">Não</w:t>
+            </w:r>
+          </w:p>
+        </w:tc>
+        <w:tc>
+          <w:tcPr>
+            <w:tcW w:type="dxa" w:w="1300"/>
+            <w:shd w:fill="FFFFFF" w:color="auto" w:val="clear"/>
+            <w:tcMar>
+              <w:top w:type="dxa" w:w="50"/>
+              <w:left w:type="dxa" w:w="90"/>
+              <w:bottom w:type="dxa" w:w="50"/>
+              <w:right w:type="dxa" w:w="90"/>
+            </w:tcMar>
+          </w:tcPr>
+          <w:p>
+            <w:pPr>
+              <w:spacing w:after="0" w:line="250"/>
+            </w:pPr>
+            <w:r>
+              <w:rPr>
+                <w:rFonts w:ascii="Calibri" w:cs="Calibri" w:eastAsia="Calibri" w:hAnsi="Calibri"/>
+                <w:b w:val="false"/>
+                <w:bCs w:val="false"/>
+                <w:color w:val="23272F"/>
+                <w:sz w:val="18"/>
+                <w:szCs w:val="18"/>
+              </w:rPr>
+              <w:t xml:space="preserve">Não</w:t>
+            </w:r>
+          </w:p>
+        </w:tc>
+        <w:tc>
+          <w:tcPr>
+            <w:tcW w:type="dxa" w:w="1300"/>
+            <w:shd w:fill="FFFFFF" w:color="auto" w:val="clear"/>
+            <w:tcMar>
+              <w:top w:type="dxa" w:w="50"/>
+              <w:left w:type="dxa" w:w="90"/>
+              <w:bottom w:type="dxa" w:w="50"/>
+              <w:right w:type="dxa" w:w="90"/>
+            </w:tcMar>
+          </w:tcPr>
+          <w:p>
+            <w:pPr>
+              <w:spacing w:after="0" w:line="250"/>
+            </w:pPr>
+            <w:r>
+              <w:rPr>
+                <w:rFonts w:ascii="Calibri" w:cs="Calibri" w:eastAsia="Calibri" w:hAnsi="Calibri"/>
+                <w:b w:val="false"/>
+                <w:bCs w:val="false"/>
+                <w:color w:val="23272F"/>
+                <w:sz w:val="18"/>
+                <w:szCs w:val="18"/>
+              </w:rPr>
+              <w:t xml:space="preserve">Não</w:t>
+            </w:r>
+          </w:p>
+        </w:tc>
+      </w:tr>
+      <w:tr>
+        <w:tc>
+          <w:tcPr>
+            <w:tcW w:type="dxa" w:w="3020"/>
+            <w:shd w:fill="F4F6FB" w:color="auto" w:val="clear"/>
+            <w:tcMar>
+              <w:top w:type="dxa" w:w="50"/>
+              <w:left w:type="dxa" w:w="90"/>
+              <w:bottom w:type="dxa" w:w="50"/>
+              <w:right w:type="dxa" w:w="90"/>
+            </w:tcMar>
+          </w:tcPr>
+          <w:p>
+            <w:pPr>
+              <w:spacing w:after="0" w:line="250"/>
+            </w:pPr>
+            <w:r>
+              <w:rPr>
+                <w:rFonts w:ascii="Calibri" w:cs="Calibri" w:eastAsia="Calibri" w:hAnsi="Calibri"/>
+                <w:color w:val="23272F"/>
+                <w:sz w:val="18"/>
+                <w:szCs w:val="18"/>
+              </w:rPr>
+              <w:t xml:space="preserve">Ver auditoria</w:t>
+            </w:r>
+          </w:p>
+        </w:tc>
+        <w:tc>
+          <w:tcPr>
+            <w:tcW w:type="dxa" w:w="1300"/>
+            <w:shd w:fill="F4F6FB" w:color="auto" w:val="clear"/>
+            <w:tcMar>
+              <w:top w:type="dxa" w:w="50"/>
+              <w:left w:type="dxa" w:w="90"/>
+              <w:bottom w:type="dxa" w:w="50"/>
+              <w:right w:type="dxa" w:w="90"/>
+            </w:tcMar>
+          </w:tcPr>
+          <w:p>
+            <w:pPr>
+              <w:spacing w:after="0" w:line="250"/>
+            </w:pPr>
+            <w:r>
+              <w:rPr>
+                <w:rFonts w:ascii="Calibri" w:cs="Calibri" w:eastAsia="Calibri" w:hAnsi="Calibri"/>
+                <w:b w:val="false"/>
+                <w:bCs w:val="false"/>
+                <w:color w:val="23272F"/>
+                <w:sz w:val="18"/>
+                <w:szCs w:val="18"/>
+              </w:rPr>
+              <w:t xml:space="preserve">Sim</w:t>
+            </w:r>
+          </w:p>
+        </w:tc>
+        <w:tc>
+          <w:tcPr>
+            <w:tcW w:type="dxa" w:w="1300"/>
+            <w:shd w:fill="F4F6FB" w:color="auto" w:val="clear"/>
+            <w:tcMar>
+              <w:top w:type="dxa" w:w="50"/>
+              <w:left w:type="dxa" w:w="90"/>
+              <w:bottom w:type="dxa" w:w="50"/>
+              <w:right w:type="dxa" w:w="90"/>
+            </w:tcMar>
+          </w:tcPr>
+          <w:p>
+            <w:pPr>
+              <w:spacing w:after="0" w:line="250"/>
+            </w:pPr>
+            <w:r>
+              <w:rPr>
+                <w:rFonts w:ascii="Calibri" w:cs="Calibri" w:eastAsia="Calibri" w:hAnsi="Calibri"/>
+                <w:b w:val="false"/>
+                <w:bCs w:val="false"/>
+                <w:color w:val="23272F"/>
+                <w:sz w:val="18"/>
+                <w:szCs w:val="18"/>
+              </w:rPr>
+              <w:t xml:space="preserve">Não</w:t>
+            </w:r>
+          </w:p>
+        </w:tc>
+        <w:tc>
+          <w:tcPr>
+            <w:tcW w:type="dxa" w:w="1300"/>
+            <w:shd w:fill="F4F6FB" w:color="auto" w:val="clear"/>
+            <w:tcMar>
+              <w:top w:type="dxa" w:w="50"/>
+              <w:left w:type="dxa" w:w="90"/>
+              <w:bottom w:type="dxa" w:w="50"/>
+              <w:right w:type="dxa" w:w="90"/>
+            </w:tcMar>
+          </w:tcPr>
+          <w:p>
+            <w:pPr>
+              <w:spacing w:after="0" w:line="250"/>
+            </w:pPr>
+            <w:r>
+              <w:rPr>
+                <w:rFonts w:ascii="Calibri" w:cs="Calibri" w:eastAsia="Calibri" w:hAnsi="Calibri"/>
+                <w:b w:val="false"/>
+                <w:bCs w:val="false"/>
+                <w:color w:val="23272F"/>
+                <w:sz w:val="18"/>
+                <w:szCs w:val="18"/>
+              </w:rPr>
+              <w:t xml:space="preserve">Não</w:t>
+            </w:r>
+          </w:p>
+        </w:tc>
+        <w:tc>
+          <w:tcPr>
+            <w:tcW w:type="dxa" w:w="1300"/>
+            <w:shd w:fill="F4F6FB" w:color="auto" w:val="clear"/>
+            <w:tcMar>
+              <w:top w:type="dxa" w:w="50"/>
+              <w:left w:type="dxa" w:w="90"/>
+              <w:bottom w:type="dxa" w:w="50"/>
+              <w:right w:type="dxa" w:w="90"/>
+            </w:tcMar>
+          </w:tcPr>
+          <w:p>
+            <w:pPr>
+              <w:spacing w:after="0" w:line="250"/>
+            </w:pPr>
+            <w:r>
+              <w:rPr>
+                <w:rFonts w:ascii="Calibri" w:cs="Calibri" w:eastAsia="Calibri" w:hAnsi="Calibri"/>
+                <w:b w:val="false"/>
+                <w:bCs w:val="false"/>
+                <w:color w:val="23272F"/>
+                <w:sz w:val="18"/>
+                <w:szCs w:val="18"/>
+              </w:rPr>
+              <w:t xml:space="preserve">Não</w:t>
+            </w:r>
+          </w:p>
+        </w:tc>
+      </w:tr>
+    </w:tbl>
+    <w:p>
+      <w:pPr>
+        <w:spacing w:after="120" w:before="0" w:line="276"/>
+      </w:pPr>
+      <w:r>
+        <w:rPr>
+          <w:rFonts w:ascii="Calibri" w:cs="Calibri" w:eastAsia="Calibri" w:hAnsi="Calibri"/>
+          <w:i/>
+          <w:iCs/>
+          <w:color w:val="5B6478"/>
+          <w:sz w:val="18"/>
+          <w:szCs w:val="18"/>
+        </w:rPr>
+        <w:t xml:space="preserve">Matriz de referência. O ajuste fino dos perfis é validado com a Unilever na fase de implementação.</w:t>
+      </w:r>
+    </w:p>
+    <w:p>
+      <w:pPr>
+        <w:pStyle w:val="Heading2"/>
+        <w:spacing w:after="100" w:before="220"/>
+      </w:pPr>
+      <w:r>
+        <w:rPr>
+          <w:rFonts w:ascii="Calibri" w:cs="Calibri" w:eastAsia="Calibri" w:hAnsi="Calibri"/>
+          <w:b/>
+          <w:bCs/>
+          <w:color w:val="0E1424"/>
+          <w:sz w:val="24"/>
+          <w:szCs w:val="24"/>
+        </w:rPr>
         <w:t xml:space="preserve">Autenticação e usuários</w:t>
       </w:r>
     </w:p>
@@ -1948,6 +3363,471 @@
           <w:sz w:val="24"/>
           <w:szCs w:val="24"/>
         </w:rPr>
+        <w:t xml:space="preserve">5.0. Estados e cores (padrão do sistema)</w:t>
+      </w:r>
+    </w:p>
+    <w:p>
+      <w:pPr>
+        <w:spacing w:after="120" w:before="0" w:line="276"/>
+      </w:pPr>
+      <w:r>
+        <w:rPr>
+          <w:rFonts w:ascii="Calibri" w:cs="Calibri" w:eastAsia="Calibri" w:hAnsi="Calibri"/>
+          <w:color w:val="23272F"/>
+          <w:sz w:val="21"/>
+          <w:szCs w:val="21"/>
+        </w:rPr>
+        <w:t xml:space="preserve">Cada habilitação e cada campo com validade segue o mesmo padrão visual de status:</w:t>
+      </w:r>
+    </w:p>
+    <w:tbl>
+      <w:tblPr>
+        <w:tblW w:type="dxa" w:w="8220"/>
+        <w:tblBorders>
+          <w:top w:val="single" w:color="E6E9F2" w:sz="2"/>
+          <w:left w:val="single" w:color="E6E9F2" w:sz="2"/>
+          <w:bottom w:val="single" w:color="E6E9F2" w:sz="2"/>
+          <w:right w:val="single" w:color="E6E9F2" w:sz="2"/>
+          <w:insideH w:val="single" w:color="E6E9F2" w:sz="2"/>
+          <w:insideV w:val="single" w:color="E6E9F2" w:sz="2"/>
+        </w:tblBorders>
+      </w:tblPr>
+      <w:tblGrid>
+        <w:gridCol w:w="2200"/>
+        <w:gridCol w:w="4020"/>
+        <w:gridCol w:w="2000"/>
+      </w:tblGrid>
+      <w:tr>
+        <w:trPr>
+          <w:tblHeader/>
+        </w:trPr>
+        <w:tc>
+          <w:tcPr>
+            <w:tcW w:type="dxa" w:w="2200"/>
+            <w:shd w:fill="1F36C7" w:color="auto" w:val="clear"/>
+            <w:tcMar>
+              <w:top w:type="dxa" w:w="60"/>
+              <w:left w:type="dxa" w:w="90"/>
+              <w:bottom w:type="dxa" w:w="60"/>
+              <w:right w:type="dxa" w:w="90"/>
+            </w:tcMar>
+          </w:tcPr>
+          <w:p>
+            <w:r>
+              <w:rPr>
+                <w:rFonts w:ascii="Calibri" w:cs="Calibri" w:eastAsia="Calibri" w:hAnsi="Calibri"/>
+                <w:b/>
+                <w:bCs/>
+                <w:color w:val="FFFFFF"/>
+                <w:sz w:val="18"/>
+                <w:szCs w:val="18"/>
+              </w:rPr>
+              <w:t xml:space="preserve">Estado</w:t>
+            </w:r>
+          </w:p>
+        </w:tc>
+        <w:tc>
+          <w:tcPr>
+            <w:tcW w:type="dxa" w:w="4020"/>
+            <w:shd w:fill="1F36C7" w:color="auto" w:val="clear"/>
+            <w:tcMar>
+              <w:top w:type="dxa" w:w="60"/>
+              <w:left w:type="dxa" w:w="90"/>
+              <w:bottom w:type="dxa" w:w="60"/>
+              <w:right w:type="dxa" w:w="90"/>
+            </w:tcMar>
+          </w:tcPr>
+          <w:p>
+            <w:r>
+              <w:rPr>
+                <w:rFonts w:ascii="Calibri" w:cs="Calibri" w:eastAsia="Calibri" w:hAnsi="Calibri"/>
+                <w:b/>
+                <w:bCs/>
+                <w:color w:val="FFFFFF"/>
+                <w:sz w:val="18"/>
+                <w:szCs w:val="18"/>
+              </w:rPr>
+              <w:t xml:space="preserve">Regra</w:t>
+            </w:r>
+          </w:p>
+        </w:tc>
+        <w:tc>
+          <w:tcPr>
+            <w:tcW w:type="dxa" w:w="2000"/>
+            <w:shd w:fill="1F36C7" w:color="auto" w:val="clear"/>
+            <w:tcMar>
+              <w:top w:type="dxa" w:w="60"/>
+              <w:left w:type="dxa" w:w="90"/>
+              <w:bottom w:type="dxa" w:w="60"/>
+              <w:right w:type="dxa" w:w="90"/>
+            </w:tcMar>
+          </w:tcPr>
+          <w:p>
+            <w:r>
+              <w:rPr>
+                <w:rFonts w:ascii="Calibri" w:cs="Calibri" w:eastAsia="Calibri" w:hAnsi="Calibri"/>
+                <w:b/>
+                <w:bCs/>
+                <w:color w:val="FFFFFF"/>
+                <w:sz w:val="18"/>
+                <w:szCs w:val="18"/>
+              </w:rPr>
+              <w:t xml:space="preserve">Cor</w:t>
+            </w:r>
+          </w:p>
+        </w:tc>
+      </w:tr>
+      <w:tr>
+        <w:tc>
+          <w:tcPr>
+            <w:tcW w:type="dxa" w:w="2200"/>
+            <w:shd w:fill="FFFFFF" w:color="auto" w:val="clear"/>
+            <w:tcMar>
+              <w:top w:type="dxa" w:w="50"/>
+              <w:left w:type="dxa" w:w="90"/>
+              <w:bottom w:type="dxa" w:w="50"/>
+              <w:right w:type="dxa" w:w="90"/>
+            </w:tcMar>
+          </w:tcPr>
+          <w:p>
+            <w:pPr>
+              <w:spacing w:after="0" w:line="250"/>
+            </w:pPr>
+            <w:r>
+              <w:rPr>
+                <w:rFonts w:ascii="Calibri" w:cs="Calibri" w:eastAsia="Calibri" w:hAnsi="Calibri"/>
+                <w:color w:val="23272F"/>
+                <w:sz w:val="18"/>
+                <w:szCs w:val="18"/>
+              </w:rPr>
+              <w:t xml:space="preserve">Válido</w:t>
+            </w:r>
+          </w:p>
+        </w:tc>
+        <w:tc>
+          <w:tcPr>
+            <w:tcW w:type="dxa" w:w="4020"/>
+            <w:shd w:fill="FFFFFF" w:color="auto" w:val="clear"/>
+            <w:tcMar>
+              <w:top w:type="dxa" w:w="50"/>
+              <w:left w:type="dxa" w:w="90"/>
+              <w:bottom w:type="dxa" w:w="50"/>
+              <w:right w:type="dxa" w:w="90"/>
+            </w:tcMar>
+          </w:tcPr>
+          <w:p>
+            <w:pPr>
+              <w:spacing w:after="0" w:line="250"/>
+            </w:pPr>
+            <w:r>
+              <w:rPr>
+                <w:rFonts w:ascii="Calibri" w:cs="Calibri" w:eastAsia="Calibri" w:hAnsi="Calibri"/>
+                <w:b w:val="false"/>
+                <w:bCs w:val="false"/>
+                <w:color w:val="23272F"/>
+                <w:sz w:val="18"/>
+                <w:szCs w:val="18"/>
+              </w:rPr>
+              <w:t xml:space="preserve">Vencimento a mais de 60 dias</w:t>
+            </w:r>
+          </w:p>
+        </w:tc>
+        <w:tc>
+          <w:tcPr>
+            <w:tcW w:type="dxa" w:w="2000"/>
+            <w:shd w:fill="FFFFFF" w:color="auto" w:val="clear"/>
+            <w:tcMar>
+              <w:top w:type="dxa" w:w="50"/>
+              <w:left w:type="dxa" w:w="90"/>
+              <w:bottom w:type="dxa" w:w="50"/>
+              <w:right w:type="dxa" w:w="90"/>
+            </w:tcMar>
+          </w:tcPr>
+          <w:p>
+            <w:pPr>
+              <w:spacing w:after="0" w:line="250"/>
+            </w:pPr>
+            <w:r>
+              <w:rPr>
+                <w:rFonts w:ascii="Calibri" w:cs="Calibri" w:eastAsia="Calibri" w:hAnsi="Calibri"/>
+                <w:b w:val="false"/>
+                <w:bCs w:val="false"/>
+                <w:color w:val="23272F"/>
+                <w:sz w:val="18"/>
+                <w:szCs w:val="18"/>
+              </w:rPr>
+              <w:t xml:space="preserve">Verde</w:t>
+            </w:r>
+          </w:p>
+        </w:tc>
+      </w:tr>
+      <w:tr>
+        <w:tc>
+          <w:tcPr>
+            <w:tcW w:type="dxa" w:w="2200"/>
+            <w:shd w:fill="F4F6FB" w:color="auto" w:val="clear"/>
+            <w:tcMar>
+              <w:top w:type="dxa" w:w="50"/>
+              <w:left w:type="dxa" w:w="90"/>
+              <w:bottom w:type="dxa" w:w="50"/>
+              <w:right w:type="dxa" w:w="90"/>
+            </w:tcMar>
+          </w:tcPr>
+          <w:p>
+            <w:pPr>
+              <w:spacing w:after="0" w:line="250"/>
+            </w:pPr>
+            <w:r>
+              <w:rPr>
+                <w:rFonts w:ascii="Calibri" w:cs="Calibri" w:eastAsia="Calibri" w:hAnsi="Calibri"/>
+                <w:color w:val="23272F"/>
+                <w:sz w:val="18"/>
+                <w:szCs w:val="18"/>
+              </w:rPr>
+              <w:t xml:space="preserve">Vencendo</w:t>
+            </w:r>
+          </w:p>
+        </w:tc>
+        <w:tc>
+          <w:tcPr>
+            <w:tcW w:type="dxa" w:w="4020"/>
+            <w:shd w:fill="F4F6FB" w:color="auto" w:val="clear"/>
+            <w:tcMar>
+              <w:top w:type="dxa" w:w="50"/>
+              <w:left w:type="dxa" w:w="90"/>
+              <w:bottom w:type="dxa" w:w="50"/>
+              <w:right w:type="dxa" w:w="90"/>
+            </w:tcMar>
+          </w:tcPr>
+          <w:p>
+            <w:pPr>
+              <w:spacing w:after="0" w:line="250"/>
+            </w:pPr>
+            <w:r>
+              <w:rPr>
+                <w:rFonts w:ascii="Calibri" w:cs="Calibri" w:eastAsia="Calibri" w:hAnsi="Calibri"/>
+                <w:b w:val="false"/>
+                <w:bCs w:val="false"/>
+                <w:color w:val="23272F"/>
+                <w:sz w:val="18"/>
+                <w:szCs w:val="18"/>
+              </w:rPr>
+              <w:t xml:space="preserve">Vence nos próximos 60 dias</w:t>
+            </w:r>
+          </w:p>
+        </w:tc>
+        <w:tc>
+          <w:tcPr>
+            <w:tcW w:type="dxa" w:w="2000"/>
+            <w:shd w:fill="F4F6FB" w:color="auto" w:val="clear"/>
+            <w:tcMar>
+              <w:top w:type="dxa" w:w="50"/>
+              <w:left w:type="dxa" w:w="90"/>
+              <w:bottom w:type="dxa" w:w="50"/>
+              <w:right w:type="dxa" w:w="90"/>
+            </w:tcMar>
+          </w:tcPr>
+          <w:p>
+            <w:pPr>
+              <w:spacing w:after="0" w:line="250"/>
+            </w:pPr>
+            <w:r>
+              <w:rPr>
+                <w:rFonts w:ascii="Calibri" w:cs="Calibri" w:eastAsia="Calibri" w:hAnsi="Calibri"/>
+                <w:b w:val="false"/>
+                <w:bCs w:val="false"/>
+                <w:color w:val="23272F"/>
+                <w:sz w:val="18"/>
+                <w:szCs w:val="18"/>
+              </w:rPr>
+              <w:t xml:space="preserve">Amarelo</w:t>
+            </w:r>
+          </w:p>
+        </w:tc>
+      </w:tr>
+      <w:tr>
+        <w:tc>
+          <w:tcPr>
+            <w:tcW w:type="dxa" w:w="2200"/>
+            <w:shd w:fill="FFFFFF" w:color="auto" w:val="clear"/>
+            <w:tcMar>
+              <w:top w:type="dxa" w:w="50"/>
+              <w:left w:type="dxa" w:w="90"/>
+              <w:bottom w:type="dxa" w:w="50"/>
+              <w:right w:type="dxa" w:w="90"/>
+            </w:tcMar>
+          </w:tcPr>
+          <w:p>
+            <w:pPr>
+              <w:spacing w:after="0" w:line="250"/>
+            </w:pPr>
+            <w:r>
+              <w:rPr>
+                <w:rFonts w:ascii="Calibri" w:cs="Calibri" w:eastAsia="Calibri" w:hAnsi="Calibri"/>
+                <w:color w:val="23272F"/>
+                <w:sz w:val="18"/>
+                <w:szCs w:val="18"/>
+              </w:rPr>
+              <w:t xml:space="preserve">Vencido</w:t>
+            </w:r>
+          </w:p>
+        </w:tc>
+        <w:tc>
+          <w:tcPr>
+            <w:tcW w:type="dxa" w:w="4020"/>
+            <w:shd w:fill="FFFFFF" w:color="auto" w:val="clear"/>
+            <w:tcMar>
+              <w:top w:type="dxa" w:w="50"/>
+              <w:left w:type="dxa" w:w="90"/>
+              <w:bottom w:type="dxa" w:w="50"/>
+              <w:right w:type="dxa" w:w="90"/>
+            </w:tcMar>
+          </w:tcPr>
+          <w:p>
+            <w:pPr>
+              <w:spacing w:after="0" w:line="250"/>
+            </w:pPr>
+            <w:r>
+              <w:rPr>
+                <w:rFonts w:ascii="Calibri" w:cs="Calibri" w:eastAsia="Calibri" w:hAnsi="Calibri"/>
+                <w:b w:val="false"/>
+                <w:bCs w:val="false"/>
+                <w:color w:val="23272F"/>
+                <w:sz w:val="18"/>
+                <w:szCs w:val="18"/>
+              </w:rPr>
+              <w:t xml:space="preserve">Data de vencimento já passou</w:t>
+            </w:r>
+          </w:p>
+        </w:tc>
+        <w:tc>
+          <w:tcPr>
+            <w:tcW w:type="dxa" w:w="2000"/>
+            <w:shd w:fill="FFFFFF" w:color="auto" w:val="clear"/>
+            <w:tcMar>
+              <w:top w:type="dxa" w:w="50"/>
+              <w:left w:type="dxa" w:w="90"/>
+              <w:bottom w:type="dxa" w:w="50"/>
+              <w:right w:type="dxa" w:w="90"/>
+            </w:tcMar>
+          </w:tcPr>
+          <w:p>
+            <w:pPr>
+              <w:spacing w:after="0" w:line="250"/>
+            </w:pPr>
+            <w:r>
+              <w:rPr>
+                <w:rFonts w:ascii="Calibri" w:cs="Calibri" w:eastAsia="Calibri" w:hAnsi="Calibri"/>
+                <w:b w:val="false"/>
+                <w:bCs w:val="false"/>
+                <w:color w:val="23272F"/>
+                <w:sz w:val="18"/>
+                <w:szCs w:val="18"/>
+              </w:rPr>
+              <w:t xml:space="preserve">Vermelho</w:t>
+            </w:r>
+          </w:p>
+        </w:tc>
+      </w:tr>
+      <w:tr>
+        <w:tc>
+          <w:tcPr>
+            <w:tcW w:type="dxa" w:w="2200"/>
+            <w:shd w:fill="F4F6FB" w:color="auto" w:val="clear"/>
+            <w:tcMar>
+              <w:top w:type="dxa" w:w="50"/>
+              <w:left w:type="dxa" w:w="90"/>
+              <w:bottom w:type="dxa" w:w="50"/>
+              <w:right w:type="dxa" w:w="90"/>
+            </w:tcMar>
+          </w:tcPr>
+          <w:p>
+            <w:pPr>
+              <w:spacing w:after="0" w:line="250"/>
+            </w:pPr>
+            <w:r>
+              <w:rPr>
+                <w:rFonts w:ascii="Calibri" w:cs="Calibri" w:eastAsia="Calibri" w:hAnsi="Calibri"/>
+                <w:color w:val="23272F"/>
+                <w:sz w:val="18"/>
+                <w:szCs w:val="18"/>
+              </w:rPr>
+              <w:t xml:space="preserve">Não habilitado</w:t>
+            </w:r>
+          </w:p>
+        </w:tc>
+        <w:tc>
+          <w:tcPr>
+            <w:tcW w:type="dxa" w:w="4020"/>
+            <w:shd w:fill="F4F6FB" w:color="auto" w:val="clear"/>
+            <w:tcMar>
+              <w:top w:type="dxa" w:w="50"/>
+              <w:left w:type="dxa" w:w="90"/>
+              <w:bottom w:type="dxa" w:w="50"/>
+              <w:right w:type="dxa" w:w="90"/>
+            </w:tcMar>
+          </w:tcPr>
+          <w:p>
+            <w:pPr>
+              <w:spacing w:after="0" w:line="250"/>
+            </w:pPr>
+            <w:r>
+              <w:rPr>
+                <w:rFonts w:ascii="Calibri" w:cs="Calibri" w:eastAsia="Calibri" w:hAnsi="Calibri"/>
+                <w:b w:val="false"/>
+                <w:bCs w:val="false"/>
+                <w:color w:val="23272F"/>
+                <w:sz w:val="18"/>
+                <w:szCs w:val="18"/>
+              </w:rPr>
+              <w:t xml:space="preserve">Colaborador não possui o treinamento</w:t>
+            </w:r>
+          </w:p>
+        </w:tc>
+        <w:tc>
+          <w:tcPr>
+            <w:tcW w:type="dxa" w:w="2000"/>
+            <w:shd w:fill="F4F6FB" w:color="auto" w:val="clear"/>
+            <w:tcMar>
+              <w:top w:type="dxa" w:w="50"/>
+              <w:left w:type="dxa" w:w="90"/>
+              <w:bottom w:type="dxa" w:w="50"/>
+              <w:right w:type="dxa" w:w="90"/>
+            </w:tcMar>
+          </w:tcPr>
+          <w:p>
+            <w:pPr>
+              <w:spacing w:after="0" w:line="250"/>
+            </w:pPr>
+            <w:r>
+              <w:rPr>
+                <w:rFonts w:ascii="Calibri" w:cs="Calibri" w:eastAsia="Calibri" w:hAnsi="Calibri"/>
+                <w:b w:val="false"/>
+                <w:bCs w:val="false"/>
+                <w:color w:val="23272F"/>
+                <w:sz w:val="18"/>
+                <w:szCs w:val="18"/>
+              </w:rPr>
+              <w:t xml:space="preserve">Cinza / tracejado</w:t>
+            </w:r>
+          </w:p>
+        </w:tc>
+      </w:tr>
+    </w:tbl>
+    <w:p>
+      <w:pPr>
+        <w:pStyle w:val="Heading2"/>
+        <w:spacing w:after="100" w:before="220"/>
+      </w:pPr>
+      <w:r>
+        <w:rPr>
+          <w:rFonts w:ascii="Calibri" w:cs="Calibri" w:eastAsia="Calibri" w:hAnsi="Calibri"/>
+          <w:b/>
+          <w:bCs/>
+          <w:color w:val="0E1424"/>
+          <w:sz w:val="24"/>
+          <w:szCs w:val="24"/>
+        </w:rPr>
         <w:t xml:space="preserve">5.1. Consulta da carteirinha (colaborador)</w:t>
       </w:r>
     </w:p>
@@ -1967,7 +3847,7 @@
           <w:sz w:val="21"/>
           <w:szCs w:val="21"/>
         </w:rPr>
-        <w:t xml:space="preserve">Acesso por site responsivo, sem instalação de aplicativo.</w:t>
+        <w:t xml:space="preserve">Acesso por site responsivo (celular, tablet e computador), sem instalação de aplicativo e sem login.</w:t>
       </w:r>
     </w:p>
     <w:p>
@@ -1986,7 +3866,7 @@
           <w:sz w:val="21"/>
           <w:szCs w:val="21"/>
         </w:rPr>
-        <w:t xml:space="preserve">Entrada por leitura de QR Code ou digitação do RE (registro do colaborador).</w:t>
+        <w:t xml:space="preserve">Entrada por leitura de QR Code ou digitação do RE.</w:t>
       </w:r>
     </w:p>
     <w:p>
@@ -2001,11 +3881,22 @@
       <w:r>
         <w:rPr>
           <w:rFonts w:ascii="Calibri" w:cs="Calibri" w:eastAsia="Calibri" w:hAnsi="Calibri"/>
-          <w:color w:val="23272F"/>
-          <w:sz w:val="21"/>
-          <w:szCs w:val="21"/>
-        </w:rPr>
-        <w:t xml:space="preserve">Exibição imediata da carteirinha correspondente ao colaborador.</w:t>
+          <w:b/>
+          <w:bCs/>
+          <w:color w:val="23272F"/>
+          <w:sz w:val="21"/>
+          <w:szCs w:val="21"/>
+        </w:rPr>
+        <w:t xml:space="preserve">Validação do RE: </w:t>
+      </w:r>
+      <w:r>
+        <w:rPr>
+          <w:rFonts w:ascii="Calibri" w:cs="Calibri" w:eastAsia="Calibri" w:hAnsi="Calibri"/>
+          <w:color w:val="23272F"/>
+          <w:sz w:val="21"/>
+          <w:szCs w:val="21"/>
+        </w:rPr>
+        <w:t xml:space="preserve">RE inexistente exibe mensagem de erro. RE de colaborador inativado não retorna carteirinha.</w:t>
       </w:r>
     </w:p>
     <w:p>
@@ -2024,7 +3915,7 @@
           <w:sz w:val="21"/>
           <w:szCs w:val="21"/>
         </w:rPr>
-        <w:t xml:space="preserve">Alternância entre as visões Executor e Liberador.</w:t>
+        <w:t xml:space="preserve">Exibição imediata da carteirinha, com alternância entre as visões Executor e Liberador.</w:t>
       </w:r>
     </w:p>
     <w:p>
@@ -2043,7 +3934,7 @@
           <w:sz w:val="21"/>
           <w:szCs w:val="21"/>
         </w:rPr>
-        <w:t xml:space="preserve">Funciona no celular pessoal do colaborador, sem conta Unilever.</w:t>
+        <w:t xml:space="preserve">A carteirinha consultada pelo colaborador não exibe o dado de ASO.</w:t>
       </w:r>
     </w:p>
     <w:p>
@@ -2074,9 +3965,947 @@
           <w:sz w:val="21"/>
           <w:szCs w:val="21"/>
         </w:rPr>
-        <w:t xml:space="preserve">Reproduz a carteirinha física do executor de atividades. Estrutura:</w:t>
-      </w:r>
-    </w:p>
+        <w:t xml:space="preserve">Reproduz a carteirinha física do executor. Campos exibidos:</w:t>
+      </w:r>
+    </w:p>
+    <w:tbl>
+      <w:tblPr>
+        <w:tblW w:type="dxa" w:w="8220"/>
+        <w:tblBorders>
+          <w:top w:val="single" w:color="E6E9F2" w:sz="2"/>
+          <w:left w:val="single" w:color="E6E9F2" w:sz="2"/>
+          <w:bottom w:val="single" w:color="E6E9F2" w:sz="2"/>
+          <w:right w:val="single" w:color="E6E9F2" w:sz="2"/>
+          <w:insideH w:val="single" w:color="E6E9F2" w:sz="2"/>
+          <w:insideV w:val="single" w:color="E6E9F2" w:sz="2"/>
+        </w:tblBorders>
+      </w:tblPr>
+      <w:tblGrid>
+        <w:gridCol w:w="2600"/>
+        <w:gridCol w:w="1900"/>
+        <w:gridCol w:w="3720"/>
+      </w:tblGrid>
+      <w:tr>
+        <w:trPr>
+          <w:tblHeader/>
+        </w:trPr>
+        <w:tc>
+          <w:tcPr>
+            <w:tcW w:type="dxa" w:w="2600"/>
+            <w:shd w:fill="1F36C7" w:color="auto" w:val="clear"/>
+            <w:tcMar>
+              <w:top w:type="dxa" w:w="60"/>
+              <w:left w:type="dxa" w:w="90"/>
+              <w:bottom w:type="dxa" w:w="60"/>
+              <w:right w:type="dxa" w:w="90"/>
+            </w:tcMar>
+          </w:tcPr>
+          <w:p>
+            <w:r>
+              <w:rPr>
+                <w:rFonts w:ascii="Calibri" w:cs="Calibri" w:eastAsia="Calibri" w:hAnsi="Calibri"/>
+                <w:b/>
+                <w:bCs/>
+                <w:color w:val="FFFFFF"/>
+                <w:sz w:val="18"/>
+                <w:szCs w:val="18"/>
+              </w:rPr>
+              <w:t xml:space="preserve">Campo</w:t>
+            </w:r>
+          </w:p>
+        </w:tc>
+        <w:tc>
+          <w:tcPr>
+            <w:tcW w:type="dxa" w:w="1900"/>
+            <w:shd w:fill="1F36C7" w:color="auto" w:val="clear"/>
+            <w:tcMar>
+              <w:top w:type="dxa" w:w="60"/>
+              <w:left w:type="dxa" w:w="90"/>
+              <w:bottom w:type="dxa" w:w="60"/>
+              <w:right w:type="dxa" w:w="90"/>
+            </w:tcMar>
+          </w:tcPr>
+          <w:p>
+            <w:r>
+              <w:rPr>
+                <w:rFonts w:ascii="Calibri" w:cs="Calibri" w:eastAsia="Calibri" w:hAnsi="Calibri"/>
+                <w:b/>
+                <w:bCs/>
+                <w:color w:val="FFFFFF"/>
+                <w:sz w:val="18"/>
+                <w:szCs w:val="18"/>
+              </w:rPr>
+              <w:t xml:space="preserve">Origem</w:t>
+            </w:r>
+          </w:p>
+        </w:tc>
+        <w:tc>
+          <w:tcPr>
+            <w:tcW w:type="dxa" w:w="3720"/>
+            <w:shd w:fill="1F36C7" w:color="auto" w:val="clear"/>
+            <w:tcMar>
+              <w:top w:type="dxa" w:w="60"/>
+              <w:left w:type="dxa" w:w="90"/>
+              <w:bottom w:type="dxa" w:w="60"/>
+              <w:right w:type="dxa" w:w="90"/>
+            </w:tcMar>
+          </w:tcPr>
+          <w:p>
+            <w:r>
+              <w:rPr>
+                <w:rFonts w:ascii="Calibri" w:cs="Calibri" w:eastAsia="Calibri" w:hAnsi="Calibri"/>
+                <w:b/>
+                <w:bCs/>
+                <w:color w:val="FFFFFF"/>
+                <w:sz w:val="18"/>
+                <w:szCs w:val="18"/>
+              </w:rPr>
+              <w:t xml:space="preserve">Observação</w:t>
+            </w:r>
+          </w:p>
+        </w:tc>
+      </w:tr>
+      <w:tr>
+        <w:tc>
+          <w:tcPr>
+            <w:tcW w:type="dxa" w:w="2600"/>
+            <w:shd w:fill="FFFFFF" w:color="auto" w:val="clear"/>
+            <w:tcMar>
+              <w:top w:type="dxa" w:w="50"/>
+              <w:left w:type="dxa" w:w="90"/>
+              <w:bottom w:type="dxa" w:w="50"/>
+              <w:right w:type="dxa" w:w="90"/>
+            </w:tcMar>
+          </w:tcPr>
+          <w:p>
+            <w:pPr>
+              <w:spacing w:after="0" w:line="250"/>
+            </w:pPr>
+            <w:r>
+              <w:rPr>
+                <w:rFonts w:ascii="Calibri" w:cs="Calibri" w:eastAsia="Calibri" w:hAnsi="Calibri"/>
+                <w:color w:val="23272F"/>
+                <w:sz w:val="18"/>
+                <w:szCs w:val="18"/>
+              </w:rPr>
+              <w:t xml:space="preserve">Cabeçalho Unilever + Portaria 3.214/78</w:t>
+            </w:r>
+          </w:p>
+        </w:tc>
+        <w:tc>
+          <w:tcPr>
+            <w:tcW w:type="dxa" w:w="1900"/>
+            <w:shd w:fill="FFFFFF" w:color="auto" w:val="clear"/>
+            <w:tcMar>
+              <w:top w:type="dxa" w:w="50"/>
+              <w:left w:type="dxa" w:w="90"/>
+              <w:bottom w:type="dxa" w:w="50"/>
+              <w:right w:type="dxa" w:w="90"/>
+            </w:tcMar>
+          </w:tcPr>
+          <w:p>
+            <w:pPr>
+              <w:spacing w:after="0" w:line="250"/>
+            </w:pPr>
+            <w:r>
+              <w:rPr>
+                <w:rFonts w:ascii="Calibri" w:cs="Calibri" w:eastAsia="Calibri" w:hAnsi="Calibri"/>
+                <w:b w:val="false"/>
+                <w:bCs w:val="false"/>
+                <w:color w:val="23272F"/>
+                <w:sz w:val="18"/>
+                <w:szCs w:val="18"/>
+              </w:rPr>
+              <w:t xml:space="preserve">Fixo</w:t>
+            </w:r>
+          </w:p>
+        </w:tc>
+        <w:tc>
+          <w:tcPr>
+            <w:tcW w:type="dxa" w:w="3720"/>
+            <w:shd w:fill="FFFFFF" w:color="auto" w:val="clear"/>
+            <w:tcMar>
+              <w:top w:type="dxa" w:w="50"/>
+              <w:left w:type="dxa" w:w="90"/>
+              <w:bottom w:type="dxa" w:w="50"/>
+              <w:right w:type="dxa" w:w="90"/>
+            </w:tcMar>
+          </w:tcPr>
+          <w:p>
+            <w:pPr>
+              <w:spacing w:after="0" w:line="250"/>
+            </w:pPr>
+            <w:r>
+              <w:rPr>
+                <w:rFonts w:ascii="Calibri" w:cs="Calibri" w:eastAsia="Calibri" w:hAnsi="Calibri"/>
+                <w:b w:val="false"/>
+                <w:bCs w:val="false"/>
+                <w:color w:val="23272F"/>
+                <w:sz w:val="18"/>
+                <w:szCs w:val="18"/>
+              </w:rPr>
+              <w:t xml:space="preserve">Identidade visual.</w:t>
+            </w:r>
+          </w:p>
+        </w:tc>
+      </w:tr>
+      <w:tr>
+        <w:tc>
+          <w:tcPr>
+            <w:tcW w:type="dxa" w:w="2600"/>
+            <w:shd w:fill="F4F6FB" w:color="auto" w:val="clear"/>
+            <w:tcMar>
+              <w:top w:type="dxa" w:w="50"/>
+              <w:left w:type="dxa" w:w="90"/>
+              <w:bottom w:type="dxa" w:w="50"/>
+              <w:right w:type="dxa" w:w="90"/>
+            </w:tcMar>
+          </w:tcPr>
+          <w:p>
+            <w:pPr>
+              <w:spacing w:after="0" w:line="250"/>
+            </w:pPr>
+            <w:r>
+              <w:rPr>
+                <w:rFonts w:ascii="Calibri" w:cs="Calibri" w:eastAsia="Calibri" w:hAnsi="Calibri"/>
+                <w:color w:val="23272F"/>
+                <w:sz w:val="18"/>
+                <w:szCs w:val="18"/>
+              </w:rPr>
+              <w:t xml:space="preserve">Foto</w:t>
+            </w:r>
+          </w:p>
+        </w:tc>
+        <w:tc>
+          <w:tcPr>
+            <w:tcW w:type="dxa" w:w="1900"/>
+            <w:shd w:fill="F4F6FB" w:color="auto" w:val="clear"/>
+            <w:tcMar>
+              <w:top w:type="dxa" w:w="50"/>
+              <w:left w:type="dxa" w:w="90"/>
+              <w:bottom w:type="dxa" w:w="50"/>
+              <w:right w:type="dxa" w:w="90"/>
+            </w:tcMar>
+          </w:tcPr>
+          <w:p>
+            <w:pPr>
+              <w:spacing w:after="0" w:line="250"/>
+            </w:pPr>
+            <w:r>
+              <w:rPr>
+                <w:rFonts w:ascii="Calibri" w:cs="Calibri" w:eastAsia="Calibri" w:hAnsi="Calibri"/>
+                <w:b w:val="false"/>
+                <w:bCs w:val="false"/>
+                <w:color w:val="23272F"/>
+                <w:sz w:val="18"/>
+                <w:szCs w:val="18"/>
+              </w:rPr>
+              <w:t xml:space="preserve">Cadastro</w:t>
+            </w:r>
+          </w:p>
+        </w:tc>
+        <w:tc>
+          <w:tcPr>
+            <w:tcW w:type="dxa" w:w="3720"/>
+            <w:shd w:fill="F4F6FB" w:color="auto" w:val="clear"/>
+            <w:tcMar>
+              <w:top w:type="dxa" w:w="50"/>
+              <w:left w:type="dxa" w:w="90"/>
+              <w:bottom w:type="dxa" w:w="50"/>
+              <w:right w:type="dxa" w:w="90"/>
+            </w:tcMar>
+          </w:tcPr>
+          <w:p>
+            <w:pPr>
+              <w:spacing w:after="0" w:line="250"/>
+            </w:pPr>
+            <w:r>
+              <w:rPr>
+                <w:rFonts w:ascii="Calibri" w:cs="Calibri" w:eastAsia="Calibri" w:hAnsi="Calibri"/>
+                <w:b w:val="false"/>
+                <w:bCs w:val="false"/>
+                <w:color w:val="23272F"/>
+                <w:sz w:val="18"/>
+                <w:szCs w:val="18"/>
+              </w:rPr>
+              <w:t xml:space="preserve">Opcional; placeholder com iniciais quando ausente.</w:t>
+            </w:r>
+          </w:p>
+        </w:tc>
+      </w:tr>
+      <w:tr>
+        <w:tc>
+          <w:tcPr>
+            <w:tcW w:type="dxa" w:w="2600"/>
+            <w:shd w:fill="FFFFFF" w:color="auto" w:val="clear"/>
+            <w:tcMar>
+              <w:top w:type="dxa" w:w="50"/>
+              <w:left w:type="dxa" w:w="90"/>
+              <w:bottom w:type="dxa" w:w="50"/>
+              <w:right w:type="dxa" w:w="90"/>
+            </w:tcMar>
+          </w:tcPr>
+          <w:p>
+            <w:pPr>
+              <w:spacing w:after="0" w:line="250"/>
+            </w:pPr>
+            <w:r>
+              <w:rPr>
+                <w:rFonts w:ascii="Calibri" w:cs="Calibri" w:eastAsia="Calibri" w:hAnsi="Calibri"/>
+                <w:color w:val="23272F"/>
+                <w:sz w:val="18"/>
+                <w:szCs w:val="18"/>
+              </w:rPr>
+              <w:t xml:space="preserve">Nome, RE, Área, Turno, Função</w:t>
+            </w:r>
+          </w:p>
+        </w:tc>
+        <w:tc>
+          <w:tcPr>
+            <w:tcW w:type="dxa" w:w="1900"/>
+            <w:shd w:fill="FFFFFF" w:color="auto" w:val="clear"/>
+            <w:tcMar>
+              <w:top w:type="dxa" w:w="50"/>
+              <w:left w:type="dxa" w:w="90"/>
+              <w:bottom w:type="dxa" w:w="50"/>
+              <w:right w:type="dxa" w:w="90"/>
+            </w:tcMar>
+          </w:tcPr>
+          <w:p>
+            <w:pPr>
+              <w:spacing w:after="0" w:line="250"/>
+            </w:pPr>
+            <w:r>
+              <w:rPr>
+                <w:rFonts w:ascii="Calibri" w:cs="Calibri" w:eastAsia="Calibri" w:hAnsi="Calibri"/>
+                <w:b w:val="false"/>
+                <w:bCs w:val="false"/>
+                <w:color w:val="23272F"/>
+                <w:sz w:val="18"/>
+                <w:szCs w:val="18"/>
+              </w:rPr>
+              <w:t xml:space="preserve">Base</w:t>
+            </w:r>
+          </w:p>
+        </w:tc>
+        <w:tc>
+          <w:tcPr>
+            <w:tcW w:type="dxa" w:w="3720"/>
+            <w:shd w:fill="FFFFFF" w:color="auto" w:val="clear"/>
+            <w:tcMar>
+              <w:top w:type="dxa" w:w="50"/>
+              <w:left w:type="dxa" w:w="90"/>
+              <w:bottom w:type="dxa" w:w="50"/>
+              <w:right w:type="dxa" w:w="90"/>
+            </w:tcMar>
+          </w:tcPr>
+          <w:p>
+            <w:pPr>
+              <w:spacing w:after="0" w:line="250"/>
+            </w:pPr>
+            <w:r>
+              <w:rPr>
+                <w:rFonts w:ascii="Calibri" w:cs="Calibri" w:eastAsia="Calibri" w:hAnsi="Calibri"/>
+                <w:b w:val="false"/>
+                <w:bCs w:val="false"/>
+                <w:color w:val="23272F"/>
+                <w:sz w:val="18"/>
+                <w:szCs w:val="18"/>
+              </w:rPr>
+              <w:t xml:space="preserve">Função pode ser cadastrada ou derivada.</w:t>
+            </w:r>
+          </w:p>
+        </w:tc>
+      </w:tr>
+      <w:tr>
+        <w:tc>
+          <w:tcPr>
+            <w:tcW w:type="dxa" w:w="2600"/>
+            <w:shd w:fill="F4F6FB" w:color="auto" w:val="clear"/>
+            <w:tcMar>
+              <w:top w:type="dxa" w:w="50"/>
+              <w:left w:type="dxa" w:w="90"/>
+              <w:bottom w:type="dxa" w:w="50"/>
+              <w:right w:type="dxa" w:w="90"/>
+            </w:tcMar>
+          </w:tcPr>
+          <w:p>
+            <w:pPr>
+              <w:spacing w:after="0" w:line="250"/>
+            </w:pPr>
+            <w:r>
+              <w:rPr>
+                <w:rFonts w:ascii="Calibri" w:cs="Calibri" w:eastAsia="Calibri" w:hAnsi="Calibri"/>
+                <w:color w:val="23272F"/>
+                <w:sz w:val="18"/>
+                <w:szCs w:val="18"/>
+              </w:rPr>
+              <w:t xml:space="preserve">Empresa</w:t>
+            </w:r>
+          </w:p>
+        </w:tc>
+        <w:tc>
+          <w:tcPr>
+            <w:tcW w:type="dxa" w:w="1900"/>
+            <w:shd w:fill="F4F6FB" w:color="auto" w:val="clear"/>
+            <w:tcMar>
+              <w:top w:type="dxa" w:w="50"/>
+              <w:left w:type="dxa" w:w="90"/>
+              <w:bottom w:type="dxa" w:w="50"/>
+              <w:right w:type="dxa" w:w="90"/>
+            </w:tcMar>
+          </w:tcPr>
+          <w:p>
+            <w:pPr>
+              <w:spacing w:after="0" w:line="250"/>
+            </w:pPr>
+            <w:r>
+              <w:rPr>
+                <w:rFonts w:ascii="Calibri" w:cs="Calibri" w:eastAsia="Calibri" w:hAnsi="Calibri"/>
+                <w:b w:val="false"/>
+                <w:bCs w:val="false"/>
+                <w:color w:val="23272F"/>
+                <w:sz w:val="18"/>
+                <w:szCs w:val="18"/>
+              </w:rPr>
+              <w:t xml:space="preserve">Fixo</w:t>
+            </w:r>
+          </w:p>
+        </w:tc>
+        <w:tc>
+          <w:tcPr>
+            <w:tcW w:type="dxa" w:w="3720"/>
+            <w:shd w:fill="F4F6FB" w:color="auto" w:val="clear"/>
+            <w:tcMar>
+              <w:top w:type="dxa" w:w="50"/>
+              <w:left w:type="dxa" w:w="90"/>
+              <w:bottom w:type="dxa" w:w="50"/>
+              <w:right w:type="dxa" w:w="90"/>
+            </w:tcMar>
+          </w:tcPr>
+          <w:p>
+            <w:pPr>
+              <w:spacing w:after="0" w:line="250"/>
+            </w:pPr>
+            <w:r>
+              <w:rPr>
+                <w:rFonts w:ascii="Calibri" w:cs="Calibri" w:eastAsia="Calibri" w:hAnsi="Calibri"/>
+                <w:b w:val="false"/>
+                <w:bCs w:val="false"/>
+                <w:color w:val="23272F"/>
+                <w:sz w:val="18"/>
+                <w:szCs w:val="18"/>
+              </w:rPr>
+              <w:t xml:space="preserve">Unilever.</w:t>
+            </w:r>
+          </w:p>
+        </w:tc>
+      </w:tr>
+      <w:tr>
+        <w:tc>
+          <w:tcPr>
+            <w:tcW w:type="dxa" w:w="2600"/>
+            <w:shd w:fill="FFFFFF" w:color="auto" w:val="clear"/>
+            <w:tcMar>
+              <w:top w:type="dxa" w:w="50"/>
+              <w:left w:type="dxa" w:w="90"/>
+              <w:bottom w:type="dxa" w:w="50"/>
+              <w:right w:type="dxa" w:w="90"/>
+            </w:tcMar>
+          </w:tcPr>
+          <w:p>
+            <w:pPr>
+              <w:spacing w:after="0" w:line="250"/>
+            </w:pPr>
+            <w:r>
+              <w:rPr>
+                <w:rFonts w:ascii="Calibri" w:cs="Calibri" w:eastAsia="Calibri" w:hAnsi="Calibri"/>
+                <w:color w:val="23272F"/>
+                <w:sz w:val="18"/>
+                <w:szCs w:val="18"/>
+              </w:rPr>
+              <w:t xml:space="preserve">Renov. da integração</w:t>
+            </w:r>
+          </w:p>
+        </w:tc>
+        <w:tc>
+          <w:tcPr>
+            <w:tcW w:type="dxa" w:w="1900"/>
+            <w:shd w:fill="FFFFFF" w:color="auto" w:val="clear"/>
+            <w:tcMar>
+              <w:top w:type="dxa" w:w="50"/>
+              <w:left w:type="dxa" w:w="90"/>
+              <w:bottom w:type="dxa" w:w="50"/>
+              <w:right w:type="dxa" w:w="90"/>
+            </w:tcMar>
+          </w:tcPr>
+          <w:p>
+            <w:pPr>
+              <w:spacing w:after="0" w:line="250"/>
+            </w:pPr>
+            <w:r>
+              <w:rPr>
+                <w:rFonts w:ascii="Calibri" w:cs="Calibri" w:eastAsia="Calibri" w:hAnsi="Calibri"/>
+                <w:b w:val="false"/>
+                <w:bCs w:val="false"/>
+                <w:color w:val="23272F"/>
+                <w:sz w:val="18"/>
+                <w:szCs w:val="18"/>
+              </w:rPr>
+              <w:t xml:space="preserve">Base / cadastro</w:t>
+            </w:r>
+          </w:p>
+        </w:tc>
+        <w:tc>
+          <w:tcPr>
+            <w:tcW w:type="dxa" w:w="3720"/>
+            <w:shd w:fill="FFFFFF" w:color="auto" w:val="clear"/>
+            <w:tcMar>
+              <w:top w:type="dxa" w:w="50"/>
+              <w:left w:type="dxa" w:w="90"/>
+              <w:bottom w:type="dxa" w:w="50"/>
+              <w:right w:type="dxa" w:w="90"/>
+            </w:tcMar>
+          </w:tcPr>
+          <w:p>
+            <w:pPr>
+              <w:spacing w:after="0" w:line="250"/>
+            </w:pPr>
+            <w:r>
+              <w:rPr>
+                <w:rFonts w:ascii="Calibri" w:cs="Calibri" w:eastAsia="Calibri" w:hAnsi="Calibri"/>
+                <w:b w:val="false"/>
+                <w:bCs w:val="false"/>
+                <w:color w:val="23272F"/>
+                <w:sz w:val="18"/>
+                <w:szCs w:val="18"/>
+              </w:rPr>
+              <w:t xml:space="preserve">Data com status colorido.</w:t>
+            </w:r>
+          </w:p>
+        </w:tc>
+      </w:tr>
+      <w:tr>
+        <w:tc>
+          <w:tcPr>
+            <w:tcW w:type="dxa" w:w="2600"/>
+            <w:shd w:fill="F4F6FB" w:color="auto" w:val="clear"/>
+            <w:tcMar>
+              <w:top w:type="dxa" w:w="50"/>
+              <w:left w:type="dxa" w:w="90"/>
+              <w:bottom w:type="dxa" w:w="50"/>
+              <w:right w:type="dxa" w:w="90"/>
+            </w:tcMar>
+          </w:tcPr>
+          <w:p>
+            <w:pPr>
+              <w:spacing w:after="0" w:line="250"/>
+            </w:pPr>
+            <w:r>
+              <w:rPr>
+                <w:rFonts w:ascii="Calibri" w:cs="Calibri" w:eastAsia="Calibri" w:hAnsi="Calibri"/>
+                <w:color w:val="23272F"/>
+                <w:sz w:val="18"/>
+                <w:szCs w:val="18"/>
+              </w:rPr>
+              <w:t xml:space="preserve">Renov. do ASO</w:t>
+            </w:r>
+          </w:p>
+        </w:tc>
+        <w:tc>
+          <w:tcPr>
+            <w:tcW w:type="dxa" w:w="1900"/>
+            <w:shd w:fill="F4F6FB" w:color="auto" w:val="clear"/>
+            <w:tcMar>
+              <w:top w:type="dxa" w:w="50"/>
+              <w:left w:type="dxa" w:w="90"/>
+              <w:bottom w:type="dxa" w:w="50"/>
+              <w:right w:type="dxa" w:w="90"/>
+            </w:tcMar>
+          </w:tcPr>
+          <w:p>
+            <w:pPr>
+              <w:spacing w:after="0" w:line="250"/>
+            </w:pPr>
+            <w:r>
+              <w:rPr>
+                <w:rFonts w:ascii="Calibri" w:cs="Calibri" w:eastAsia="Calibri" w:hAnsi="Calibri"/>
+                <w:b w:val="false"/>
+                <w:bCs w:val="false"/>
+                <w:color w:val="23272F"/>
+                <w:sz w:val="18"/>
+                <w:szCs w:val="18"/>
+              </w:rPr>
+              <w:t xml:space="preserve">Saúde</w:t>
+            </w:r>
+          </w:p>
+        </w:tc>
+        <w:tc>
+          <w:tcPr>
+            <w:tcW w:type="dxa" w:w="3720"/>
+            <w:shd w:fill="F4F6FB" w:color="auto" w:val="clear"/>
+            <w:tcMar>
+              <w:top w:type="dxa" w:w="50"/>
+              <w:left w:type="dxa" w:w="90"/>
+              <w:bottom w:type="dxa" w:w="50"/>
+              <w:right w:type="dxa" w:w="90"/>
+            </w:tcMar>
+          </w:tcPr>
+          <w:p>
+            <w:pPr>
+              <w:spacing w:after="0" w:line="250"/>
+            </w:pPr>
+            <w:r>
+              <w:rPr>
+                <w:rFonts w:ascii="Calibri" w:cs="Calibri" w:eastAsia="Calibri" w:hAnsi="Calibri"/>
+                <w:b w:val="false"/>
+                <w:bCs w:val="false"/>
+                <w:color w:val="23272F"/>
+                <w:sz w:val="18"/>
+                <w:szCs w:val="18"/>
+              </w:rPr>
+              <w:t xml:space="preserve">Restrito. Não exibido ao colaborador nem ao SHE.</w:t>
+            </w:r>
+          </w:p>
+        </w:tc>
+      </w:tr>
+      <w:tr>
+        <w:tc>
+          <w:tcPr>
+            <w:tcW w:type="dxa" w:w="2600"/>
+            <w:shd w:fill="FFFFFF" w:color="auto" w:val="clear"/>
+            <w:tcMar>
+              <w:top w:type="dxa" w:w="50"/>
+              <w:left w:type="dxa" w:w="90"/>
+              <w:bottom w:type="dxa" w:w="50"/>
+              <w:right w:type="dxa" w:w="90"/>
+            </w:tcMar>
+          </w:tcPr>
+          <w:p>
+            <w:pPr>
+              <w:spacing w:after="0" w:line="250"/>
+            </w:pPr>
+            <w:r>
+              <w:rPr>
+                <w:rFonts w:ascii="Calibri" w:cs="Calibri" w:eastAsia="Calibri" w:hAnsi="Calibri"/>
+                <w:color w:val="23272F"/>
+                <w:sz w:val="18"/>
+                <w:szCs w:val="18"/>
+              </w:rPr>
+              <w:t xml:space="preserve">Habilitações ativas</w:t>
+            </w:r>
+          </w:p>
+        </w:tc>
+        <w:tc>
+          <w:tcPr>
+            <w:tcW w:type="dxa" w:w="1900"/>
+            <w:shd w:fill="FFFFFF" w:color="auto" w:val="clear"/>
+            <w:tcMar>
+              <w:top w:type="dxa" w:w="50"/>
+              <w:left w:type="dxa" w:w="90"/>
+              <w:bottom w:type="dxa" w:w="50"/>
+              <w:right w:type="dxa" w:w="90"/>
+            </w:tcMar>
+          </w:tcPr>
+          <w:p>
+            <w:pPr>
+              <w:spacing w:after="0" w:line="250"/>
+            </w:pPr>
+            <w:r>
+              <w:rPr>
+                <w:rFonts w:ascii="Calibri" w:cs="Calibri" w:eastAsia="Calibri" w:hAnsi="Calibri"/>
+                <w:b w:val="false"/>
+                <w:bCs w:val="false"/>
+                <w:color w:val="23272F"/>
+                <w:sz w:val="18"/>
+                <w:szCs w:val="18"/>
+              </w:rPr>
+              <w:t xml:space="preserve">Base</w:t>
+            </w:r>
+          </w:p>
+        </w:tc>
+        <w:tc>
+          <w:tcPr>
+            <w:tcW w:type="dxa" w:w="3720"/>
+            <w:shd w:fill="FFFFFF" w:color="auto" w:val="clear"/>
+            <w:tcMar>
+              <w:top w:type="dxa" w:w="50"/>
+              <w:left w:type="dxa" w:w="90"/>
+              <w:bottom w:type="dxa" w:w="50"/>
+              <w:right w:type="dxa" w:w="90"/>
+            </w:tcMar>
+          </w:tcPr>
+          <w:p>
+            <w:pPr>
+              <w:spacing w:after="0" w:line="250"/>
+            </w:pPr>
+            <w:r>
+              <w:rPr>
+                <w:rFonts w:ascii="Calibri" w:cs="Calibri" w:eastAsia="Calibri" w:hAnsi="Calibri"/>
+                <w:b w:val="false"/>
+                <w:bCs w:val="false"/>
+                <w:color w:val="23272F"/>
+                <w:sz w:val="18"/>
+                <w:szCs w:val="18"/>
+              </w:rPr>
+              <w:t xml:space="preserve">Cada uma com data de vencimento e status.</w:t>
+            </w:r>
+          </w:p>
+        </w:tc>
+      </w:tr>
+      <w:tr>
+        <w:tc>
+          <w:tcPr>
+            <w:tcW w:type="dxa" w:w="2600"/>
+            <w:shd w:fill="F4F6FB" w:color="auto" w:val="clear"/>
+            <w:tcMar>
+              <w:top w:type="dxa" w:w="50"/>
+              <w:left w:type="dxa" w:w="90"/>
+              <w:bottom w:type="dxa" w:w="50"/>
+              <w:right w:type="dxa" w:w="90"/>
+            </w:tcMar>
+          </w:tcPr>
+          <w:p>
+            <w:pPr>
+              <w:spacing w:after="0" w:line="250"/>
+            </w:pPr>
+            <w:r>
+              <w:rPr>
+                <w:rFonts w:ascii="Calibri" w:cs="Calibri" w:eastAsia="Calibri" w:hAnsi="Calibri"/>
+                <w:color w:val="23272F"/>
+                <w:sz w:val="18"/>
+                <w:szCs w:val="18"/>
+              </w:rPr>
+              <w:t xml:space="preserve">Não habilitado</w:t>
+            </w:r>
+          </w:p>
+        </w:tc>
+        <w:tc>
+          <w:tcPr>
+            <w:tcW w:type="dxa" w:w="1900"/>
+            <w:shd w:fill="F4F6FB" w:color="auto" w:val="clear"/>
+            <w:tcMar>
+              <w:top w:type="dxa" w:w="50"/>
+              <w:left w:type="dxa" w:w="90"/>
+              <w:bottom w:type="dxa" w:w="50"/>
+              <w:right w:type="dxa" w:w="90"/>
+            </w:tcMar>
+          </w:tcPr>
+          <w:p>
+            <w:pPr>
+              <w:spacing w:after="0" w:line="250"/>
+            </w:pPr>
+            <w:r>
+              <w:rPr>
+                <w:rFonts w:ascii="Calibri" w:cs="Calibri" w:eastAsia="Calibri" w:hAnsi="Calibri"/>
+                <w:b w:val="false"/>
+                <w:bCs w:val="false"/>
+                <w:color w:val="23272F"/>
+                <w:sz w:val="18"/>
+                <w:szCs w:val="18"/>
+              </w:rPr>
+              <w:t xml:space="preserve">Derivado</w:t>
+            </w:r>
+          </w:p>
+        </w:tc>
+        <w:tc>
+          <w:tcPr>
+            <w:tcW w:type="dxa" w:w="3720"/>
+            <w:shd w:fill="F4F6FB" w:color="auto" w:val="clear"/>
+            <w:tcMar>
+              <w:top w:type="dxa" w:w="50"/>
+              <w:left w:type="dxa" w:w="90"/>
+              <w:bottom w:type="dxa" w:w="50"/>
+              <w:right w:type="dxa" w:w="90"/>
+            </w:tcMar>
+          </w:tcPr>
+          <w:p>
+            <w:pPr>
+              <w:spacing w:after="0" w:line="250"/>
+            </w:pPr>
+            <w:r>
+              <w:rPr>
+                <w:rFonts w:ascii="Calibri" w:cs="Calibri" w:eastAsia="Calibri" w:hAnsi="Calibri"/>
+                <w:b w:val="false"/>
+                <w:bCs w:val="false"/>
+                <w:color w:val="23272F"/>
+                <w:sz w:val="18"/>
+                <w:szCs w:val="18"/>
+              </w:rPr>
+              <w:t xml:space="preserve">Relação do que a pessoa não possui.</w:t>
+            </w:r>
+          </w:p>
+        </w:tc>
+      </w:tr>
+      <w:tr>
+        <w:tc>
+          <w:tcPr>
+            <w:tcW w:type="dxa" w:w="2600"/>
+            <w:shd w:fill="FFFFFF" w:color="auto" w:val="clear"/>
+            <w:tcMar>
+              <w:top w:type="dxa" w:w="50"/>
+              <w:left w:type="dxa" w:w="90"/>
+              <w:bottom w:type="dxa" w:w="50"/>
+              <w:right w:type="dxa" w:w="90"/>
+            </w:tcMar>
+          </w:tcPr>
+          <w:p>
+            <w:pPr>
+              <w:spacing w:after="0" w:line="250"/>
+            </w:pPr>
+            <w:r>
+              <w:rPr>
+                <w:rFonts w:ascii="Calibri" w:cs="Calibri" w:eastAsia="Calibri" w:hAnsi="Calibri"/>
+                <w:color w:val="23272F"/>
+                <w:sz w:val="18"/>
+                <w:szCs w:val="18"/>
+              </w:rPr>
+              <w:t xml:space="preserve">Visto SHE</w:t>
+            </w:r>
+          </w:p>
+        </w:tc>
+        <w:tc>
+          <w:tcPr>
+            <w:tcW w:type="dxa" w:w="1900"/>
+            <w:shd w:fill="FFFFFF" w:color="auto" w:val="clear"/>
+            <w:tcMar>
+              <w:top w:type="dxa" w:w="50"/>
+              <w:left w:type="dxa" w:w="90"/>
+              <w:bottom w:type="dxa" w:w="50"/>
+              <w:right w:type="dxa" w:w="90"/>
+            </w:tcMar>
+          </w:tcPr>
+          <w:p>
+            <w:pPr>
+              <w:spacing w:after="0" w:line="250"/>
+            </w:pPr>
+            <w:r>
+              <w:rPr>
+                <w:rFonts w:ascii="Calibri" w:cs="Calibri" w:eastAsia="Calibri" w:hAnsi="Calibri"/>
+                <w:b w:val="false"/>
+                <w:bCs w:val="false"/>
+                <w:color w:val="23272F"/>
+                <w:sz w:val="18"/>
+                <w:szCs w:val="18"/>
+              </w:rPr>
+              <w:t xml:space="preserve">Sistema</w:t>
+            </w:r>
+          </w:p>
+        </w:tc>
+        <w:tc>
+          <w:tcPr>
+            <w:tcW w:type="dxa" w:w="3720"/>
+            <w:shd w:fill="FFFFFF" w:color="auto" w:val="clear"/>
+            <w:tcMar>
+              <w:top w:type="dxa" w:w="50"/>
+              <w:left w:type="dxa" w:w="90"/>
+              <w:bottom w:type="dxa" w:w="50"/>
+              <w:right w:type="dxa" w:w="90"/>
+            </w:tcMar>
+          </w:tcPr>
+          <w:p>
+            <w:pPr>
+              <w:spacing w:after="0" w:line="250"/>
+            </w:pPr>
+            <w:r>
+              <w:rPr>
+                <w:rFonts w:ascii="Calibri" w:cs="Calibri" w:eastAsia="Calibri" w:hAnsi="Calibri"/>
+                <w:b w:val="false"/>
+                <w:bCs w:val="false"/>
+                <w:color w:val="23272F"/>
+                <w:sz w:val="18"/>
+                <w:szCs w:val="18"/>
+              </w:rPr>
+              <w:t xml:space="preserve">Selo digital de Segurança.</w:t>
+            </w:r>
+          </w:p>
+        </w:tc>
+      </w:tr>
+      <w:tr>
+        <w:tc>
+          <w:tcPr>
+            <w:tcW w:type="dxa" w:w="2600"/>
+            <w:shd w:fill="F4F6FB" w:color="auto" w:val="clear"/>
+            <w:tcMar>
+              <w:top w:type="dxa" w:w="50"/>
+              <w:left w:type="dxa" w:w="90"/>
+              <w:bottom w:type="dxa" w:w="50"/>
+              <w:right w:type="dxa" w:w="90"/>
+            </w:tcMar>
+          </w:tcPr>
+          <w:p>
+            <w:pPr>
+              <w:spacing w:after="0" w:line="250"/>
+            </w:pPr>
+            <w:r>
+              <w:rPr>
+                <w:rFonts w:ascii="Calibri" w:cs="Calibri" w:eastAsia="Calibri" w:hAnsi="Calibri"/>
+                <w:color w:val="23272F"/>
+                <w:sz w:val="18"/>
+                <w:szCs w:val="18"/>
+              </w:rPr>
+              <w:t xml:space="preserve">Selo, código e QR de verificação</w:t>
+            </w:r>
+          </w:p>
+        </w:tc>
+        <w:tc>
+          <w:tcPr>
+            <w:tcW w:type="dxa" w:w="1900"/>
+            <w:shd w:fill="F4F6FB" w:color="auto" w:val="clear"/>
+            <w:tcMar>
+              <w:top w:type="dxa" w:w="50"/>
+              <w:left w:type="dxa" w:w="90"/>
+              <w:bottom w:type="dxa" w:w="50"/>
+              <w:right w:type="dxa" w:w="90"/>
+            </w:tcMar>
+          </w:tcPr>
+          <w:p>
+            <w:pPr>
+              <w:spacing w:after="0" w:line="250"/>
+            </w:pPr>
+            <w:r>
+              <w:rPr>
+                <w:rFonts w:ascii="Calibri" w:cs="Calibri" w:eastAsia="Calibri" w:hAnsi="Calibri"/>
+                <w:b w:val="false"/>
+                <w:bCs w:val="false"/>
+                <w:color w:val="23272F"/>
+                <w:sz w:val="18"/>
+                <w:szCs w:val="18"/>
+              </w:rPr>
+              <w:t xml:space="preserve">Sistema</w:t>
+            </w:r>
+          </w:p>
+        </w:tc>
+        <w:tc>
+          <w:tcPr>
+            <w:tcW w:type="dxa" w:w="3720"/>
+            <w:shd w:fill="F4F6FB" w:color="auto" w:val="clear"/>
+            <w:tcMar>
+              <w:top w:type="dxa" w:w="50"/>
+              <w:left w:type="dxa" w:w="90"/>
+              <w:bottom w:type="dxa" w:w="50"/>
+              <w:right w:type="dxa" w:w="90"/>
+            </w:tcMar>
+          </w:tcPr>
+          <w:p>
+            <w:pPr>
+              <w:spacing w:after="0" w:line="250"/>
+            </w:pPr>
+            <w:r>
+              <w:rPr>
+                <w:rFonts w:ascii="Calibri" w:cs="Calibri" w:eastAsia="Calibri" w:hAnsi="Calibri"/>
+                <w:b w:val="false"/>
+                <w:bCs w:val="false"/>
+                <w:color w:val="23272F"/>
+                <w:sz w:val="18"/>
+                <w:szCs w:val="18"/>
+              </w:rPr>
+              <w:t xml:space="preserve">Autenticação do documento.</w:t>
+            </w:r>
+          </w:p>
+        </w:tc>
+      </w:tr>
+    </w:tbl>
     <w:p>
       <w:pPr>
         <w:pStyle w:val="ListParagraph"/>
@@ -2089,156 +4918,6 @@
       <w:r>
         <w:rPr>
           <w:rFonts w:ascii="Calibri" w:cs="Calibri" w:eastAsia="Calibri" w:hAnsi="Calibri"/>
-          <w:b/>
-          <w:bCs/>
-          <w:color w:val="23272F"/>
-          <w:sz w:val="21"/>
-          <w:szCs w:val="21"/>
-        </w:rPr>
-        <w:t xml:space="preserve">Cabeçalho: </w:t>
-      </w:r>
-      <w:r>
-        <w:rPr>
-          <w:rFonts w:ascii="Calibri" w:cs="Calibri" w:eastAsia="Calibri" w:hAnsi="Calibri"/>
-          <w:color w:val="23272F"/>
-          <w:sz w:val="21"/>
-          <w:szCs w:val="21"/>
-        </w:rPr>
-        <w:t xml:space="preserve">identidade visual Unilever e referência à Portaria 3.214 de 08/06/1978.</w:t>
-      </w:r>
-    </w:p>
-    <w:p>
-      <w:pPr>
-        <w:pStyle w:val="ListParagraph"/>
-        <w:numPr>
-          <w:ilvl w:val="0"/>
-          <w:numId w:val="1"/>
-        </w:numPr>
-        <w:spacing w:after="60" w:line="270"/>
-      </w:pPr>
-      <w:r>
-        <w:rPr>
-          <w:rFonts w:ascii="Calibri" w:cs="Calibri" w:eastAsia="Calibri" w:hAnsi="Calibri"/>
-          <w:b/>
-          <w:bCs/>
-          <w:color w:val="23272F"/>
-          <w:sz w:val="21"/>
-          <w:szCs w:val="21"/>
-        </w:rPr>
-        <w:t xml:space="preserve">Dados de identificação: </w:t>
-      </w:r>
-      <w:r>
-        <w:rPr>
-          <w:rFonts w:ascii="Calibri" w:cs="Calibri" w:eastAsia="Calibri" w:hAnsi="Calibri"/>
-          <w:color w:val="23272F"/>
-          <w:sz w:val="21"/>
-          <w:szCs w:val="21"/>
-        </w:rPr>
-        <w:t xml:space="preserve">foto, nome, empresa, função, RE, área e turno.</w:t>
-      </w:r>
-    </w:p>
-    <w:p>
-      <w:pPr>
-        <w:pStyle w:val="ListParagraph"/>
-        <w:numPr>
-          <w:ilvl w:val="0"/>
-          <w:numId w:val="1"/>
-        </w:numPr>
-        <w:spacing w:after="60" w:line="270"/>
-      </w:pPr>
-      <w:r>
-        <w:rPr>
-          <w:rFonts w:ascii="Calibri" w:cs="Calibri" w:eastAsia="Calibri" w:hAnsi="Calibri"/>
-          <w:b/>
-          <w:bCs/>
-          <w:color w:val="23272F"/>
-          <w:sz w:val="21"/>
-          <w:szCs w:val="21"/>
-        </w:rPr>
-        <w:t xml:space="preserve">Renovação da integração e renovação do ASO: </w:t>
-      </w:r>
-      <w:r>
-        <w:rPr>
-          <w:rFonts w:ascii="Calibri" w:cs="Calibri" w:eastAsia="Calibri" w:hAnsi="Calibri"/>
-          <w:color w:val="23272F"/>
-          <w:sz w:val="21"/>
-          <w:szCs w:val="21"/>
-        </w:rPr>
-        <w:t xml:space="preserve">com data e sinalização de validade.</w:t>
-      </w:r>
-    </w:p>
-    <w:p>
-      <w:pPr>
-        <w:pStyle w:val="ListParagraph"/>
-        <w:numPr>
-          <w:ilvl w:val="0"/>
-          <w:numId w:val="1"/>
-        </w:numPr>
-        <w:spacing w:after="60" w:line="270"/>
-      </w:pPr>
-      <w:r>
-        <w:rPr>
-          <w:rFonts w:ascii="Calibri" w:cs="Calibri" w:eastAsia="Calibri" w:hAnsi="Calibri"/>
-          <w:b/>
-          <w:bCs/>
-          <w:color w:val="23272F"/>
-          <w:sz w:val="21"/>
-          <w:szCs w:val="21"/>
-        </w:rPr>
-        <w:t xml:space="preserve">Validade dos treinamentos: </w:t>
-      </w:r>
-      <w:r>
-        <w:rPr>
-          <w:rFonts w:ascii="Calibri" w:cs="Calibri" w:eastAsia="Calibri" w:hAnsi="Calibri"/>
-          <w:color w:val="23272F"/>
-          <w:sz w:val="21"/>
-          <w:szCs w:val="21"/>
-        </w:rPr>
-        <w:t xml:space="preserve">lista das habilitações ativas com data de vencimento e status colorido, além da relação do que a pessoa não está habilitada.</w:t>
-      </w:r>
-    </w:p>
-    <w:p>
-      <w:pPr>
-        <w:pStyle w:val="ListParagraph"/>
-        <w:numPr>
-          <w:ilvl w:val="0"/>
-          <w:numId w:val="1"/>
-        </w:numPr>
-        <w:spacing w:after="60" w:line="270"/>
-      </w:pPr>
-      <w:r>
-        <w:rPr>
-          <w:rFonts w:ascii="Calibri" w:cs="Calibri" w:eastAsia="Calibri" w:hAnsi="Calibri"/>
-          <w:b/>
-          <w:bCs/>
-          <w:color w:val="23272F"/>
-          <w:sz w:val="21"/>
-          <w:szCs w:val="21"/>
-        </w:rPr>
-        <w:t xml:space="preserve">Vistos digitais: </w:t>
-      </w:r>
-      <w:r>
-        <w:rPr>
-          <w:rFonts w:ascii="Calibri" w:cs="Calibri" w:eastAsia="Calibri" w:hAnsi="Calibri"/>
-          <w:color w:val="23272F"/>
-          <w:sz w:val="21"/>
-          <w:szCs w:val="21"/>
-        </w:rPr>
-        <w:t xml:space="preserve">visto de SHE (segurança) e visto de saúde (ASO).</w:t>
-      </w:r>
-    </w:p>
-    <w:p>
-      <w:pPr>
-        <w:pStyle w:val="ListParagraph"/>
-        <w:numPr>
-          <w:ilvl w:val="0"/>
-          <w:numId w:val="1"/>
-        </w:numPr>
-        <w:spacing w:after="60" w:line="270"/>
-      </w:pPr>
-      <w:r>
-        <w:rPr>
-          <w:rFonts w:ascii="Calibri" w:cs="Calibri" w:eastAsia="Calibri" w:hAnsi="Calibri"/>
           <w:color w:val="23272F"/>
           <w:sz w:val="21"/>
           <w:szCs w:val="21"/>
@@ -2274,7 +4953,7 @@
           <w:sz w:val="21"/>
           <w:szCs w:val="21"/>
         </w:rPr>
-        <w:t xml:space="preserve">Reproduz a carteirinha de autorização para trabalhos especializados. Lista fixa de atividades, cada uma com data de validade e visto de SHE:</w:t>
+        <w:t xml:space="preserve">Reproduz a carteirinha de autorização para trabalhos especializados. Lista fixa de atividades, cada uma com data "Até" e visto de SHE:</w:t>
       </w:r>
     </w:p>
     <w:tbl>
@@ -2921,44 +5600,22 @@
       <w:r>
         <w:rPr>
           <w:rFonts w:ascii="Calibri" w:cs="Calibri" w:eastAsia="Calibri" w:hAnsi="Calibri"/>
-          <w:color w:val="23272F"/>
-          <w:sz w:val="21"/>
-          <w:szCs w:val="21"/>
-        </w:rPr>
-        <w:t xml:space="preserve">Atividade autorizada exibe a data "Até" e o visto de SHE. Atividade sem habilitação exibe o rótulo "Não autorizado", em vez de ficar em branco.</w:t>
-      </w:r>
-    </w:p>
-    <w:p>
-      <w:pPr>
-        <w:spacing w:after="120" w:before="0" w:line="276"/>
-      </w:pPr>
-      <w:r>
-        <w:rPr>
-          <w:rFonts w:ascii="Calibri" w:cs="Calibri" w:eastAsia="Calibri" w:hAnsi="Calibri"/>
-          <w:i/>
-          <w:iCs/>
-          <w:color w:val="5B6478"/>
-          <w:sz w:val="21"/>
-          <w:szCs w:val="21"/>
-        </w:rPr>
-        <w:t xml:space="preserve">A lista de temas acima pode sofrer atualizações pontuais por parte da Unilever, mantendo aproximadamente a mesma quantidade de itens.</w:t>
-      </w:r>
-    </w:p>
-    <w:p>
-      <w:pPr>
-        <w:pStyle w:val="Heading2"/>
-        <w:spacing w:after="100" w:before="220"/>
-      </w:pPr>
-      <w:r>
-        <w:rPr>
-          <w:rFonts w:ascii="Calibri" w:cs="Calibri" w:eastAsia="Calibri" w:hAnsi="Calibri"/>
           <w:b/>
           <w:bCs/>
-          <w:color w:val="0E1424"/>
-          <w:sz w:val="24"/>
-          <w:szCs w:val="24"/>
-        </w:rPr>
-        <w:t xml:space="preserve">5.4. Painel de conformidade</w:t>
+          <w:color w:val="23272F"/>
+          <w:sz w:val="21"/>
+          <w:szCs w:val="21"/>
+        </w:rPr>
+        <w:t xml:space="preserve">Autorizado: </w:t>
+      </w:r>
+      <w:r>
+        <w:rPr>
+          <w:rFonts w:ascii="Calibri" w:cs="Calibri" w:eastAsia="Calibri" w:hAnsi="Calibri"/>
+          <w:color w:val="23272F"/>
+          <w:sz w:val="21"/>
+          <w:szCs w:val="21"/>
+        </w:rPr>
+        <w:t xml:space="preserve">exibe a data "Até" e o visto de SHE.</w:t>
       </w:r>
     </w:p>
     <w:p>
@@ -2973,11 +5630,22 @@
       <w:r>
         <w:rPr>
           <w:rFonts w:ascii="Calibri" w:cs="Calibri" w:eastAsia="Calibri" w:hAnsi="Calibri"/>
-          <w:color w:val="23272F"/>
-          <w:sz w:val="21"/>
-          <w:szCs w:val="21"/>
-        </w:rPr>
-        <w:t xml:space="preserve">Indicadores gerais: total de colaboradores, treinamentos válidos, vencendo em 30 dias e vencidos.</w:t>
+          <w:b/>
+          <w:bCs/>
+          <w:color w:val="23272F"/>
+          <w:sz w:val="21"/>
+          <w:szCs w:val="21"/>
+        </w:rPr>
+        <w:t xml:space="preserve">Vencido: </w:t>
+      </w:r>
+      <w:r>
+        <w:rPr>
+          <w:rFonts w:ascii="Calibri" w:cs="Calibri" w:eastAsia="Calibri" w:hAnsi="Calibri"/>
+          <w:color w:val="23272F"/>
+          <w:sz w:val="21"/>
+          <w:szCs w:val="21"/>
+        </w:rPr>
+        <w:t xml:space="preserve">exibe "Vencido" e sinaliza a necessidade de revalidar.</w:t>
       </w:r>
     </w:p>
     <w:p>
@@ -2992,11 +5660,22 @@
       <w:r>
         <w:rPr>
           <w:rFonts w:ascii="Calibri" w:cs="Calibri" w:eastAsia="Calibri" w:hAnsi="Calibri"/>
-          <w:color w:val="23272F"/>
-          <w:sz w:val="21"/>
-          <w:szCs w:val="21"/>
-        </w:rPr>
-        <w:t xml:space="preserve">Percentual de conformidade da fábrica.</w:t>
+          <w:b/>
+          <w:bCs/>
+          <w:color w:val="23272F"/>
+          <w:sz w:val="21"/>
+          <w:szCs w:val="21"/>
+        </w:rPr>
+        <w:t xml:space="preserve">Sem habilitação: </w:t>
+      </w:r>
+      <w:r>
+        <w:rPr>
+          <w:rFonts w:ascii="Calibri" w:cs="Calibri" w:eastAsia="Calibri" w:hAnsi="Calibri"/>
+          <w:color w:val="23272F"/>
+          <w:sz w:val="21"/>
+          <w:szCs w:val="21"/>
+        </w:rPr>
+        <w:t xml:space="preserve">exibe o rótulo "Não autorizado", em vez de ficar em branco.</w:t>
       </w:r>
     </w:p>
     <w:p>
@@ -3015,7 +5694,40 @@
           <w:sz w:val="21"/>
           <w:szCs w:val="21"/>
         </w:rPr>
-        <w:t xml:space="preserve">Conformidade por área.</w:t>
+        <w:t xml:space="preserve">Contador de atividades autorizadas (ex.: 4 de 10).</w:t>
+      </w:r>
+    </w:p>
+    <w:p>
+      <w:pPr>
+        <w:spacing w:after="120" w:before="0" w:line="276"/>
+      </w:pPr>
+      <w:r>
+        <w:rPr>
+          <w:rFonts w:ascii="Calibri" w:cs="Calibri" w:eastAsia="Calibri" w:hAnsi="Calibri"/>
+          <w:i/>
+          <w:iCs/>
+          <w:color w:val="5B6478"/>
+          <w:sz w:val="21"/>
+          <w:szCs w:val="21"/>
+        </w:rPr>
+        <w:t xml:space="preserve">A lista de temas pode sofrer atualizações pontuais por parte da Unilever, mantendo aproximadamente a mesma quantidade de itens.</w:t>
+      </w:r>
+    </w:p>
+    <w:p>
+      <w:pPr>
+        <w:pStyle w:val="Heading2"/>
+        <w:spacing w:after="100" w:before="220"/>
+      </w:pPr>
+      <w:r>
+        <w:rPr>
+          <w:rFonts w:ascii="Calibri" w:cs="Calibri" w:eastAsia="Calibri" w:hAnsi="Calibri"/>
+          <w:b/>
+          <w:bCs/>
+          <w:color w:val="0E1424"/>
+          <w:sz w:val="24"/>
+          <w:szCs w:val="24"/>
+        </w:rPr>
+        <w:t xml:space="preserve">5.4. Painel de conformidade</w:t>
       </w:r>
     </w:p>
     <w:p>
@@ -3034,7 +5746,7 @@
           <w:sz w:val="21"/>
           <w:szCs w:val="21"/>
         </w:rPr>
-        <w:t xml:space="preserve">Distribuição de habilitações por treinamento.</w:t>
+        <w:t xml:space="preserve">Indicadores: total de colaboradores, treinamentos válidos, vencendo em 60 dias e vencidos.</w:t>
       </w:r>
     </w:p>
     <w:p>
@@ -3053,24 +5765,7 @@
           <w:sz w:val="21"/>
           <w:szCs w:val="21"/>
         </w:rPr>
-        <w:t xml:space="preserve">Lista de vencimentos próximos.</w:t>
-      </w:r>
-    </w:p>
-    <w:p>
-      <w:pPr>
-        <w:pStyle w:val="Heading2"/>
-        <w:spacing w:after="100" w:before="220"/>
-      </w:pPr>
-      <w:r>
-        <w:rPr>
-          <w:rFonts w:ascii="Calibri" w:cs="Calibri" w:eastAsia="Calibri" w:hAnsi="Calibri"/>
-          <w:b/>
-          <w:bCs/>
-          <w:color w:val="0E1424"/>
-          <w:sz w:val="24"/>
-          <w:szCs w:val="24"/>
-        </w:rPr>
-        <w:t xml:space="preserve">5.5. Gestão de colaboradores</w:t>
+        <w:t xml:space="preserve">Percentual de conformidade geral da fábrica.</w:t>
       </w:r>
     </w:p>
     <w:p>
@@ -3089,7 +5784,7 @@
           <w:sz w:val="21"/>
           <w:szCs w:val="21"/>
         </w:rPr>
-        <w:t xml:space="preserve">Lista de colaboradores com busca por nome ou RE e filtros por área, turno, situação e vínculo (ativo ou inativo).</w:t>
+        <w:t xml:space="preserve">Gráfico de conformidade por área.</w:t>
       </w:r>
     </w:p>
     <w:p>
@@ -3108,7 +5803,7 @@
           <w:sz w:val="21"/>
           <w:szCs w:val="21"/>
         </w:rPr>
-        <w:t xml:space="preserve">Ficha do colaborador com dados, histórico de treinamentos e carteirinha.</w:t>
+        <w:t xml:space="preserve">Gráfico de distribuição de habilitações por treinamento.</w:t>
       </w:r>
     </w:p>
     <w:p>
@@ -3127,7 +5822,7 @@
           <w:sz w:val="21"/>
           <w:szCs w:val="21"/>
         </w:rPr>
-        <w:t xml:space="preserve">Ações de reemissão e envio do link da carteirinha.</w:t>
+        <w:t xml:space="preserve">Lista de vencimentos dos próximos 60 dias, com atalho para o detalhe.</w:t>
       </w:r>
     </w:p>
     <w:p>
@@ -3142,22 +5837,11 @@
       <w:r>
         <w:rPr>
           <w:rFonts w:ascii="Calibri" w:cs="Calibri" w:eastAsia="Calibri" w:hAnsi="Calibri"/>
-          <w:b/>
-          <w:bCs/>
-          <w:color w:val="23272F"/>
-          <w:sz w:val="21"/>
-          <w:szCs w:val="21"/>
-        </w:rPr>
-        <w:t xml:space="preserve">Desligamento por inativação: </w:t>
-      </w:r>
-      <w:r>
-        <w:rPr>
-          <w:rFonts w:ascii="Calibri" w:cs="Calibri" w:eastAsia="Calibri" w:hAnsi="Calibri"/>
-          <w:color w:val="23272F"/>
-          <w:sz w:val="21"/>
-          <w:szCs w:val="21"/>
-        </w:rPr>
-        <w:t xml:space="preserve">ao sair, o colaborador é inativado, não excluído. Ele sai das listas ativas e da consulta por RE, mas o histórico é preservado para auditoria. Nada é apagado da base. Um colaborador inativado pode ser reativado.</w:t>
+          <w:color w:val="23272F"/>
+          <w:sz w:val="21"/>
+          <w:szCs w:val="21"/>
+        </w:rPr>
+        <w:t xml:space="preserve">Ações rápidas: sincronizar e exportar.</w:t>
       </w:r>
     </w:p>
     <w:p>
@@ -3174,7 +5858,7 @@
           <w:sz w:val="24"/>
           <w:szCs w:val="24"/>
         </w:rPr>
-        <w:t xml:space="preserve">5.6. Gestão de treinamentos</w:t>
+        <w:t xml:space="preserve">5.5. Gestão de colaboradores</w:t>
       </w:r>
     </w:p>
     <w:p>
@@ -3189,11 +5873,22 @@
       <w:r>
         <w:rPr>
           <w:rFonts w:ascii="Calibri" w:cs="Calibri" w:eastAsia="Calibri" w:hAnsi="Calibri"/>
-          <w:color w:val="23272F"/>
-          <w:sz w:val="21"/>
-          <w:szCs w:val="21"/>
-        </w:rPr>
-        <w:t xml:space="preserve">Catálogo de tipos de treinamento.</w:t>
+          <w:b/>
+          <w:bCs/>
+          <w:color w:val="23272F"/>
+          <w:sz w:val="21"/>
+          <w:szCs w:val="21"/>
+        </w:rPr>
+        <w:t xml:space="preserve">Lista: </w:t>
+      </w:r>
+      <w:r>
+        <w:rPr>
+          <w:rFonts w:ascii="Calibri" w:cs="Calibri" w:eastAsia="Calibri" w:hAnsi="Calibri"/>
+          <w:color w:val="23272F"/>
+          <w:sz w:val="21"/>
+          <w:szCs w:val="21"/>
+        </w:rPr>
+        <w:t xml:space="preserve">colunas de colaborador (nome/RE), área, turno, gestor, nº de treinamentos e situação.</w:t>
       </w:r>
     </w:p>
     <w:p>
@@ -3208,11 +5903,22 @@
       <w:r>
         <w:rPr>
           <w:rFonts w:ascii="Calibri" w:cs="Calibri" w:eastAsia="Calibri" w:hAnsi="Calibri"/>
-          <w:color w:val="23272F"/>
-          <w:sz w:val="21"/>
-          <w:szCs w:val="21"/>
-        </w:rPr>
-        <w:t xml:space="preserve">Cadastro, edição e exclusão de treinamentos.</w:t>
+          <w:b/>
+          <w:bCs/>
+          <w:color w:val="23272F"/>
+          <w:sz w:val="21"/>
+          <w:szCs w:val="21"/>
+        </w:rPr>
+        <w:t xml:space="preserve">Busca e filtros: </w:t>
+      </w:r>
+      <w:r>
+        <w:rPr>
+          <w:rFonts w:ascii="Calibri" w:cs="Calibri" w:eastAsia="Calibri" w:hAnsi="Calibri"/>
+          <w:color w:val="23272F"/>
+          <w:sz w:val="21"/>
+          <w:szCs w:val="21"/>
+        </w:rPr>
+        <w:t xml:space="preserve">busca por nome ou RE; filtros por área, turno, situação (em dia, vencendo, com vencidos) e vínculo (ativo, inativo, todos).</w:t>
       </w:r>
     </w:p>
     <w:p>
@@ -3227,11 +5933,22 @@
       <w:r>
         <w:rPr>
           <w:rFonts w:ascii="Calibri" w:cs="Calibri" w:eastAsia="Calibri" w:hAnsi="Calibri"/>
-          <w:color w:val="23272F"/>
-          <w:sz w:val="21"/>
-          <w:szCs w:val="21"/>
-        </w:rPr>
-        <w:t xml:space="preserve">Ativação e desativação de um treinamento.</w:t>
+          <w:b/>
+          <w:bCs/>
+          <w:color w:val="23272F"/>
+          <w:sz w:val="21"/>
+          <w:szCs w:val="21"/>
+        </w:rPr>
+        <w:t xml:space="preserve">Ficha do colaborador: </w:t>
+      </w:r>
+      <w:r>
+        <w:rPr>
+          <w:rFonts w:ascii="Calibri" w:cs="Calibri" w:eastAsia="Calibri" w:hAnsi="Calibri"/>
+          <w:color w:val="23272F"/>
+          <w:sz w:val="21"/>
+          <w:szCs w:val="21"/>
+        </w:rPr>
+        <w:t xml:space="preserve">dados cadastrais, histórico completo de treinamentos (realizado, vencimento e situação) e a carteirinha ao lado.</w:t>
       </w:r>
     </w:p>
     <w:p>
@@ -3250,7 +5967,7 @@
           <w:sz w:val="21"/>
           <w:szCs w:val="21"/>
         </w:rPr>
-        <w:t xml:space="preserve">Definição do tipo (Legal, Mandatório, UMS), da validade e da categoria.</w:t>
+        <w:t xml:space="preserve">Ações na ficha: reemitir carteirinha, enviar link e adicionar treinamento manual.</w:t>
       </w:r>
     </w:p>
     <w:p>
@@ -3265,11 +5982,22 @@
       <w:r>
         <w:rPr>
           <w:rFonts w:ascii="Calibri" w:cs="Calibri" w:eastAsia="Calibri" w:hAnsi="Calibri"/>
-          <w:color w:val="23272F"/>
-          <w:sz w:val="21"/>
-          <w:szCs w:val="21"/>
-        </w:rPr>
-        <w:t xml:space="preserve">Visão de quantos colaboradores estão habilitados e quantos estão vencidos por treinamento.</w:t>
+          <w:b/>
+          <w:bCs/>
+          <w:color w:val="23272F"/>
+          <w:sz w:val="21"/>
+          <w:szCs w:val="21"/>
+        </w:rPr>
+        <w:t xml:space="preserve">Desligamento por inativação: </w:t>
+      </w:r>
+      <w:r>
+        <w:rPr>
+          <w:rFonts w:ascii="Calibri" w:cs="Calibri" w:eastAsia="Calibri" w:hAnsi="Calibri"/>
+          <w:color w:val="23272F"/>
+          <w:sz w:val="21"/>
+          <w:szCs w:val="21"/>
+        </w:rPr>
+        <w:t xml:space="preserve">ao sair, o colaborador é inativado, não excluído. Sai das listas ativas e da consulta por RE, mas o histórico é preservado. Nada é apagado. Pode ser reativado.</w:t>
       </w:r>
     </w:p>
     <w:p>
@@ -3286,7 +6014,7 @@
           <w:sz w:val="24"/>
           <w:szCs w:val="24"/>
         </w:rPr>
-        <w:t xml:space="preserve">5.7. Vencimentos e alertas</w:t>
+        <w:t xml:space="preserve">5.6. Gestão de treinamentos</w:t>
       </w:r>
     </w:p>
     <w:p>
@@ -3301,11 +6029,22 @@
       <w:r>
         <w:rPr>
           <w:rFonts w:ascii="Calibri" w:cs="Calibri" w:eastAsia="Calibri" w:hAnsi="Calibri"/>
-          <w:color w:val="23272F"/>
-          <w:sz w:val="21"/>
-          <w:szCs w:val="21"/>
-        </w:rPr>
-        <w:t xml:space="preserve">Relação de habilitações vencidas e a vencer nos próximos 30 dias, ordenada por urgência.</w:t>
+          <w:b/>
+          <w:bCs/>
+          <w:color w:val="23272F"/>
+          <w:sz w:val="21"/>
+          <w:szCs w:val="21"/>
+        </w:rPr>
+        <w:t xml:space="preserve">Catálogo: </w:t>
+      </w:r>
+      <w:r>
+        <w:rPr>
+          <w:rFonts w:ascii="Calibri" w:cs="Calibri" w:eastAsia="Calibri" w:hAnsi="Calibri"/>
+          <w:color w:val="23272F"/>
+          <w:sz w:val="21"/>
+          <w:szCs w:val="21"/>
+        </w:rPr>
+        <w:t xml:space="preserve">cada treinamento com nome, tipo (Legal, Mandatório, UMS), validade, categoria e situação (ativo/inativo).</w:t>
       </w:r>
     </w:p>
     <w:p>
@@ -3324,7 +6063,7 @@
           <w:sz w:val="21"/>
           <w:szCs w:val="21"/>
         </w:rPr>
-        <w:t xml:space="preserve">Notificação de vencimentos no topo do sistema.</w:t>
+        <w:t xml:space="preserve">Indicadores por treinamento: nº de habilitados e nº de vencidos.</w:t>
       </w:r>
     </w:p>
     <w:p>
@@ -3343,24 +6082,7 @@
           <w:sz w:val="21"/>
           <w:szCs w:val="21"/>
         </w:rPr>
-        <w:t xml:space="preserve">Base para plano de reciclagem e comunicação aos gestores.</w:t>
-      </w:r>
-    </w:p>
-    <w:p>
-      <w:pPr>
-        <w:pStyle w:val="Heading2"/>
-        <w:spacing w:after="100" w:before="220"/>
-      </w:pPr>
-      <w:r>
-        <w:rPr>
-          <w:rFonts w:ascii="Calibri" w:cs="Calibri" w:eastAsia="Calibri" w:hAnsi="Calibri"/>
-          <w:b/>
-          <w:bCs/>
-          <w:color w:val="0E1424"/>
-          <w:sz w:val="24"/>
-          <w:szCs w:val="24"/>
-        </w:rPr>
-        <w:t xml:space="preserve">5.8. Autenticação e verificação</w:t>
+        <w:t xml:space="preserve">Ações: cadastrar, editar, excluir e ativar/desativar um treinamento.</w:t>
       </w:r>
     </w:p>
     <w:p>
@@ -3379,7 +6101,7 @@
           <w:sz w:val="21"/>
           <w:szCs w:val="21"/>
         </w:rPr>
-        <w:t xml:space="preserve">Selo de documento autenticado em cada carteirinha.</w:t>
+        <w:t xml:space="preserve">Busca por nome e filtro por tipo.</w:t>
       </w:r>
     </w:p>
     <w:p>
@@ -3398,7 +6120,24 @@
           <w:sz w:val="21"/>
           <w:szCs w:val="21"/>
         </w:rPr>
-        <w:t xml:space="preserve">Código único de verificação e QR de autenticação.</w:t>
+        <w:t xml:space="preserve">A validade definida aqui é usada no cálculo de vencimento das habilitações.</w:t>
+      </w:r>
+    </w:p>
+    <w:p>
+      <w:pPr>
+        <w:pStyle w:val="Heading2"/>
+        <w:spacing w:after="100" w:before="220"/>
+      </w:pPr>
+      <w:r>
+        <w:rPr>
+          <w:rFonts w:ascii="Calibri" w:cs="Calibri" w:eastAsia="Calibri" w:hAnsi="Calibri"/>
+          <w:b/>
+          <w:bCs/>
+          <w:color w:val="0E1424"/>
+          <w:sz w:val="24"/>
+          <w:szCs w:val="24"/>
+        </w:rPr>
+        <w:t xml:space="preserve">5.7. Vencimentos e alertas</w:t>
       </w:r>
     </w:p>
     <w:p>
@@ -3417,38 +6156,7 @@
           <w:sz w:val="21"/>
           <w:szCs w:val="21"/>
         </w:rPr>
-        <w:t xml:space="preserve">A carteirinha só é válida com o selo digital ativo, o que substitui a assinatura física.</w:t>
-      </w:r>
-    </w:p>
-    <w:p>
-      <w:pPr>
-        <w:pStyle w:val="Heading2"/>
-        <w:spacing w:after="100" w:before="220"/>
-      </w:pPr>
-      <w:r>
-        <w:rPr>
-          <w:rFonts w:ascii="Calibri" w:cs="Calibri" w:eastAsia="Calibri" w:hAnsi="Calibri"/>
-          <w:b/>
-          <w:bCs/>
-          <w:color w:val="0E1424"/>
-          <w:sz w:val="24"/>
-          <w:szCs w:val="24"/>
-        </w:rPr>
-        <w:t xml:space="preserve">5.9. Auditoria</w:t>
-      </w:r>
-    </w:p>
-    <w:p>
-      <w:pPr>
-        <w:spacing w:after="120" w:before="0" w:line="276"/>
-      </w:pPr>
-      <w:r>
-        <w:rPr>
-          <w:rFonts w:ascii="Calibri" w:cs="Calibri" w:eastAsia="Calibri" w:hAnsi="Calibri"/>
-          <w:color w:val="23272F"/>
-          <w:sz w:val="21"/>
-          <w:szCs w:val="21"/>
-        </w:rPr>
-        <w:t xml:space="preserve">A auditoria é o registro de quem fez o quê e quando no sistema. Serve para garantir conformidade e rastreabilidade: em uma fiscalização ou investigação, é possível comprovar que a carteirinha foi emitida com base em dados válidos e saber quem realizou cada ação.</w:t>
+        <w:t xml:space="preserve">Relação de habilitações vencidas e a vencer nos próximos 60 dias, ordenada por urgência.</w:t>
       </w:r>
     </w:p>
     <w:p>
@@ -3467,7 +6175,7 @@
           <w:sz w:val="21"/>
           <w:szCs w:val="21"/>
         </w:rPr>
-        <w:t xml:space="preserve">Registro das ações relevantes (emissão de carteirinha, alteração de treinamento, sincronização de base, sinalização de vencimento).</w:t>
+        <w:t xml:space="preserve">Notificação de vencimentos no topo do sistema, com contador.</w:t>
       </w:r>
     </w:p>
     <w:p>
@@ -3486,7 +6194,7 @@
           <w:sz w:val="21"/>
           <w:szCs w:val="21"/>
         </w:rPr>
-        <w:t xml:space="preserve">Log com data, usuário, ação e alvo. Não pode ser alterado.</w:t>
+        <w:t xml:space="preserve">Ações: notificar gestores e exportar plano de reciclagem.</w:t>
       </w:r>
     </w:p>
     <w:p>
@@ -3503,7 +6211,7 @@
           <w:sz w:val="24"/>
           <w:szCs w:val="24"/>
         </w:rPr>
-        <w:t xml:space="preserve">5.10. Configurações</w:t>
+        <w:t xml:space="preserve">5.8. Autenticação e verificação</w:t>
       </w:r>
     </w:p>
     <w:p>
@@ -3524,16 +6232,16 @@
           <w:sz w:val="21"/>
           <w:szCs w:val="21"/>
         </w:rPr>
-        <w:t xml:space="preserve">Gestão de usuários: </w:t>
-      </w:r>
-      <w:r>
-        <w:rPr>
-          <w:rFonts w:ascii="Calibri" w:cs="Calibri" w:eastAsia="Calibri" w:hAnsi="Calibri"/>
-          <w:color w:val="23272F"/>
-          <w:sz w:val="21"/>
-          <w:szCs w:val="21"/>
-        </w:rPr>
-        <w:t xml:space="preserve">o administrador cria, edita, define o perfil e inativa os usuários da equipe, dentro da própria plataforma.</w:t>
+        <w:t xml:space="preserve">Login da equipe: </w:t>
+      </w:r>
+      <w:r>
+        <w:rPr>
+          <w:rFonts w:ascii="Calibri" w:cs="Calibri" w:eastAsia="Calibri" w:hAnsi="Calibri"/>
+          <w:color w:val="23272F"/>
+          <w:sz w:val="21"/>
+          <w:szCs w:val="21"/>
+        </w:rPr>
+        <w:t xml:space="preserve">e-mail e senha, dentro da plataforma, com recuperação de senha por e-mail.</w:t>
       </w:r>
     </w:p>
     <w:p>
@@ -3552,7 +6260,7 @@
           <w:sz w:val="21"/>
           <w:szCs w:val="21"/>
         </w:rPr>
-        <w:t xml:space="preserve">Perfis de acesso.</w:t>
+        <w:t xml:space="preserve">Selo de documento autenticado em cada carteirinha.</w:t>
       </w:r>
     </w:p>
     <w:p>
@@ -3571,7 +6279,347 @@
           <w:sz w:val="21"/>
           <w:szCs w:val="21"/>
         </w:rPr>
-        <w:t xml:space="preserve">Regra de vencimento e antecedência do alerta.</w:t>
+        <w:t xml:space="preserve">Código único de verificação e QR de autenticação.</w:t>
+      </w:r>
+    </w:p>
+    <w:p>
+      <w:pPr>
+        <w:pStyle w:val="ListParagraph"/>
+        <w:numPr>
+          <w:ilvl w:val="0"/>
+          <w:numId w:val="1"/>
+        </w:numPr>
+        <w:spacing w:after="60" w:line="270"/>
+      </w:pPr>
+      <w:r>
+        <w:rPr>
+          <w:rFonts w:ascii="Calibri" w:cs="Calibri" w:eastAsia="Calibri" w:hAnsi="Calibri"/>
+          <w:color w:val="23272F"/>
+          <w:sz w:val="21"/>
+          <w:szCs w:val="21"/>
+        </w:rPr>
+        <w:t xml:space="preserve">A carteirinha só é válida com o selo digital ativo, o que substitui a assinatura física.</w:t>
+      </w:r>
+    </w:p>
+    <w:p>
+      <w:pPr>
+        <w:pStyle w:val="Heading2"/>
+        <w:spacing w:after="100" w:before="220"/>
+      </w:pPr>
+      <w:r>
+        <w:rPr>
+          <w:rFonts w:ascii="Calibri" w:cs="Calibri" w:eastAsia="Calibri" w:hAnsi="Calibri"/>
+          <w:b/>
+          <w:bCs/>
+          <w:color w:val="0E1424"/>
+          <w:sz w:val="24"/>
+          <w:szCs w:val="24"/>
+        </w:rPr>
+        <w:t xml:space="preserve">5.9. Auditoria</w:t>
+      </w:r>
+    </w:p>
+    <w:p>
+      <w:pPr>
+        <w:spacing w:after="120" w:before="0" w:line="276"/>
+      </w:pPr>
+      <w:r>
+        <w:rPr>
+          <w:rFonts w:ascii="Calibri" w:cs="Calibri" w:eastAsia="Calibri" w:hAnsi="Calibri"/>
+          <w:color w:val="23272F"/>
+          <w:sz w:val="21"/>
+          <w:szCs w:val="21"/>
+        </w:rPr>
+        <w:t xml:space="preserve">Registro de quem fez o quê e quando. Garante conformidade e rastreabilidade: em uma fiscalização, comprova que a carteirinha foi emitida com base em dados válidos e identifica quem realizou cada ação.</w:t>
+      </w:r>
+    </w:p>
+    <w:p>
+      <w:pPr>
+        <w:pStyle w:val="ListParagraph"/>
+        <w:numPr>
+          <w:ilvl w:val="0"/>
+          <w:numId w:val="1"/>
+        </w:numPr>
+        <w:spacing w:after="60" w:line="270"/>
+      </w:pPr>
+      <w:r>
+        <w:rPr>
+          <w:rFonts w:ascii="Calibri" w:cs="Calibri" w:eastAsia="Calibri" w:hAnsi="Calibri"/>
+          <w:color w:val="23272F"/>
+          <w:sz w:val="21"/>
+          <w:szCs w:val="21"/>
+        </w:rPr>
+        <w:t xml:space="preserve">Ações registradas: emissão de carteirinha, alteração de treinamento, cadastro/alteração de usuário, sincronização de base e sinalização de vencimento.</w:t>
+      </w:r>
+    </w:p>
+    <w:p>
+      <w:pPr>
+        <w:pStyle w:val="ListParagraph"/>
+        <w:numPr>
+          <w:ilvl w:val="0"/>
+          <w:numId w:val="1"/>
+        </w:numPr>
+        <w:spacing w:after="60" w:line="270"/>
+      </w:pPr>
+      <w:r>
+        <w:rPr>
+          <w:rFonts w:ascii="Calibri" w:cs="Calibri" w:eastAsia="Calibri" w:hAnsi="Calibri"/>
+          <w:color w:val="23272F"/>
+          <w:sz w:val="21"/>
+          <w:szCs w:val="21"/>
+        </w:rPr>
+        <w:t xml:space="preserve">Cada registro contém data, usuário, ação e alvo. O log não pode ser alterado.</w:t>
+      </w:r>
+    </w:p>
+    <w:p>
+      <w:pPr>
+        <w:pStyle w:val="Heading2"/>
+        <w:spacing w:after="100" w:before="220"/>
+      </w:pPr>
+      <w:r>
+        <w:rPr>
+          <w:rFonts w:ascii="Calibri" w:cs="Calibri" w:eastAsia="Calibri" w:hAnsi="Calibri"/>
+          <w:b/>
+          <w:bCs/>
+          <w:color w:val="0E1424"/>
+          <w:sz w:val="24"/>
+          <w:szCs w:val="24"/>
+        </w:rPr>
+        <w:t xml:space="preserve">5.10. Configurações</w:t>
+      </w:r>
+    </w:p>
+    <w:p>
+      <w:pPr>
+        <w:pStyle w:val="ListParagraph"/>
+        <w:numPr>
+          <w:ilvl w:val="0"/>
+          <w:numId w:val="1"/>
+        </w:numPr>
+        <w:spacing w:after="60" w:line="270"/>
+      </w:pPr>
+      <w:r>
+        <w:rPr>
+          <w:rFonts w:ascii="Calibri" w:cs="Calibri" w:eastAsia="Calibri" w:hAnsi="Calibri"/>
+          <w:b/>
+          <w:bCs/>
+          <w:color w:val="23272F"/>
+          <w:sz w:val="21"/>
+          <w:szCs w:val="21"/>
+        </w:rPr>
+        <w:t xml:space="preserve">Gestão de usuários: </w:t>
+      </w:r>
+      <w:r>
+        <w:rPr>
+          <w:rFonts w:ascii="Calibri" w:cs="Calibri" w:eastAsia="Calibri" w:hAnsi="Calibri"/>
+          <w:color w:val="23272F"/>
+          <w:sz w:val="21"/>
+          <w:szCs w:val="21"/>
+        </w:rPr>
+        <w:t xml:space="preserve">cadastro com nome, e-mail, perfil e situação. O administrador cria, edita, define o perfil e inativa usuários da equipe.</w:t>
+      </w:r>
+    </w:p>
+    <w:p>
+      <w:pPr>
+        <w:pStyle w:val="ListParagraph"/>
+        <w:numPr>
+          <w:ilvl w:val="0"/>
+          <w:numId w:val="1"/>
+        </w:numPr>
+        <w:spacing w:after="60" w:line="270"/>
+      </w:pPr>
+      <w:r>
+        <w:rPr>
+          <w:rFonts w:ascii="Calibri" w:cs="Calibri" w:eastAsia="Calibri" w:hAnsi="Calibri"/>
+          <w:color w:val="23272F"/>
+          <w:sz w:val="21"/>
+          <w:szCs w:val="21"/>
+        </w:rPr>
+        <w:t xml:space="preserve">Perfis de acesso: Administrador, Segurança do Trabalho (SHE), Saúde Ocupacional e Colaborador.</w:t>
+      </w:r>
+    </w:p>
+    <w:p>
+      <w:pPr>
+        <w:pStyle w:val="ListParagraph"/>
+        <w:numPr>
+          <w:ilvl w:val="0"/>
+          <w:numId w:val="1"/>
+        </w:numPr>
+        <w:spacing w:after="60" w:line="270"/>
+      </w:pPr>
+      <w:r>
+        <w:rPr>
+          <w:rFonts w:ascii="Calibri" w:cs="Calibri" w:eastAsia="Calibri" w:hAnsi="Calibri"/>
+          <w:color w:val="23272F"/>
+          <w:sz w:val="21"/>
+          <w:szCs w:val="21"/>
+        </w:rPr>
+        <w:t xml:space="preserve">Regra de vencimento: antecedência do alerta (60 dias) e fórmula de cálculo.</w:t>
+      </w:r>
+    </w:p>
+    <w:p>
+      <w:pPr>
+        <w:pStyle w:val="Heading2"/>
+        <w:spacing w:after="100" w:before="220"/>
+      </w:pPr>
+      <w:r>
+        <w:rPr>
+          <w:rFonts w:ascii="Calibri" w:cs="Calibri" w:eastAsia="Calibri" w:hAnsi="Calibri"/>
+          <w:b/>
+          <w:bCs/>
+          <w:color w:val="0E1424"/>
+          <w:sz w:val="24"/>
+          <w:szCs w:val="24"/>
+        </w:rPr>
+        <w:t xml:space="preserve">5.11. Casos de uso principais</w:t>
+      </w:r>
+    </w:p>
+    <w:p>
+      <w:pPr>
+        <w:pStyle w:val="ListParagraph"/>
+        <w:numPr>
+          <w:ilvl w:val="0"/>
+          <w:numId w:val="1"/>
+        </w:numPr>
+        <w:spacing w:after="60" w:line="270"/>
+      </w:pPr>
+      <w:r>
+        <w:rPr>
+          <w:rFonts w:ascii="Calibri" w:cs="Calibri" w:eastAsia="Calibri" w:hAnsi="Calibri"/>
+          <w:b/>
+          <w:bCs/>
+          <w:color w:val="23272F"/>
+          <w:sz w:val="21"/>
+          <w:szCs w:val="21"/>
+        </w:rPr>
+        <w:t xml:space="preserve">Verificação em campo (SHE): </w:t>
+      </w:r>
+      <w:r>
+        <w:rPr>
+          <w:rFonts w:ascii="Calibri" w:cs="Calibri" w:eastAsia="Calibri" w:hAnsi="Calibri"/>
+          <w:color w:val="23272F"/>
+          <w:sz w:val="21"/>
+          <w:szCs w:val="21"/>
+        </w:rPr>
+        <w:t xml:space="preserve">durante a caminhada de segurança, o SHE pede o RE ou lê o QR e confere, na hora, se o colaborador está apto para a atividade.</w:t>
+      </w:r>
+    </w:p>
+    <w:p>
+      <w:pPr>
+        <w:pStyle w:val="ListParagraph"/>
+        <w:numPr>
+          <w:ilvl w:val="0"/>
+          <w:numId w:val="1"/>
+        </w:numPr>
+        <w:spacing w:after="60" w:line="270"/>
+      </w:pPr>
+      <w:r>
+        <w:rPr>
+          <w:rFonts w:ascii="Calibri" w:cs="Calibri" w:eastAsia="Calibri" w:hAnsi="Calibri"/>
+          <w:b/>
+          <w:bCs/>
+          <w:color w:val="23272F"/>
+          <w:sz w:val="21"/>
+          <w:szCs w:val="21"/>
+        </w:rPr>
+        <w:t xml:space="preserve">Consulta do colaborador: </w:t>
+      </w:r>
+      <w:r>
+        <w:rPr>
+          <w:rFonts w:ascii="Calibri" w:cs="Calibri" w:eastAsia="Calibri" w:hAnsi="Calibri"/>
+          <w:color w:val="23272F"/>
+          <w:sz w:val="21"/>
+          <w:szCs w:val="21"/>
+        </w:rPr>
+        <w:t xml:space="preserve">o colaborador informa o RE e vê os próprios treinamentos e validades, sem login.</w:t>
+      </w:r>
+    </w:p>
+    <w:p>
+      <w:pPr>
+        <w:pStyle w:val="ListParagraph"/>
+        <w:numPr>
+          <w:ilvl w:val="0"/>
+          <w:numId w:val="1"/>
+        </w:numPr>
+        <w:spacing w:after="60" w:line="270"/>
+      </w:pPr>
+      <w:r>
+        <w:rPr>
+          <w:rFonts w:ascii="Calibri" w:cs="Calibri" w:eastAsia="Calibri" w:hAnsi="Calibri"/>
+          <w:b/>
+          <w:bCs/>
+          <w:color w:val="23272F"/>
+          <w:sz w:val="21"/>
+          <w:szCs w:val="21"/>
+        </w:rPr>
+        <w:t xml:space="preserve">Renovação após reciclagem: </w:t>
+      </w:r>
+      <w:r>
+        <w:rPr>
+          <w:rFonts w:ascii="Calibri" w:cs="Calibri" w:eastAsia="Calibri" w:hAnsi="Calibri"/>
+          <w:color w:val="23272F"/>
+          <w:sz w:val="21"/>
+          <w:szCs w:val="21"/>
+        </w:rPr>
+        <w:t xml:space="preserve">ao sincronizar a base, a nova data recalcula o vencimento e a carteirinha se atualiza automaticamente.</w:t>
+      </w:r>
+    </w:p>
+    <w:p>
+      <w:pPr>
+        <w:pStyle w:val="ListParagraph"/>
+        <w:numPr>
+          <w:ilvl w:val="0"/>
+          <w:numId w:val="1"/>
+        </w:numPr>
+        <w:spacing w:after="60" w:line="270"/>
+      </w:pPr>
+      <w:r>
+        <w:rPr>
+          <w:rFonts w:ascii="Calibri" w:cs="Calibri" w:eastAsia="Calibri" w:hAnsi="Calibri"/>
+          <w:b/>
+          <w:bCs/>
+          <w:color w:val="23272F"/>
+          <w:sz w:val="21"/>
+          <w:szCs w:val="21"/>
+        </w:rPr>
+        <w:t xml:space="preserve">Atualização de ASO (Saúde): </w:t>
+      </w:r>
+      <w:r>
+        <w:rPr>
+          <w:rFonts w:ascii="Calibri" w:cs="Calibri" w:eastAsia="Calibri" w:hAnsi="Calibri"/>
+          <w:color w:val="23272F"/>
+          <w:sz w:val="21"/>
+          <w:szCs w:val="21"/>
+        </w:rPr>
+        <w:t xml:space="preserve">a equipe de Saúde registra a validade do ASO; apenas Administração e Saúde visualizam.</w:t>
+      </w:r>
+    </w:p>
+    <w:p>
+      <w:pPr>
+        <w:pStyle w:val="ListParagraph"/>
+        <w:numPr>
+          <w:ilvl w:val="0"/>
+          <w:numId w:val="1"/>
+        </w:numPr>
+        <w:spacing w:after="60" w:line="270"/>
+      </w:pPr>
+      <w:r>
+        <w:rPr>
+          <w:rFonts w:ascii="Calibri" w:cs="Calibri" w:eastAsia="Calibri" w:hAnsi="Calibri"/>
+          <w:b/>
+          <w:bCs/>
+          <w:color w:val="23272F"/>
+          <w:sz w:val="21"/>
+          <w:szCs w:val="21"/>
+        </w:rPr>
+        <w:t xml:space="preserve">Desligamento: </w:t>
+      </w:r>
+      <w:r>
+        <w:rPr>
+          <w:rFonts w:ascii="Calibri" w:cs="Calibri" w:eastAsia="Calibri" w:hAnsi="Calibri"/>
+          <w:color w:val="23272F"/>
+          <w:sz w:val="21"/>
+          <w:szCs w:val="21"/>
+        </w:rPr>
+        <w:t xml:space="preserve">o administrador inativa o colaborador; ele deixa de aparecer, mas o histórico permanece para auditoria.</w:t>
       </w:r>
     </w:p>
     <w:p>
@@ -5165,6 +8213,445 @@
                 <w:szCs w:val="18"/>
               </w:rPr>
               <w:t xml:space="preserve">Legal, Mandatório ou UMS.</w:t>
+            </w:r>
+          </w:p>
+        </w:tc>
+      </w:tr>
+    </w:tbl>
+    <w:p>
+      <w:pPr>
+        <w:pStyle w:val="Heading2"/>
+        <w:spacing w:after="100" w:before="220"/>
+      </w:pPr>
+      <w:r>
+        <w:rPr>
+          <w:rFonts w:ascii="Calibri" w:cs="Calibri" w:eastAsia="Calibri" w:hAnsi="Calibri"/>
+          <w:b/>
+          <w:bCs/>
+          <w:color w:val="0E1424"/>
+          <w:sz w:val="24"/>
+          <w:szCs w:val="24"/>
+        </w:rPr>
+        <w:t xml:space="preserve">Entidades do sistema</w:t>
+      </w:r>
+    </w:p>
+    <w:p>
+      <w:pPr>
+        <w:spacing w:after="120" w:before="0" w:line="276"/>
+      </w:pPr>
+      <w:r>
+        <w:rPr>
+          <w:rFonts w:ascii="Calibri" w:cs="Calibri" w:eastAsia="Calibri" w:hAnsi="Calibri"/>
+          <w:color w:val="23272F"/>
+          <w:sz w:val="21"/>
+          <w:szCs w:val="21"/>
+        </w:rPr>
+        <w:t xml:space="preserve">Além da base importada, o sistema organiza os dados nas seguintes entidades:</w:t>
+      </w:r>
+    </w:p>
+    <w:tbl>
+      <w:tblPr>
+        <w:tblW w:type="dxa" w:w="8220"/>
+        <w:tblBorders>
+          <w:top w:val="single" w:color="E6E9F2" w:sz="2"/>
+          <w:left w:val="single" w:color="E6E9F2" w:sz="2"/>
+          <w:bottom w:val="single" w:color="E6E9F2" w:sz="2"/>
+          <w:right w:val="single" w:color="E6E9F2" w:sz="2"/>
+          <w:insideH w:val="single" w:color="E6E9F2" w:sz="2"/>
+          <w:insideV w:val="single" w:color="E6E9F2" w:sz="2"/>
+        </w:tblBorders>
+      </w:tblPr>
+      <w:tblGrid>
+        <w:gridCol w:w="2400"/>
+        <w:gridCol w:w="5820"/>
+      </w:tblGrid>
+      <w:tr>
+        <w:trPr>
+          <w:tblHeader/>
+        </w:trPr>
+        <w:tc>
+          <w:tcPr>
+            <w:tcW w:type="dxa" w:w="2400"/>
+            <w:shd w:fill="1F36C7" w:color="auto" w:val="clear"/>
+            <w:tcMar>
+              <w:top w:type="dxa" w:w="60"/>
+              <w:left w:type="dxa" w:w="90"/>
+              <w:bottom w:type="dxa" w:w="60"/>
+              <w:right w:type="dxa" w:w="90"/>
+            </w:tcMar>
+          </w:tcPr>
+          <w:p>
+            <w:r>
+              <w:rPr>
+                <w:rFonts w:ascii="Calibri" w:cs="Calibri" w:eastAsia="Calibri" w:hAnsi="Calibri"/>
+                <w:b/>
+                <w:bCs/>
+                <w:color w:val="FFFFFF"/>
+                <w:sz w:val="18"/>
+                <w:szCs w:val="18"/>
+              </w:rPr>
+              <w:t xml:space="preserve">Entidade</w:t>
+            </w:r>
+          </w:p>
+        </w:tc>
+        <w:tc>
+          <w:tcPr>
+            <w:tcW w:type="dxa" w:w="5820"/>
+            <w:shd w:fill="1F36C7" w:color="auto" w:val="clear"/>
+            <w:tcMar>
+              <w:top w:type="dxa" w:w="60"/>
+              <w:left w:type="dxa" w:w="90"/>
+              <w:bottom w:type="dxa" w:w="60"/>
+              <w:right w:type="dxa" w:w="90"/>
+            </w:tcMar>
+          </w:tcPr>
+          <w:p>
+            <w:r>
+              <w:rPr>
+                <w:rFonts w:ascii="Calibri" w:cs="Calibri" w:eastAsia="Calibri" w:hAnsi="Calibri"/>
+                <w:b/>
+                <w:bCs/>
+                <w:color w:val="FFFFFF"/>
+                <w:sz w:val="18"/>
+                <w:szCs w:val="18"/>
+              </w:rPr>
+              <w:t xml:space="preserve">Conteúdo</w:t>
+            </w:r>
+          </w:p>
+        </w:tc>
+      </w:tr>
+      <w:tr>
+        <w:tc>
+          <w:tcPr>
+            <w:tcW w:type="dxa" w:w="2400"/>
+            <w:shd w:fill="FFFFFF" w:color="auto" w:val="clear"/>
+            <w:tcMar>
+              <w:top w:type="dxa" w:w="50"/>
+              <w:left w:type="dxa" w:w="90"/>
+              <w:bottom w:type="dxa" w:w="50"/>
+              <w:right w:type="dxa" w:w="90"/>
+            </w:tcMar>
+          </w:tcPr>
+          <w:p>
+            <w:pPr>
+              <w:spacing w:after="0" w:line="250"/>
+            </w:pPr>
+            <w:r>
+              <w:rPr>
+                <w:rFonts w:ascii="Calibri" w:cs="Calibri" w:eastAsia="Calibri" w:hAnsi="Calibri"/>
+                <w:color w:val="23272F"/>
+                <w:sz w:val="18"/>
+                <w:szCs w:val="18"/>
+              </w:rPr>
+              <w:t xml:space="preserve">Colaborador</w:t>
+            </w:r>
+          </w:p>
+        </w:tc>
+        <w:tc>
+          <w:tcPr>
+            <w:tcW w:type="dxa" w:w="5820"/>
+            <w:shd w:fill="FFFFFF" w:color="auto" w:val="clear"/>
+            <w:tcMar>
+              <w:top w:type="dxa" w:w="50"/>
+              <w:left w:type="dxa" w:w="90"/>
+              <w:bottom w:type="dxa" w:w="50"/>
+              <w:right w:type="dxa" w:w="90"/>
+            </w:tcMar>
+          </w:tcPr>
+          <w:p>
+            <w:pPr>
+              <w:spacing w:after="0" w:line="250"/>
+            </w:pPr>
+            <w:r>
+              <w:rPr>
+                <w:rFonts w:ascii="Calibri" w:cs="Calibri" w:eastAsia="Calibri" w:hAnsi="Calibri"/>
+                <w:b w:val="false"/>
+                <w:bCs w:val="false"/>
+                <w:color w:val="23272F"/>
+                <w:sz w:val="18"/>
+                <w:szCs w:val="18"/>
+              </w:rPr>
+              <w:t xml:space="preserve">RE, nome, área, turno, gestor, função, situação (ativo/inativo).</w:t>
+            </w:r>
+          </w:p>
+        </w:tc>
+      </w:tr>
+      <w:tr>
+        <w:tc>
+          <w:tcPr>
+            <w:tcW w:type="dxa" w:w="2400"/>
+            <w:shd w:fill="F4F6FB" w:color="auto" w:val="clear"/>
+            <w:tcMar>
+              <w:top w:type="dxa" w:w="50"/>
+              <w:left w:type="dxa" w:w="90"/>
+              <w:bottom w:type="dxa" w:w="50"/>
+              <w:right w:type="dxa" w:w="90"/>
+            </w:tcMar>
+          </w:tcPr>
+          <w:p>
+            <w:pPr>
+              <w:spacing w:after="0" w:line="250"/>
+            </w:pPr>
+            <w:r>
+              <w:rPr>
+                <w:rFonts w:ascii="Calibri" w:cs="Calibri" w:eastAsia="Calibri" w:hAnsi="Calibri"/>
+                <w:color w:val="23272F"/>
+                <w:sz w:val="18"/>
+                <w:szCs w:val="18"/>
+              </w:rPr>
+              <w:t xml:space="preserve">Treinamento (catálogo)</w:t>
+            </w:r>
+          </w:p>
+        </w:tc>
+        <w:tc>
+          <w:tcPr>
+            <w:tcW w:type="dxa" w:w="5820"/>
+            <w:shd w:fill="F4F6FB" w:color="auto" w:val="clear"/>
+            <w:tcMar>
+              <w:top w:type="dxa" w:w="50"/>
+              <w:left w:type="dxa" w:w="90"/>
+              <w:bottom w:type="dxa" w:w="50"/>
+              <w:right w:type="dxa" w:w="90"/>
+            </w:tcMar>
+          </w:tcPr>
+          <w:p>
+            <w:pPr>
+              <w:spacing w:after="0" w:line="250"/>
+            </w:pPr>
+            <w:r>
+              <w:rPr>
+                <w:rFonts w:ascii="Calibri" w:cs="Calibri" w:eastAsia="Calibri" w:hAnsi="Calibri"/>
+                <w:b w:val="false"/>
+                <w:bCs w:val="false"/>
+                <w:color w:val="23272F"/>
+                <w:sz w:val="18"/>
+                <w:szCs w:val="18"/>
+              </w:rPr>
+              <w:t xml:space="preserve">Nome, tipo, validade, categoria, situação.</w:t>
+            </w:r>
+          </w:p>
+        </w:tc>
+      </w:tr>
+      <w:tr>
+        <w:tc>
+          <w:tcPr>
+            <w:tcW w:type="dxa" w:w="2400"/>
+            <w:shd w:fill="FFFFFF" w:color="auto" w:val="clear"/>
+            <w:tcMar>
+              <w:top w:type="dxa" w:w="50"/>
+              <w:left w:type="dxa" w:w="90"/>
+              <w:bottom w:type="dxa" w:w="50"/>
+              <w:right w:type="dxa" w:w="90"/>
+            </w:tcMar>
+          </w:tcPr>
+          <w:p>
+            <w:pPr>
+              <w:spacing w:after="0" w:line="250"/>
+            </w:pPr>
+            <w:r>
+              <w:rPr>
+                <w:rFonts w:ascii="Calibri" w:cs="Calibri" w:eastAsia="Calibri" w:hAnsi="Calibri"/>
+                <w:color w:val="23272F"/>
+                <w:sz w:val="18"/>
+                <w:szCs w:val="18"/>
+              </w:rPr>
+              <w:t xml:space="preserve">Habilitação</w:t>
+            </w:r>
+          </w:p>
+        </w:tc>
+        <w:tc>
+          <w:tcPr>
+            <w:tcW w:type="dxa" w:w="5820"/>
+            <w:shd w:fill="FFFFFF" w:color="auto" w:val="clear"/>
+            <w:tcMar>
+              <w:top w:type="dxa" w:w="50"/>
+              <w:left w:type="dxa" w:w="90"/>
+              <w:bottom w:type="dxa" w:w="50"/>
+              <w:right w:type="dxa" w:w="90"/>
+            </w:tcMar>
+          </w:tcPr>
+          <w:p>
+            <w:pPr>
+              <w:spacing w:after="0" w:line="250"/>
+            </w:pPr>
+            <w:r>
+              <w:rPr>
+                <w:rFonts w:ascii="Calibri" w:cs="Calibri" w:eastAsia="Calibri" w:hAnsi="Calibri"/>
+                <w:b w:val="false"/>
+                <w:bCs w:val="false"/>
+                <w:color w:val="23272F"/>
+                <w:sz w:val="18"/>
+                <w:szCs w:val="18"/>
+              </w:rPr>
+              <w:t xml:space="preserve">Vínculo colaborador × treinamento, com data de realização e vencimento calculado.</w:t>
+            </w:r>
+          </w:p>
+        </w:tc>
+      </w:tr>
+      <w:tr>
+        <w:tc>
+          <w:tcPr>
+            <w:tcW w:type="dxa" w:w="2400"/>
+            <w:shd w:fill="F4F6FB" w:color="auto" w:val="clear"/>
+            <w:tcMar>
+              <w:top w:type="dxa" w:w="50"/>
+              <w:left w:type="dxa" w:w="90"/>
+              <w:bottom w:type="dxa" w:w="50"/>
+              <w:right w:type="dxa" w:w="90"/>
+            </w:tcMar>
+          </w:tcPr>
+          <w:p>
+            <w:pPr>
+              <w:spacing w:after="0" w:line="250"/>
+            </w:pPr>
+            <w:r>
+              <w:rPr>
+                <w:rFonts w:ascii="Calibri" w:cs="Calibri" w:eastAsia="Calibri" w:hAnsi="Calibri"/>
+                <w:color w:val="23272F"/>
+                <w:sz w:val="18"/>
+                <w:szCs w:val="18"/>
+              </w:rPr>
+              <w:t xml:space="preserve">ASO</w:t>
+            </w:r>
+          </w:p>
+        </w:tc>
+        <w:tc>
+          <w:tcPr>
+            <w:tcW w:type="dxa" w:w="5820"/>
+            <w:shd w:fill="F4F6FB" w:color="auto" w:val="clear"/>
+            <w:tcMar>
+              <w:top w:type="dxa" w:w="50"/>
+              <w:left w:type="dxa" w:w="90"/>
+              <w:bottom w:type="dxa" w:w="50"/>
+              <w:right w:type="dxa" w:w="90"/>
+            </w:tcMar>
+          </w:tcPr>
+          <w:p>
+            <w:pPr>
+              <w:spacing w:after="0" w:line="250"/>
+            </w:pPr>
+            <w:r>
+              <w:rPr>
+                <w:rFonts w:ascii="Calibri" w:cs="Calibri" w:eastAsia="Calibri" w:hAnsi="Calibri"/>
+                <w:b w:val="false"/>
+                <w:bCs w:val="false"/>
+                <w:color w:val="23272F"/>
+                <w:sz w:val="18"/>
+                <w:szCs w:val="18"/>
+              </w:rPr>
+              <w:t xml:space="preserve">Validade do exame ocupacional, com acesso restrito (Saúde e Administração).</w:t>
+            </w:r>
+          </w:p>
+        </w:tc>
+      </w:tr>
+      <w:tr>
+        <w:tc>
+          <w:tcPr>
+            <w:tcW w:type="dxa" w:w="2400"/>
+            <w:shd w:fill="FFFFFF" w:color="auto" w:val="clear"/>
+            <w:tcMar>
+              <w:top w:type="dxa" w:w="50"/>
+              <w:left w:type="dxa" w:w="90"/>
+              <w:bottom w:type="dxa" w:w="50"/>
+              <w:right w:type="dxa" w:w="90"/>
+            </w:tcMar>
+          </w:tcPr>
+          <w:p>
+            <w:pPr>
+              <w:spacing w:after="0" w:line="250"/>
+            </w:pPr>
+            <w:r>
+              <w:rPr>
+                <w:rFonts w:ascii="Calibri" w:cs="Calibri" w:eastAsia="Calibri" w:hAnsi="Calibri"/>
+                <w:color w:val="23272F"/>
+                <w:sz w:val="18"/>
+                <w:szCs w:val="18"/>
+              </w:rPr>
+              <w:t xml:space="preserve">Usuário</w:t>
+            </w:r>
+          </w:p>
+        </w:tc>
+        <w:tc>
+          <w:tcPr>
+            <w:tcW w:type="dxa" w:w="5820"/>
+            <w:shd w:fill="FFFFFF" w:color="auto" w:val="clear"/>
+            <w:tcMar>
+              <w:top w:type="dxa" w:w="50"/>
+              <w:left w:type="dxa" w:w="90"/>
+              <w:bottom w:type="dxa" w:w="50"/>
+              <w:right w:type="dxa" w:w="90"/>
+            </w:tcMar>
+          </w:tcPr>
+          <w:p>
+            <w:pPr>
+              <w:spacing w:after="0" w:line="250"/>
+            </w:pPr>
+            <w:r>
+              <w:rPr>
+                <w:rFonts w:ascii="Calibri" w:cs="Calibri" w:eastAsia="Calibri" w:hAnsi="Calibri"/>
+                <w:b w:val="false"/>
+                <w:bCs w:val="false"/>
+                <w:color w:val="23272F"/>
+                <w:sz w:val="18"/>
+                <w:szCs w:val="18"/>
+              </w:rPr>
+              <w:t xml:space="preserve">Nome, e-mail, perfil e situação. Login por e-mail e senha.</w:t>
+            </w:r>
+          </w:p>
+        </w:tc>
+      </w:tr>
+      <w:tr>
+        <w:tc>
+          <w:tcPr>
+            <w:tcW w:type="dxa" w:w="2400"/>
+            <w:shd w:fill="F4F6FB" w:color="auto" w:val="clear"/>
+            <w:tcMar>
+              <w:top w:type="dxa" w:w="50"/>
+              <w:left w:type="dxa" w:w="90"/>
+              <w:bottom w:type="dxa" w:w="50"/>
+              <w:right w:type="dxa" w:w="90"/>
+            </w:tcMar>
+          </w:tcPr>
+          <w:p>
+            <w:pPr>
+              <w:spacing w:after="0" w:line="250"/>
+            </w:pPr>
+            <w:r>
+              <w:rPr>
+                <w:rFonts w:ascii="Calibri" w:cs="Calibri" w:eastAsia="Calibri" w:hAnsi="Calibri"/>
+                <w:color w:val="23272F"/>
+                <w:sz w:val="18"/>
+                <w:szCs w:val="18"/>
+              </w:rPr>
+              <w:t xml:space="preserve">Auditoria</w:t>
+            </w:r>
+          </w:p>
+        </w:tc>
+        <w:tc>
+          <w:tcPr>
+            <w:tcW w:type="dxa" w:w="5820"/>
+            <w:shd w:fill="F4F6FB" w:color="auto" w:val="clear"/>
+            <w:tcMar>
+              <w:top w:type="dxa" w:w="50"/>
+              <w:left w:type="dxa" w:w="90"/>
+              <w:bottom w:type="dxa" w:w="50"/>
+              <w:right w:type="dxa" w:w="90"/>
+            </w:tcMar>
+          </w:tcPr>
+          <w:p>
+            <w:pPr>
+              <w:spacing w:after="0" w:line="250"/>
+            </w:pPr>
+            <w:r>
+              <w:rPr>
+                <w:rFonts w:ascii="Calibri" w:cs="Calibri" w:eastAsia="Calibri" w:hAnsi="Calibri"/>
+                <w:b w:val="false"/>
+                <w:bCs w:val="false"/>
+                <w:color w:val="23272F"/>
+                <w:sz w:val="18"/>
+                <w:szCs w:val="18"/>
+              </w:rPr>
+              <w:t xml:space="preserve">Data, usuário, ação e alvo. Registro imutável.</w:t>
             </w:r>
           </w:p>
         </w:tc>

</xml_diff>